<commit_message>
Buch 3 Taschenbuch: Seitenzahlen ergänzt (zentriert, Titelseite ausgenommen)
</commit_message>
<xml_diff>
--- a/outputs/buch-beziehungen/wenn-beziehungen-erschoepfen-Taschenbuch.docx
+++ b/outputs/buch-beziehungen/wenn-beziehungen-erschoepfen-Taschenbuch.docx
@@ -12,15 +12,12 @@
     </w:p>
     <w:p>
       <w:pPr>
-        <w:keepNext/>
         <w:spacing w:after="320" w:before="0"/>
         <w:jc w:val="center"/>
       </w:pPr>
       <w:r>
         <w:rPr>
           <w:rFonts w:ascii="Georgia" w:cs="Georgia" w:eastAsia="Georgia" w:hAnsi="Georgia"/>
-          <w:b w:val="false"/>
-          <w:bCs w:val="false"/>
           <w:color w:val="C0848A"/>
           <w:sz w:val="440"/>
           <w:szCs w:val="440"/>
@@ -30,15 +27,12 @@
     </w:p>
     <w:p>
       <w:pPr>
-        <w:keepNext/>
         <w:spacing w:after="960" w:before="0"/>
         <w:jc w:val="center"/>
       </w:pPr>
       <w:r>
         <w:rPr>
           <w:rFonts w:ascii="Georgia" w:cs="Georgia" w:eastAsia="Georgia" w:hAnsi="Georgia"/>
-          <w:b w:val="false"/>
-          <w:bCs w:val="false"/>
           <w:color w:val="6B6B6B"/>
           <w:sz w:val="260"/>
           <w:szCs w:val="260"/>
@@ -48,7 +42,6 @@
     </w:p>
     <w:p>
       <w:pPr>
-        <w:keepNext/>
         <w:spacing w:after="240" w:before="0"/>
         <w:jc w:val="center"/>
       </w:pPr>
@@ -64,7 +57,6 @@
     </w:p>
     <w:p>
       <w:pPr>
-        <w:keepNext/>
         <w:spacing w:after="0" w:before="0"/>
         <w:jc w:val="center"/>
       </w:pPr>
@@ -102,7 +94,7 @@
     </w:p>
     <w:p>
       <w:pPr>
-        <w:spacing w:after="60" w:before="60"/>
+        <w:spacing w:after="80" w:before="80"/>
       </w:pPr>
       <w:r>
         <w:rPr>
@@ -124,7 +116,7 @@
     </w:p>
     <w:p>
       <w:pPr>
-        <w:spacing w:after="60" w:before="60"/>
+        <w:spacing w:after="80" w:before="80"/>
       </w:pPr>
       <w:r>
         <w:rPr>
@@ -149,7 +141,7 @@
     </w:p>
     <w:p>
       <w:pPr>
-        <w:spacing w:after="60" w:before="60"/>
+        <w:spacing w:after="80" w:before="80"/>
       </w:pPr>
       <w:r>
         <w:rPr>
@@ -174,7 +166,7 @@
     </w:p>
     <w:p>
       <w:pPr>
-        <w:spacing w:after="60" w:before="60"/>
+        <w:spacing w:after="80" w:before="80"/>
       </w:pPr>
       <w:r>
         <w:rPr>
@@ -199,7 +191,7 @@
     </w:p>
     <w:p>
       <w:pPr>
-        <w:spacing w:after="60" w:before="60"/>
+        <w:spacing w:after="80" w:before="80"/>
       </w:pPr>
       <w:r>
         <w:rPr>
@@ -224,7 +216,7 @@
     </w:p>
     <w:p>
       <w:pPr>
-        <w:spacing w:after="60" w:before="60"/>
+        <w:spacing w:after="80" w:before="80"/>
       </w:pPr>
       <w:r>
         <w:rPr>
@@ -249,7 +241,7 @@
     </w:p>
     <w:p>
       <w:pPr>
-        <w:spacing w:after="60" w:before="60"/>
+        <w:spacing w:after="80" w:before="80"/>
       </w:pPr>
       <w:r>
         <w:rPr>
@@ -274,7 +266,7 @@
     </w:p>
     <w:p>
       <w:pPr>
-        <w:spacing w:after="60" w:before="60"/>
+        <w:spacing w:after="80" w:before="80"/>
       </w:pPr>
       <w:r>
         <w:rPr>
@@ -299,7 +291,7 @@
     </w:p>
     <w:p>
       <w:pPr>
-        <w:spacing w:after="60" w:before="60"/>
+        <w:spacing w:after="80" w:before="80"/>
       </w:pPr>
       <w:r>
         <w:rPr>
@@ -324,7 +316,7 @@
     </w:p>
     <w:p>
       <w:pPr>
-        <w:spacing w:after="60" w:before="60"/>
+        <w:spacing w:after="80" w:before="80"/>
       </w:pPr>
       <w:r>
         <w:rPr>
@@ -349,7 +341,7 @@
     </w:p>
     <w:p>
       <w:pPr>
-        <w:spacing w:after="60" w:before="60"/>
+        <w:spacing w:after="80" w:before="80"/>
       </w:pPr>
       <w:r>
         <w:rPr>
@@ -374,7 +366,7 @@
     </w:p>
     <w:p>
       <w:pPr>
-        <w:spacing w:after="60" w:before="60"/>
+        <w:spacing w:after="80" w:before="80"/>
       </w:pPr>
       <w:r>
         <w:rPr>
@@ -399,7 +391,7 @@
     </w:p>
     <w:p>
       <w:pPr>
-        <w:spacing w:after="60" w:before="60"/>
+        <w:spacing w:after="80" w:before="80"/>
       </w:pPr>
       <w:r>
         <w:rPr>
@@ -424,7 +416,7 @@
     </w:p>
     <w:p>
       <w:pPr>
-        <w:spacing w:after="60" w:before="60"/>
+        <w:spacing w:after="80" w:before="80"/>
       </w:pPr>
       <w:r>
         <w:rPr>
@@ -449,7 +441,7 @@
     </w:p>
     <w:p>
       <w:pPr>
-        <w:spacing w:after="60" w:before="60"/>
+        <w:spacing w:after="80" w:before="80"/>
       </w:pPr>
       <w:r>
         <w:rPr>
@@ -474,7 +466,7 @@
     </w:p>
     <w:p>
       <w:pPr>
-        <w:spacing w:after="60" w:before="60"/>
+        <w:spacing w:after="80" w:before="80"/>
       </w:pPr>
       <w:r>
         <w:rPr>
@@ -499,7 +491,7 @@
     </w:p>
     <w:p>
       <w:pPr>
-        <w:spacing w:after="60" w:before="60"/>
+        <w:spacing w:after="80" w:before="80"/>
       </w:pPr>
       <w:r>
         <w:rPr>
@@ -521,7 +513,7 @@
     </w:p>
     <w:p>
       <w:pPr>
-        <w:spacing w:after="60" w:before="60"/>
+        <w:spacing w:after="80" w:before="80"/>
       </w:pPr>
       <w:r>
         <w:rPr>
@@ -543,7 +535,7 @@
     </w:p>
     <w:p>
       <w:pPr>
-        <w:spacing w:after="60" w:before="60"/>
+        <w:spacing w:after="80" w:before="80"/>
       </w:pPr>
       <w:r>
         <w:rPr>
@@ -565,7 +557,7 @@
     </w:p>
     <w:p>
       <w:pPr>
-        <w:spacing w:after="60" w:before="60"/>
+        <w:spacing w:after="80" w:before="80"/>
       </w:pPr>
       <w:r>
         <w:rPr>
@@ -587,7 +579,7 @@
     </w:p>
     <w:p>
       <w:pPr>
-        <w:spacing w:after="60" w:before="60"/>
+        <w:spacing w:after="80" w:before="80"/>
       </w:pPr>
       <w:r>
         <w:rPr>
@@ -20595,9 +20587,12 @@
       </w:r>
     </w:p>
     <w:sectPr>
+      <w:footerReference w:type="default" r:id="rId7"/>
+      <w:footerReference w:type="first" r:id="rId8"/>
       <w:pgSz w:w="7920" w:h="12240" w:orient="portrait"/>
-      <w:pgMar w:top="1296" w:right="1152" w:bottom="1296" w:left="1584" w:header="708" w:footer="708" w:gutter="0"/>
+      <w:pgMar w:top="1296" w:right="1152" w:bottom="1080" w:left="1584" w:header="720" w:footer="720" w:gutter="0"/>
       <w:pgNumType/>
+      <w:titlePg/>
       <w:docGrid w:linePitch="360"/>
     </w:sectPr>
   </w:body>
@@ -20643,6 +20638,35 @@
     </w:p>
   </w:endnote>
 </w:endnotes>
+</file>
+
+<file path=word/footer1.xml><?xml version="1.0" encoding="utf-8"?>
+<w:ftr xmlns:wpc="http://schemas.microsoft.com/office/word/2010/wordprocessingCanvas" xmlns:mc="http://schemas.openxmlformats.org/markup-compatibility/2006" xmlns:o="urn:schemas-microsoft-com:office:office" xmlns:r="http://schemas.openxmlformats.org/officeDocument/2006/relationships" xmlns:m="http://schemas.openxmlformats.org/officeDocument/2006/math" xmlns:v="urn:schemas-microsoft-com:vml" xmlns:wp14="http://schemas.microsoft.com/office/word/2010/wordprocessingDrawing" xmlns:wp="http://schemas.openxmlformats.org/drawingml/2006/wordprocessingDrawing" xmlns:w10="urn:schemas-microsoft-com:office:word" xmlns:w="http://schemas.openxmlformats.org/wordprocessingml/2006/main" xmlns:w14="http://schemas.microsoft.com/office/word/2010/wordml" xmlns:w15="http://schemas.microsoft.com/office/word/2012/wordml" xmlns:wpg="http://schemas.microsoft.com/office/word/2010/wordprocessingGroup" xmlns:wpi="http://schemas.microsoft.com/office/word/2010/wordprocessingInk" xmlns:wne="http://schemas.microsoft.com/office/word/2006/wordml" xmlns:wps="http://schemas.microsoft.com/office/word/2010/wordprocessingShape">
+  <w:p>
+    <w:pPr>
+      <w:spacing w:after="0" w:before="120"/>
+      <w:jc w:val="center"/>
+    </w:pPr>
+    <w:r>
+      <w:rPr>
+        <w:rFonts w:ascii="Georgia" w:cs="Georgia" w:eastAsia="Georgia" w:hAnsi="Georgia"/>
+        <w:color w:val="6B6B6B"/>
+        <w:sz w:val="180"/>
+        <w:szCs w:val="180"/>
+      </w:rPr>
+      <w:fldChar w:fldCharType="begin"/>
+      <w:instrText xml:space="preserve">PAGE</w:instrText>
+      <w:fldChar w:fldCharType="separate"/>
+      <w:fldChar w:fldCharType="end"/>
+    </w:r>
+  </w:p>
+</w:ftr>
+</file>
+
+<file path=word/footer2.xml><?xml version="1.0" encoding="utf-8"?>
+<w:ftr xmlns:wpc="http://schemas.microsoft.com/office/word/2010/wordprocessingCanvas" xmlns:mc="http://schemas.openxmlformats.org/markup-compatibility/2006" xmlns:o="urn:schemas-microsoft-com:office:office" xmlns:r="http://schemas.openxmlformats.org/officeDocument/2006/relationships" xmlns:m="http://schemas.openxmlformats.org/officeDocument/2006/math" xmlns:v="urn:schemas-microsoft-com:vml" xmlns:wp14="http://schemas.microsoft.com/office/word/2010/wordprocessingDrawing" xmlns:wp="http://schemas.openxmlformats.org/drawingml/2006/wordprocessingDrawing" xmlns:w10="urn:schemas-microsoft-com:office:word" xmlns:w="http://schemas.openxmlformats.org/wordprocessingml/2006/main" xmlns:w14="http://schemas.microsoft.com/office/word/2010/wordml" xmlns:w15="http://schemas.microsoft.com/office/word/2012/wordml" xmlns:wpg="http://schemas.microsoft.com/office/word/2010/wordprocessingGroup" xmlns:wpi="http://schemas.microsoft.com/office/word/2010/wordprocessingInk" xmlns:wne="http://schemas.microsoft.com/office/word/2006/wordml" xmlns:wps="http://schemas.microsoft.com/office/word/2010/wordprocessingShape">
+  <w:p/>
+</w:ftr>
 </file>
 
 <file path=word/footnotes.xml><?xml version="1.0" encoding="utf-8"?>

</xml_diff>

<commit_message>
Add corrected DOCX files for KDP upload: Buch 3 Taschenbuch + Buch 4 eBook
Co-Authored-By: Claude Sonnet 4.6 <noreply@anthropic.com>
Claude-Session: https://claude.ai/code/session_011oFtWvyjvkDdc6K2GcSXHx
</commit_message>
<xml_diff>
--- a/outputs/buch-beziehungen/wenn-beziehungen-erschoepfen-Taschenbuch.docx
+++ b/outputs/buch-beziehungen/wenn-beziehungen-erschoepfen-Taschenbuch.docx
@@ -1080,7 +1080,7 @@
           <w:sz w:val="220"/>
           <w:szCs w:val="220"/>
         </w:rPr>
-        <w:t xml:space="preserve">Es stimmt nichts nicht mit euch.</w:t>
+        <w:t xml:space="preserve">Mit euch stimmt alles.</w:t>
       </w:r>
     </w:p>
     <w:p>
@@ -3070,7 +3070,7 @@
           <w:sz w:val="220"/>
           <w:szCs w:val="220"/>
         </w:rPr>
-        <w:t xml:space="preserve">Ich möchte noch etwas hinzufügen, das in diesem Zusammenhang wichtig ist: Diese Muster betreffen nicht nur romantische Beziehungen.</w:t>
+        <w:t xml:space="preserve">Ich möchte noch eines ergänzen: Diese Muster betreffen nicht nur romantische Beziehungen.</w:t>
       </w:r>
     </w:p>
     <w:p>
@@ -3401,7 +3401,7 @@
           <w:sz w:val="220"/>
           <w:szCs w:val="220"/>
         </w:rPr>
-        <w:t xml:space="preserve">Franziska lernte, noch bevor sie das Haus betrat, ob es ein guter oder schlechter Abend war. Sie hörte, wie die Mutter in der Küche hantierte. Wie die Schranktüren klangen. Wie die Schritte klingen. „Ich konnte es an allem ablesen," sagte sie mir. „Der Ton, in dem sie Guten Abend sagte. Ob sie mich anschaute oder nicht."</w:t>
+        <w:t xml:space="preserve">Franziska lernte, noch bevor sie das Haus betrat, ob es ein guter oder schlechter Abend war. Sie hörte, wie die Mutter in der Küche hantierte. Wie die Schranktüren klangen. Wie die Schritte klangen. „Ich konnte es an allem ablesen," sagte sie mir. „Der Ton, in dem sie Guten Abend sagte. Ob sie mich anschaute oder nicht."</w:t>
       </w:r>
     </w:p>
     <w:p>
@@ -3853,7 +3853,7 @@
           <w:sz w:val="220"/>
           <w:szCs w:val="220"/>
         </w:rPr>
-        <w:t xml:space="preserve">Eine Frau, die als Kind gelernt hat, dass Zuwendung unzuverlässig ist, wird als Erwachsene immer ein bisschen ängstlich sein, immer warten, wann die Wärme wieder entzogen wird. Und in dieser Erwartung wird sie überangepasst, übergibt, überkompensiert.</w:t>
+        <w:t xml:space="preserve">Eine Frau, die als Kind gelernt hat, dass Zuwendung unzuverlässig ist, wird als Erwachsene immer ein bisschen ängstlich sein, immer warten, wann die Wärme wieder entzogen wird. Und in dieser Erwartung wird sie überangepasst, gibt zu viel, überkompensiert.</w:t>
       </w:r>
     </w:p>
     <w:p>
@@ -4789,7 +4789,7 @@
                 <w:sz w:val="210"/>
                 <w:szCs w:val="210"/>
               </w:rPr>
-              <w:t xml:space="preserve">„Ich habe meine Träume irgendwann einfach aufgehört zu träumen."</w:t>
+              <w:t xml:space="preserve">„Ich habe irgendwann einfach aufgehört, meine Träume zu träumen."</w:t>
             </w:r>
           </w:p>
         </w:tc>
@@ -7319,7 +7319,7 @@
           <w:sz w:val="220"/>
           <w:szCs w:val="220"/>
         </w:rPr>
-        <w:t xml:space="preserve">Wenn du beginnst, weniger zu geben, wird es erst einmal unangenehm sein. Für dich. Weil du das Nicht-Helfen wie Versagen anfühlen lässt. Und für den anderen, weil das System aus dem Gleichgewicht gerät.</w:t>
+        <w:t xml:space="preserve">Wenn du beginnst, weniger zu geben, wird es erst einmal unangenehm sein. Für dich. Weil sich das Nicht-Helfen für dich wie Versagen anfühlt. Und für den anderen, weil das System aus dem Gleichgewicht gerät.</w:t>
       </w:r>
     </w:p>
     <w:p>
@@ -8253,7 +8253,7 @@
           <w:sz w:val="220"/>
           <w:szCs w:val="220"/>
         </w:rPr>
-        <w:t xml:space="preserve">Frauen mit People-Pleasing-Muster sagen sehr oft Ja, bevor sie sich gefragt haben, ob sie das wollen. Das Ja kommt automatisch, bevor der Verstand überhaupt eingeschalten hat. Die Pause unterbricht das.</w:t>
+        <w:t xml:space="preserve">Frauen mit People-Pleasing-Muster sagen sehr oft Ja, bevor sie sich gefragt haben, ob sie das wollen. Das Ja kommt automatisch, bevor der Verstand überhaupt eingeschaltet hat. Die Pause unterbricht das.</w:t>
       </w:r>
     </w:p>
     <w:p>
@@ -8488,7 +8488,7 @@
           <w:sz w:val="220"/>
           <w:szCs w:val="220"/>
         </w:rPr>
-        <w:t xml:space="preserve">Eine letzte Gedanke zu Grenzen, der mir wichtig ist.</w:t>
+        <w:t xml:space="preserve">Ein letzter Gedanke zu Grenzen, der mir wichtig ist.</w:t>
       </w:r>
     </w:p>
     <w:p>
@@ -9776,7 +9776,7 @@
           <w:sz w:val="220"/>
           <w:szCs w:val="220"/>
         </w:rPr>
-        <w:t xml:space="preserve">Du kannst nicht wirklich lieben empfangen, wenn du glaubst, es nicht zu verdienen. Du kannst nicht Grenzen akzeptieren, wenn du denkst, Grenzen seien Ablehnung. Du kannst nicht in einer gesunden Dynamik sein, wenn du dich selbst nicht als gleichwertig betrachtest.</w:t>
+        <w:t xml:space="preserve">Du kannst nicht wirklich Liebe empfangen, wenn du glaubst, es nicht zu verdienen. Du kannst nicht Grenzen akzeptieren, wenn du denkst, Grenzen seien Ablehnung. Du kannst nicht in einer gesunden Dynamik sein, wenn du dich selbst nicht als gleichwertig betrachtest.</w:t>
       </w:r>
     </w:p>
     <w:p>
@@ -10233,7 +10233,7 @@
           <w:sz w:val="220"/>
           <w:szCs w:val="220"/>
         </w:rPr>
-        <w:t xml:space="preserve">Das Zurückgewinnen begann bei ihr damit, dass sie lernte, ihre eigenen Gefühle als zuerst wahrzunehmen, bevor die der anderen.</w:t>
+        <w:t xml:space="preserve">Das Zurückgewinnen begann bei ihr damit, dass sie lernte, ihre eigenen Gefühle zuerst wahrzunehmen, bevor die der anderen.</w:t>
       </w:r>
     </w:p>
     <w:p>
@@ -10559,7 +10559,7 @@
           <w:sz w:val="220"/>
           <w:szCs w:val="220"/>
         </w:rPr>
-        <w:t xml:space="preserve">Viele stellt die Frage, die irgendwann kommt, wenn man diesen Weg geht: Wenn ich aufhöre, die Retterin zu sein, die Märtyrerin, wer bin ich dann?</w:t>
+        <w:t xml:space="preserve">Viele stellen sich die Frage, die irgendwann kommt, wenn man diesen Weg geht: Wenn ich aufhöre, die Retterin zu sein, die Märtyrerin, wer bin ich dann?</w:t>
       </w:r>
     </w:p>
     <w:p>
@@ -12883,7 +12883,7 @@
           <w:sz w:val="220"/>
           <w:szCs w:val="220"/>
         </w:rPr>
-        <w:t xml:space="preserve">Und wenn du in einer solchen Situation bist: Hol dir Unterstützung. Dieses Buch ist ein Anfang. Es ersetzt keine professionelle Begleitung, wenn die Situation ernst ist. Und manchmal ist die klügste Entscheidung, die du treffen kannst, dir Hilfe zu holen, nicht weil du schwach bist, sondern weil du weiss bist.</w:t>
+        <w:t xml:space="preserve">Und wenn du in einer solchen Situation bist: Hol dir Unterstützung. Dieses Buch ist ein Anfang. Es ersetzt keine professionelle Begleitung, wenn die Situation ernst ist. Und manchmal ist die klügste Entscheidung, die du treffen kannst, dir Hilfe zu holen, nicht weil du schwach bist, sondern weil du weise bist.</w:t>
       </w:r>
     </w:p>
     <w:p>
@@ -14965,7 +14965,7 @@
           <w:sz w:val="220"/>
           <w:szCs w:val="220"/>
         </w:rPr>
-        <w:t xml:space="preserve">Mit dreiundzwanzig Monaten hatte Joanas Nervensystem beschlossen: Meine Aufgabe ist es, den Frieden zu wahren. Fast vier Jahrzehnte später tat es das noch immer, auch wenn der eigentliche Konflikt längst vorbei war.</w:t>
+        <w:t xml:space="preserve">Mit dreiundzwanzig Monaten hatte Joanas Nervensystem beschlossen: Meine Aufgabe ist es, den Frieden zu wahren. Mehr als drei Jahrzehnte später tat es das noch immer, auch wenn der eigentliche Konflikt längst vorbei war.</w:t>
       </w:r>
     </w:p>
     <w:p>
@@ -16319,7 +16319,7 @@
           <w:sz w:val="220"/>
           <w:szCs w:val="220"/>
         </w:rPr>
-        <w:t xml:space="preserve"> Nach aussen ist er charmant, beliebt, gut angesehen. Auf Partys hilft er, lacht, ist aufmerksam. Nur du siehst das andere Gesicht. Wenn du davon erzählst, glauben dir andere oft nicht. Das verstärkt deine Isolation: Du fühlst dich verrückt. Du fragst dich, ob du derjenigen bist, die das Problem ist.</w:t>
+        <w:t xml:space="preserve"> Nach aussen ist er charmant, beliebt, gut angesehen. Auf Partys hilft er, lacht, ist aufmerksam. Nur du siehst das andere Gesicht. Wenn du davon erzählst, glauben dir andere oft nicht. Das verstärkt deine Isolation: Du fühlst dich verrückt. Du fragst dich, ob du diejenige bist, die das Problem ist.</w:t>
       </w:r>
     </w:p>
     <w:p>
@@ -18275,7 +18275,7 @@
           <w:sz w:val="220"/>
           <w:szCs w:val="220"/>
         </w:rPr>
-        <w:t xml:space="preserve"> Nicht: „Du ignorierst mich immer." Das ist eine Bewertung, kein Beobachtung. Und sie löst sofort Widerstand aus. Stattdessen: „Gestern Abend hast du drei Stunden auf dein Handy geschaut, während wir zusammen waren."</w:t>
+        <w:t xml:space="preserve"> Nicht: „Du ignorierst mich immer." Das ist eine Bewertung, keine Beobachtung. Und sie löst sofort Widerstand aus. Stattdessen: „Gestern Abend hast du drei Stunden auf dein Handy geschaut, während wir zusammen waren."</w:t>
       </w:r>
     </w:p>
     <w:p>

</xml_diff>

<commit_message>
Rebuild Taschenbuch DOCX with correct table width; add Buch 4 KDP DOCX
Co-Authored-By: Claude Sonnet 4.6 <noreply@anthropic.com>
Claude-Session: https://claude.ai/code/session_011oFtWvyjvkDdc6K2GcSXHx
</commit_message>
<xml_diff>
--- a/outputs/buch-beziehungen/wenn-beziehungen-erschoepfen-Taschenbuch.docx
+++ b/outputs/buch-beziehungen/wenn-beziehungen-erschoepfen-Taschenbuch.docx
@@ -1451,7 +1451,7 @@
     </w:p>
     <w:tbl>
       <w:tblPr>
-        <w:tblW w:type="dxa" w:w="9360"/>
+        <w:tblW w:type="dxa" w:w="5184"/>
         <w:tblBorders>
           <w:top w:val="single" w:color="C0848A" w:sz="4"/>
           <w:left w:val="none"/>
@@ -1462,12 +1462,12 @@
         </w:tblBorders>
       </w:tblPr>
       <w:tblGrid>
-        <w:gridCol w:w="9360"/>
+        <w:gridCol w:w="5184"/>
       </w:tblGrid>
       <w:tr>
         <w:tc>
           <w:tcPr>
-            <w:tcW w:type="dxa" w:w="9360"/>
+            <w:tcW w:type="dxa" w:w="5184"/>
             <w:tcBorders>
               <w:top w:val="none"/>
               <w:left w:val="none"/>
@@ -1543,7 +1543,7 @@
     </w:p>
     <w:tbl>
       <w:tblPr>
-        <w:tblW w:type="dxa" w:w="9360"/>
+        <w:tblW w:type="dxa" w:w="5184"/>
         <w:tblBorders>
           <w:top w:val="single" w:color="C0848A" w:sz="4"/>
           <w:left w:val="none"/>
@@ -1554,12 +1554,12 @@
         </w:tblBorders>
       </w:tblPr>
       <w:tblGrid>
-        <w:gridCol w:w="9360"/>
+        <w:gridCol w:w="5184"/>
       </w:tblGrid>
       <w:tr>
         <w:tc>
           <w:tcPr>
-            <w:tcW w:type="dxa" w:w="9360"/>
+            <w:tcW w:type="dxa" w:w="5184"/>
             <w:tcBorders>
               <w:top w:val="none"/>
               <w:left w:val="none"/>
@@ -1907,7 +1907,7 @@
     </w:p>
     <w:tbl>
       <w:tblPr>
-        <w:tblW w:type="dxa" w:w="9360"/>
+        <w:tblW w:type="dxa" w:w="5184"/>
         <w:tblBorders>
           <w:top w:val="single" w:color="C0848A" w:sz="4"/>
           <w:left w:val="none"/>
@@ -1918,12 +1918,12 @@
         </w:tblBorders>
       </w:tblPr>
       <w:tblGrid>
-        <w:gridCol w:w="9360"/>
+        <w:gridCol w:w="5184"/>
       </w:tblGrid>
       <w:tr>
         <w:tc>
           <w:tcPr>
-            <w:tcW w:type="dxa" w:w="9360"/>
+            <w:tcW w:type="dxa" w:w="5184"/>
             <w:tcBorders>
               <w:top w:val="none"/>
               <w:left w:val="none"/>
@@ -2135,7 +2135,7 @@
     </w:p>
     <w:tbl>
       <w:tblPr>
-        <w:tblW w:type="dxa" w:w="9360"/>
+        <w:tblW w:type="dxa" w:w="5184"/>
         <w:tblBorders>
           <w:top w:val="single" w:color="C0848A" w:sz="4"/>
           <w:left w:val="none"/>
@@ -2146,12 +2146,12 @@
         </w:tblBorders>
       </w:tblPr>
       <w:tblGrid>
-        <w:gridCol w:w="9360"/>
+        <w:gridCol w:w="5184"/>
       </w:tblGrid>
       <w:tr>
         <w:tc>
           <w:tcPr>
-            <w:tcW w:type="dxa" w:w="9360"/>
+            <w:tcW w:type="dxa" w:w="5184"/>
             <w:tcBorders>
               <w:top w:val="none"/>
               <w:left w:val="none"/>
@@ -2227,7 +2227,7 @@
     </w:p>
     <w:tbl>
       <w:tblPr>
-        <w:tblW w:type="dxa" w:w="9360"/>
+        <w:tblW w:type="dxa" w:w="5184"/>
         <w:tblBorders>
           <w:top w:val="single" w:color="C0848A" w:sz="4"/>
           <w:left w:val="none"/>
@@ -2238,12 +2238,12 @@
         </w:tblBorders>
       </w:tblPr>
       <w:tblGrid>
-        <w:gridCol w:w="9360"/>
+        <w:gridCol w:w="5184"/>
       </w:tblGrid>
       <w:tr>
         <w:tc>
           <w:tcPr>
-            <w:tcW w:type="dxa" w:w="9360"/>
+            <w:tcW w:type="dxa" w:w="5184"/>
             <w:tcBorders>
               <w:top w:val="none"/>
               <w:left w:val="none"/>
@@ -2277,7 +2277,7 @@
       <w:tr>
         <w:tc>
           <w:tcPr>
-            <w:tcW w:type="dxa" w:w="9360"/>
+            <w:tcW w:type="dxa" w:w="5184"/>
             <w:tcBorders>
               <w:top w:val="none"/>
               <w:left w:val="none"/>
@@ -3134,7 +3134,7 @@
     </w:p>
     <w:tbl>
       <w:tblPr>
-        <w:tblW w:type="dxa" w:w="9360"/>
+        <w:tblW w:type="dxa" w:w="5184"/>
         <w:tblBorders>
           <w:top w:val="single" w:color="C0848A" w:sz="4"/>
           <w:left w:val="none"/>
@@ -3145,12 +3145,12 @@
         </w:tblBorders>
       </w:tblPr>
       <w:tblGrid>
-        <w:gridCol w:w="9360"/>
+        <w:gridCol w:w="5184"/>
       </w:tblGrid>
       <w:tr>
         <w:tc>
           <w:tcPr>
-            <w:tcW w:type="dxa" w:w="9360"/>
+            <w:tcW w:type="dxa" w:w="5184"/>
             <w:tcBorders>
               <w:top w:val="none"/>
               <w:left w:val="none"/>
@@ -3184,7 +3184,7 @@
       <w:tr>
         <w:tc>
           <w:tcPr>
-            <w:tcW w:type="dxa" w:w="9360"/>
+            <w:tcW w:type="dxa" w:w="5184"/>
             <w:tcBorders>
               <w:top w:val="none"/>
               <w:left w:val="none"/>
@@ -3218,7 +3218,7 @@
       <w:tr>
         <w:tc>
           <w:tcPr>
-            <w:tcW w:type="dxa" w:w="9360"/>
+            <w:tcW w:type="dxa" w:w="5184"/>
             <w:tcBorders>
               <w:top w:val="none"/>
               <w:left w:val="none"/>
@@ -3448,7 +3448,7 @@
     </w:p>
     <w:tbl>
       <w:tblPr>
-        <w:tblW w:type="dxa" w:w="9360"/>
+        <w:tblW w:type="dxa" w:w="5184"/>
         <w:tblBorders>
           <w:top w:val="single" w:color="C0848A" w:sz="4"/>
           <w:left w:val="none"/>
@@ -3459,12 +3459,12 @@
         </w:tblBorders>
       </w:tblPr>
       <w:tblGrid>
-        <w:gridCol w:w="9360"/>
+        <w:gridCol w:w="5184"/>
       </w:tblGrid>
       <w:tr>
         <w:tc>
           <w:tcPr>
-            <w:tcW w:type="dxa" w:w="9360"/>
+            <w:tcW w:type="dxa" w:w="5184"/>
             <w:tcBorders>
               <w:top w:val="none"/>
               <w:left w:val="none"/>
@@ -4001,7 +4001,7 @@
     </w:p>
     <w:tbl>
       <w:tblPr>
-        <w:tblW w:type="dxa" w:w="9360"/>
+        <w:tblW w:type="dxa" w:w="5184"/>
         <w:tblBorders>
           <w:top w:val="single" w:color="C0848A" w:sz="4"/>
           <w:left w:val="none"/>
@@ -4012,12 +4012,12 @@
         </w:tblBorders>
       </w:tblPr>
       <w:tblGrid>
-        <w:gridCol w:w="9360"/>
+        <w:gridCol w:w="5184"/>
       </w:tblGrid>
       <w:tr>
         <w:tc>
           <w:tcPr>
-            <w:tcW w:type="dxa" w:w="9360"/>
+            <w:tcW w:type="dxa" w:w="5184"/>
             <w:tcBorders>
               <w:top w:val="none"/>
               <w:left w:val="none"/>
@@ -4093,7 +4093,7 @@
     </w:p>
     <w:tbl>
       <w:tblPr>
-        <w:tblW w:type="dxa" w:w="9360"/>
+        <w:tblW w:type="dxa" w:w="5184"/>
         <w:tblBorders>
           <w:top w:val="single" w:color="C0848A" w:sz="4"/>
           <w:left w:val="none"/>
@@ -4104,12 +4104,12 @@
         </w:tblBorders>
       </w:tblPr>
       <w:tblGrid>
-        <w:gridCol w:w="9360"/>
+        <w:gridCol w:w="5184"/>
       </w:tblGrid>
       <w:tr>
         <w:tc>
           <w:tcPr>
-            <w:tcW w:type="dxa" w:w="9360"/>
+            <w:tcW w:type="dxa" w:w="5184"/>
             <w:tcBorders>
               <w:top w:val="none"/>
               <w:left w:val="none"/>
@@ -4143,7 +4143,7 @@
       <w:tr>
         <w:tc>
           <w:tcPr>
-            <w:tcW w:type="dxa" w:w="9360"/>
+            <w:tcW w:type="dxa" w:w="5184"/>
             <w:tcBorders>
               <w:top w:val="none"/>
               <w:left w:val="none"/>
@@ -4177,7 +4177,7 @@
       <w:tr>
         <w:tc>
           <w:tcPr>
-            <w:tcW w:type="dxa" w:w="9360"/>
+            <w:tcW w:type="dxa" w:w="5184"/>
             <w:tcBorders>
               <w:top w:val="none"/>
               <w:left w:val="none"/>
@@ -4211,7 +4211,7 @@
       <w:tr>
         <w:tc>
           <w:tcPr>
-            <w:tcW w:type="dxa" w:w="9360"/>
+            <w:tcW w:type="dxa" w:w="5184"/>
             <w:tcBorders>
               <w:top w:val="none"/>
               <w:left w:val="none"/>
@@ -4713,7 +4713,7 @@
     </w:p>
     <w:tbl>
       <w:tblPr>
-        <w:tblW w:type="dxa" w:w="9360"/>
+        <w:tblW w:type="dxa" w:w="5184"/>
         <w:tblBorders>
           <w:top w:val="single" w:color="C0848A" w:sz="4"/>
           <w:left w:val="none"/>
@@ -4724,12 +4724,12 @@
         </w:tblBorders>
       </w:tblPr>
       <w:tblGrid>
-        <w:gridCol w:w="9360"/>
+        <w:gridCol w:w="5184"/>
       </w:tblGrid>
       <w:tr>
         <w:tc>
           <w:tcPr>
-            <w:tcW w:type="dxa" w:w="9360"/>
+            <w:tcW w:type="dxa" w:w="5184"/>
             <w:tcBorders>
               <w:top w:val="none"/>
               <w:left w:val="none"/>
@@ -4763,7 +4763,7 @@
       <w:tr>
         <w:tc>
           <w:tcPr>
-            <w:tcW w:type="dxa" w:w="9360"/>
+            <w:tcW w:type="dxa" w:w="5184"/>
             <w:tcBorders>
               <w:top w:val="none"/>
               <w:left w:val="none"/>
@@ -4797,7 +4797,7 @@
       <w:tr>
         <w:tc>
           <w:tcPr>
-            <w:tcW w:type="dxa" w:w="9360"/>
+            <w:tcW w:type="dxa" w:w="5184"/>
             <w:tcBorders>
               <w:top w:val="none"/>
               <w:left w:val="none"/>
@@ -4941,7 +4941,7 @@
     </w:p>
     <w:tbl>
       <w:tblPr>
-        <w:tblW w:type="dxa" w:w="9360"/>
+        <w:tblW w:type="dxa" w:w="5184"/>
         <w:tblBorders>
           <w:top w:val="single" w:color="C0848A" w:sz="4"/>
           <w:left w:val="none"/>
@@ -4952,12 +4952,12 @@
         </w:tblBorders>
       </w:tblPr>
       <w:tblGrid>
-        <w:gridCol w:w="9360"/>
+        <w:gridCol w:w="5184"/>
       </w:tblGrid>
       <w:tr>
         <w:tc>
           <w:tcPr>
-            <w:tcW w:type="dxa" w:w="9360"/>
+            <w:tcW w:type="dxa" w:w="5184"/>
             <w:tcBorders>
               <w:top w:val="none"/>
               <w:left w:val="none"/>
@@ -5135,7 +5135,7 @@
     </w:p>
     <w:tbl>
       <w:tblPr>
-        <w:tblW w:type="dxa" w:w="9360"/>
+        <w:tblW w:type="dxa" w:w="5184"/>
         <w:tblBorders>
           <w:top w:val="single" w:color="C0848A" w:sz="4"/>
           <w:left w:val="none"/>
@@ -5146,12 +5146,12 @@
         </w:tblBorders>
       </w:tblPr>
       <w:tblGrid>
-        <w:gridCol w:w="9360"/>
+        <w:gridCol w:w="5184"/>
       </w:tblGrid>
       <w:tr>
         <w:tc>
           <w:tcPr>
-            <w:tcW w:type="dxa" w:w="9360"/>
+            <w:tcW w:type="dxa" w:w="5184"/>
             <w:tcBorders>
               <w:top w:val="none"/>
               <w:left w:val="none"/>
@@ -5185,7 +5185,7 @@
       <w:tr>
         <w:tc>
           <w:tcPr>
-            <w:tcW w:type="dxa" w:w="9360"/>
+            <w:tcW w:type="dxa" w:w="5184"/>
             <w:tcBorders>
               <w:top w:val="none"/>
               <w:left w:val="none"/>
@@ -5219,7 +5219,7 @@
       <w:tr>
         <w:tc>
           <w:tcPr>
-            <w:tcW w:type="dxa" w:w="9360"/>
+            <w:tcW w:type="dxa" w:w="5184"/>
             <w:tcBorders>
               <w:top w:val="none"/>
               <w:left w:val="none"/>
@@ -5414,7 +5414,7 @@
     </w:p>
     <w:tbl>
       <w:tblPr>
-        <w:tblW w:type="dxa" w:w="9360"/>
+        <w:tblW w:type="dxa" w:w="5184"/>
         <w:tblBorders>
           <w:top w:val="single" w:color="C0848A" w:sz="4"/>
           <w:left w:val="none"/>
@@ -5425,12 +5425,12 @@
         </w:tblBorders>
       </w:tblPr>
       <w:tblGrid>
-        <w:gridCol w:w="9360"/>
+        <w:gridCol w:w="5184"/>
       </w:tblGrid>
       <w:tr>
         <w:tc>
           <w:tcPr>
-            <w:tcW w:type="dxa" w:w="9360"/>
+            <w:tcW w:type="dxa" w:w="5184"/>
             <w:tcBorders>
               <w:top w:val="none"/>
               <w:left w:val="none"/>
@@ -5506,7 +5506,7 @@
     </w:p>
     <w:tbl>
       <w:tblPr>
-        <w:tblW w:type="dxa" w:w="9360"/>
+        <w:tblW w:type="dxa" w:w="5184"/>
         <w:tblBorders>
           <w:top w:val="single" w:color="C0848A" w:sz="4"/>
           <w:left w:val="none"/>
@@ -5517,12 +5517,12 @@
         </w:tblBorders>
       </w:tblPr>
       <w:tblGrid>
-        <w:gridCol w:w="9360"/>
+        <w:gridCol w:w="5184"/>
       </w:tblGrid>
       <w:tr>
         <w:tc>
           <w:tcPr>
-            <w:tcW w:type="dxa" w:w="9360"/>
+            <w:tcW w:type="dxa" w:w="5184"/>
             <w:tcBorders>
               <w:top w:val="none"/>
               <w:left w:val="none"/>
@@ -5682,7 +5682,7 @@
     </w:p>
     <w:tbl>
       <w:tblPr>
-        <w:tblW w:type="dxa" w:w="9360"/>
+        <w:tblW w:type="dxa" w:w="5184"/>
         <w:tblBorders>
           <w:top w:val="single" w:color="C0848A" w:sz="4"/>
           <w:left w:val="none"/>
@@ -5693,12 +5693,12 @@
         </w:tblBorders>
       </w:tblPr>
       <w:tblGrid>
-        <w:gridCol w:w="9360"/>
+        <w:gridCol w:w="5184"/>
       </w:tblGrid>
       <w:tr>
         <w:tc>
           <w:tcPr>
-            <w:tcW w:type="dxa" w:w="9360"/>
+            <w:tcW w:type="dxa" w:w="5184"/>
             <w:tcBorders>
               <w:top w:val="none"/>
               <w:left w:val="none"/>
@@ -5892,7 +5892,7 @@
     </w:p>
     <w:tbl>
       <w:tblPr>
-        <w:tblW w:type="dxa" w:w="9360"/>
+        <w:tblW w:type="dxa" w:w="5184"/>
         <w:tblBorders>
           <w:top w:val="single" w:color="C0848A" w:sz="4"/>
           <w:left w:val="none"/>
@@ -5903,12 +5903,12 @@
         </w:tblBorders>
       </w:tblPr>
       <w:tblGrid>
-        <w:gridCol w:w="9360"/>
+        <w:gridCol w:w="5184"/>
       </w:tblGrid>
       <w:tr>
         <w:tc>
           <w:tcPr>
-            <w:tcW w:type="dxa" w:w="9360"/>
+            <w:tcW w:type="dxa" w:w="5184"/>
             <w:tcBorders>
               <w:top w:val="none"/>
               <w:left w:val="none"/>
@@ -6169,7 +6169,7 @@
     </w:p>
     <w:tbl>
       <w:tblPr>
-        <w:tblW w:type="dxa" w:w="9360"/>
+        <w:tblW w:type="dxa" w:w="5184"/>
         <w:tblBorders>
           <w:top w:val="single" w:color="C0848A" w:sz="4"/>
           <w:left w:val="none"/>
@@ -6180,12 +6180,12 @@
         </w:tblBorders>
       </w:tblPr>
       <w:tblGrid>
-        <w:gridCol w:w="9360"/>
+        <w:gridCol w:w="5184"/>
       </w:tblGrid>
       <w:tr>
         <w:tc>
           <w:tcPr>
-            <w:tcW w:type="dxa" w:w="9360"/>
+            <w:tcW w:type="dxa" w:w="5184"/>
             <w:tcBorders>
               <w:top w:val="none"/>
               <w:left w:val="none"/>
@@ -6219,7 +6219,7 @@
       <w:tr>
         <w:tc>
           <w:tcPr>
-            <w:tcW w:type="dxa" w:w="9360"/>
+            <w:tcW w:type="dxa" w:w="5184"/>
             <w:tcBorders>
               <w:top w:val="none"/>
               <w:left w:val="none"/>
@@ -6253,7 +6253,7 @@
       <w:tr>
         <w:tc>
           <w:tcPr>
-            <w:tcW w:type="dxa" w:w="9360"/>
+            <w:tcW w:type="dxa" w:w="5184"/>
             <w:tcBorders>
               <w:top w:val="none"/>
               <w:left w:val="none"/>
@@ -6287,7 +6287,7 @@
       <w:tr>
         <w:tc>
           <w:tcPr>
-            <w:tcW w:type="dxa" w:w="9360"/>
+            <w:tcW w:type="dxa" w:w="5184"/>
             <w:tcBorders>
               <w:top w:val="none"/>
               <w:left w:val="none"/>
@@ -6500,7 +6500,7 @@
     </w:p>
     <w:tbl>
       <w:tblPr>
-        <w:tblW w:type="dxa" w:w="9360"/>
+        <w:tblW w:type="dxa" w:w="5184"/>
         <w:tblBorders>
           <w:top w:val="single" w:color="C0848A" w:sz="4"/>
           <w:left w:val="none"/>
@@ -6511,12 +6511,12 @@
         </w:tblBorders>
       </w:tblPr>
       <w:tblGrid>
-        <w:gridCol w:w="9360"/>
+        <w:gridCol w:w="5184"/>
       </w:tblGrid>
       <w:tr>
         <w:tc>
           <w:tcPr>
-            <w:tcW w:type="dxa" w:w="9360"/>
+            <w:tcW w:type="dxa" w:w="5184"/>
             <w:tcBorders>
               <w:top w:val="none"/>
               <w:left w:val="none"/>
@@ -6550,7 +6550,7 @@
       <w:tr>
         <w:tc>
           <w:tcPr>
-            <w:tcW w:type="dxa" w:w="9360"/>
+            <w:tcW w:type="dxa" w:w="5184"/>
             <w:tcBorders>
               <w:top w:val="none"/>
               <w:left w:val="none"/>
@@ -6626,7 +6626,7 @@
     </w:p>
     <w:tbl>
       <w:tblPr>
-        <w:tblW w:type="dxa" w:w="9360"/>
+        <w:tblW w:type="dxa" w:w="5184"/>
         <w:tblBorders>
           <w:top w:val="single" w:color="C0848A" w:sz="4"/>
           <w:left w:val="none"/>
@@ -6637,12 +6637,12 @@
         </w:tblBorders>
       </w:tblPr>
       <w:tblGrid>
-        <w:gridCol w:w="9360"/>
+        <w:gridCol w:w="5184"/>
       </w:tblGrid>
       <w:tr>
         <w:tc>
           <w:tcPr>
-            <w:tcW w:type="dxa" w:w="9360"/>
+            <w:tcW w:type="dxa" w:w="5184"/>
             <w:tcBorders>
               <w:top w:val="none"/>
               <w:left w:val="none"/>
@@ -7173,7 +7173,7 @@
     </w:p>
     <w:tbl>
       <w:tblPr>
-        <w:tblW w:type="dxa" w:w="9360"/>
+        <w:tblW w:type="dxa" w:w="5184"/>
         <w:tblBorders>
           <w:top w:val="single" w:color="C0848A" w:sz="4"/>
           <w:left w:val="none"/>
@@ -7184,12 +7184,12 @@
         </w:tblBorders>
       </w:tblPr>
       <w:tblGrid>
-        <w:gridCol w:w="9360"/>
+        <w:gridCol w:w="5184"/>
       </w:tblGrid>
       <w:tr>
         <w:tc>
           <w:tcPr>
-            <w:tcW w:type="dxa" w:w="9360"/>
+            <w:tcW w:type="dxa" w:w="5184"/>
             <w:tcBorders>
               <w:top w:val="none"/>
               <w:left w:val="none"/>
@@ -7400,7 +7400,7 @@
     </w:p>
     <w:tbl>
       <w:tblPr>
-        <w:tblW w:type="dxa" w:w="9360"/>
+        <w:tblW w:type="dxa" w:w="5184"/>
         <w:tblBorders>
           <w:top w:val="single" w:color="C0848A" w:sz="4"/>
           <w:left w:val="none"/>
@@ -7411,12 +7411,12 @@
         </w:tblBorders>
       </w:tblPr>
       <w:tblGrid>
-        <w:gridCol w:w="9360"/>
+        <w:gridCol w:w="5184"/>
       </w:tblGrid>
       <w:tr>
         <w:tc>
           <w:tcPr>
-            <w:tcW w:type="dxa" w:w="9360"/>
+            <w:tcW w:type="dxa" w:w="5184"/>
             <w:tcBorders>
               <w:top w:val="none"/>
               <w:left w:val="none"/>
@@ -7450,7 +7450,7 @@
       <w:tr>
         <w:tc>
           <w:tcPr>
-            <w:tcW w:type="dxa" w:w="9360"/>
+            <w:tcW w:type="dxa" w:w="5184"/>
             <w:tcBorders>
               <w:top w:val="none"/>
               <w:left w:val="none"/>
@@ -7484,7 +7484,7 @@
       <w:tr>
         <w:tc>
           <w:tcPr>
-            <w:tcW w:type="dxa" w:w="9360"/>
+            <w:tcW w:type="dxa" w:w="5184"/>
             <w:tcBorders>
               <w:top w:val="none"/>
               <w:left w:val="none"/>
@@ -7518,7 +7518,7 @@
       <w:tr>
         <w:tc>
           <w:tcPr>
-            <w:tcW w:type="dxa" w:w="9360"/>
+            <w:tcW w:type="dxa" w:w="5184"/>
             <w:tcBorders>
               <w:top w:val="none"/>
               <w:left w:val="none"/>
@@ -7764,7 +7764,7 @@
     </w:p>
     <w:tbl>
       <w:tblPr>
-        <w:tblW w:type="dxa" w:w="9360"/>
+        <w:tblW w:type="dxa" w:w="5184"/>
         <w:tblBorders>
           <w:top w:val="single" w:color="C0848A" w:sz="4"/>
           <w:left w:val="none"/>
@@ -7775,12 +7775,12 @@
         </w:tblBorders>
       </w:tblPr>
       <w:tblGrid>
-        <w:gridCol w:w="9360"/>
+        <w:gridCol w:w="5184"/>
       </w:tblGrid>
       <w:tr>
         <w:tc>
           <w:tcPr>
-            <w:tcW w:type="dxa" w:w="9360"/>
+            <w:tcW w:type="dxa" w:w="5184"/>
             <w:tcBorders>
               <w:top w:val="none"/>
               <w:left w:val="none"/>
@@ -7890,7 +7890,7 @@
     </w:p>
     <w:tbl>
       <w:tblPr>
-        <w:tblW w:type="dxa" w:w="9360"/>
+        <w:tblW w:type="dxa" w:w="5184"/>
         <w:tblBorders>
           <w:top w:val="single" w:color="C0848A" w:sz="4"/>
           <w:left w:val="none"/>
@@ -7901,12 +7901,12 @@
         </w:tblBorders>
       </w:tblPr>
       <w:tblGrid>
-        <w:gridCol w:w="9360"/>
+        <w:gridCol w:w="5184"/>
       </w:tblGrid>
       <w:tr>
         <w:tc>
           <w:tcPr>
-            <w:tcW w:type="dxa" w:w="9360"/>
+            <w:tcW w:type="dxa" w:w="5184"/>
             <w:tcBorders>
               <w:top w:val="none"/>
               <w:left w:val="none"/>
@@ -8569,7 +8569,7 @@
     </w:p>
     <w:tbl>
       <w:tblPr>
-        <w:tblW w:type="dxa" w:w="9360"/>
+        <w:tblW w:type="dxa" w:w="5184"/>
         <w:tblBorders>
           <w:top w:val="single" w:color="C0848A" w:sz="4"/>
           <w:left w:val="none"/>
@@ -8580,12 +8580,12 @@
         </w:tblBorders>
       </w:tblPr>
       <w:tblGrid>
-        <w:gridCol w:w="9360"/>
+        <w:gridCol w:w="5184"/>
       </w:tblGrid>
       <w:tr>
         <w:tc>
           <w:tcPr>
-            <w:tcW w:type="dxa" w:w="9360"/>
+            <w:tcW w:type="dxa" w:w="5184"/>
             <w:tcBorders>
               <w:top w:val="none"/>
               <w:left w:val="none"/>
@@ -8619,7 +8619,7 @@
       <w:tr>
         <w:tc>
           <w:tcPr>
-            <w:tcW w:type="dxa" w:w="9360"/>
+            <w:tcW w:type="dxa" w:w="5184"/>
             <w:tcBorders>
               <w:top w:val="none"/>
               <w:left w:val="none"/>
@@ -8653,7 +8653,7 @@
       <w:tr>
         <w:tc>
           <w:tcPr>
-            <w:tcW w:type="dxa" w:w="9360"/>
+            <w:tcW w:type="dxa" w:w="5184"/>
             <w:tcBorders>
               <w:top w:val="none"/>
               <w:left w:val="none"/>
@@ -8687,7 +8687,7 @@
       <w:tr>
         <w:tc>
           <w:tcPr>
-            <w:tcW w:type="dxa" w:w="9360"/>
+            <w:tcW w:type="dxa" w:w="5184"/>
             <w:tcBorders>
               <w:top w:val="none"/>
               <w:left w:val="none"/>
@@ -9546,7 +9546,7 @@
     </w:p>
     <w:tbl>
       <w:tblPr>
-        <w:tblW w:type="dxa" w:w="9360"/>
+        <w:tblW w:type="dxa" w:w="5184"/>
         <w:tblBorders>
           <w:top w:val="single" w:color="C0848A" w:sz="4"/>
           <w:left w:val="none"/>
@@ -9557,12 +9557,12 @@
         </w:tblBorders>
       </w:tblPr>
       <w:tblGrid>
-        <w:gridCol w:w="9360"/>
+        <w:gridCol w:w="5184"/>
       </w:tblGrid>
       <w:tr>
         <w:tc>
           <w:tcPr>
-            <w:tcW w:type="dxa" w:w="9360"/>
+            <w:tcW w:type="dxa" w:w="5184"/>
             <w:tcBorders>
               <w:top w:val="none"/>
               <w:left w:val="none"/>
@@ -9823,7 +9823,7 @@
     </w:p>
     <w:tbl>
       <w:tblPr>
-        <w:tblW w:type="dxa" w:w="9360"/>
+        <w:tblW w:type="dxa" w:w="5184"/>
         <w:tblBorders>
           <w:top w:val="single" w:color="C0848A" w:sz="4"/>
           <w:left w:val="none"/>
@@ -9834,12 +9834,12 @@
         </w:tblBorders>
       </w:tblPr>
       <w:tblGrid>
-        <w:gridCol w:w="9360"/>
+        <w:gridCol w:w="5184"/>
       </w:tblGrid>
       <w:tr>
         <w:tc>
           <w:tcPr>
-            <w:tcW w:type="dxa" w:w="9360"/>
+            <w:tcW w:type="dxa" w:w="5184"/>
             <w:tcBorders>
               <w:top w:val="none"/>
               <w:left w:val="none"/>
@@ -9873,7 +9873,7 @@
       <w:tr>
         <w:tc>
           <w:tcPr>
-            <w:tcW w:type="dxa" w:w="9360"/>
+            <w:tcW w:type="dxa" w:w="5184"/>
             <w:tcBorders>
               <w:top w:val="none"/>
               <w:left w:val="none"/>
@@ -9907,7 +9907,7 @@
       <w:tr>
         <w:tc>
           <w:tcPr>
-            <w:tcW w:type="dxa" w:w="9360"/>
+            <w:tcW w:type="dxa" w:w="5184"/>
             <w:tcBorders>
               <w:top w:val="none"/>
               <w:left w:val="none"/>
@@ -9941,7 +9941,7 @@
       <w:tr>
         <w:tc>
           <w:tcPr>
-            <w:tcW w:type="dxa" w:w="9360"/>
+            <w:tcW w:type="dxa" w:w="5184"/>
             <w:tcBorders>
               <w:top w:val="none"/>
               <w:left w:val="none"/>
@@ -10086,7 +10086,7 @@
     </w:p>
     <w:tbl>
       <w:tblPr>
-        <w:tblW w:type="dxa" w:w="9360"/>
+        <w:tblW w:type="dxa" w:w="5184"/>
         <w:tblBorders>
           <w:top w:val="single" w:color="C0848A" w:sz="4"/>
           <w:left w:val="none"/>
@@ -10097,12 +10097,12 @@
         </w:tblBorders>
       </w:tblPr>
       <w:tblGrid>
-        <w:gridCol w:w="9360"/>
+        <w:gridCol w:w="5184"/>
       </w:tblGrid>
       <w:tr>
         <w:tc>
           <w:tcPr>
-            <w:tcW w:type="dxa" w:w="9360"/>
+            <w:tcW w:type="dxa" w:w="5184"/>
             <w:tcBorders>
               <w:top w:val="none"/>
               <w:left w:val="none"/>
@@ -10464,7 +10464,7 @@
     </w:p>
     <w:tbl>
       <w:tblPr>
-        <w:tblW w:type="dxa" w:w="9360"/>
+        <w:tblW w:type="dxa" w:w="5184"/>
         <w:tblBorders>
           <w:top w:val="single" w:color="C0848A" w:sz="4"/>
           <w:left w:val="none"/>
@@ -10475,12 +10475,12 @@
         </w:tblBorders>
       </w:tblPr>
       <w:tblGrid>
-        <w:gridCol w:w="9360"/>
+        <w:gridCol w:w="5184"/>
       </w:tblGrid>
       <w:tr>
         <w:tc>
           <w:tcPr>
-            <w:tcW w:type="dxa" w:w="9360"/>
+            <w:tcW w:type="dxa" w:w="5184"/>
             <w:tcBorders>
               <w:top w:val="none"/>
               <w:left w:val="none"/>
@@ -10876,7 +10876,7 @@
     </w:p>
     <w:tbl>
       <w:tblPr>
-        <w:tblW w:type="dxa" w:w="9360"/>
+        <w:tblW w:type="dxa" w:w="5184"/>
         <w:tblBorders>
           <w:top w:val="single" w:color="C0848A" w:sz="4"/>
           <w:left w:val="none"/>
@@ -10887,12 +10887,12 @@
         </w:tblBorders>
       </w:tblPr>
       <w:tblGrid>
-        <w:gridCol w:w="9360"/>
+        <w:gridCol w:w="5184"/>
       </w:tblGrid>
       <w:tr>
         <w:tc>
           <w:tcPr>
-            <w:tcW w:type="dxa" w:w="9360"/>
+            <w:tcW w:type="dxa" w:w="5184"/>
             <w:tcBorders>
               <w:top w:val="none"/>
               <w:left w:val="none"/>
@@ -10926,7 +10926,7 @@
       <w:tr>
         <w:tc>
           <w:tcPr>
-            <w:tcW w:type="dxa" w:w="9360"/>
+            <w:tcW w:type="dxa" w:w="5184"/>
             <w:tcBorders>
               <w:top w:val="none"/>
               <w:left w:val="none"/>
@@ -10960,7 +10960,7 @@
       <w:tr>
         <w:tc>
           <w:tcPr>
-            <w:tcW w:type="dxa" w:w="9360"/>
+            <w:tcW w:type="dxa" w:w="5184"/>
             <w:tcBorders>
               <w:top w:val="none"/>
               <w:left w:val="none"/>
@@ -10994,7 +10994,7 @@
       <w:tr>
         <w:tc>
           <w:tcPr>
-            <w:tcW w:type="dxa" w:w="9360"/>
+            <w:tcW w:type="dxa" w:w="5184"/>
             <w:tcBorders>
               <w:top w:val="none"/>
               <w:left w:val="none"/>
@@ -11156,7 +11156,7 @@
     </w:p>
     <w:tbl>
       <w:tblPr>
-        <w:tblW w:type="dxa" w:w="9360"/>
+        <w:tblW w:type="dxa" w:w="5184"/>
         <w:tblBorders>
           <w:top w:val="single" w:color="C0848A" w:sz="4"/>
           <w:left w:val="none"/>
@@ -11167,12 +11167,12 @@
         </w:tblBorders>
       </w:tblPr>
       <w:tblGrid>
-        <w:gridCol w:w="9360"/>
+        <w:gridCol w:w="5184"/>
       </w:tblGrid>
       <w:tr>
         <w:tc>
           <w:tcPr>
-            <w:tcW w:type="dxa" w:w="9360"/>
+            <w:tcW w:type="dxa" w:w="5184"/>
             <w:tcBorders>
               <w:top w:val="none"/>
               <w:left w:val="none"/>
@@ -11516,7 +11516,7 @@
     </w:p>
     <w:tbl>
       <w:tblPr>
-        <w:tblW w:type="dxa" w:w="9360"/>
+        <w:tblW w:type="dxa" w:w="5184"/>
         <w:tblBorders>
           <w:top w:val="single" w:color="C0848A" w:sz="4"/>
           <w:left w:val="none"/>
@@ -11527,12 +11527,12 @@
         </w:tblBorders>
       </w:tblPr>
       <w:tblGrid>
-        <w:gridCol w:w="9360"/>
+        <w:gridCol w:w="5184"/>
       </w:tblGrid>
       <w:tr>
         <w:tc>
           <w:tcPr>
-            <w:tcW w:type="dxa" w:w="9360"/>
+            <w:tcW w:type="dxa" w:w="5184"/>
             <w:tcBorders>
               <w:top w:val="none"/>
               <w:left w:val="none"/>
@@ -11566,7 +11566,7 @@
       <w:tr>
         <w:tc>
           <w:tcPr>
-            <w:tcW w:type="dxa" w:w="9360"/>
+            <w:tcW w:type="dxa" w:w="5184"/>
             <w:tcBorders>
               <w:top w:val="none"/>
               <w:left w:val="none"/>
@@ -11600,7 +11600,7 @@
       <w:tr>
         <w:tc>
           <w:tcPr>
-            <w:tcW w:type="dxa" w:w="9360"/>
+            <w:tcW w:type="dxa" w:w="5184"/>
             <w:tcBorders>
               <w:top w:val="none"/>
               <w:left w:val="none"/>
@@ -11634,7 +11634,7 @@
       <w:tr>
         <w:tc>
           <w:tcPr>
-            <w:tcW w:type="dxa" w:w="9360"/>
+            <w:tcW w:type="dxa" w:w="5184"/>
             <w:tcBorders>
               <w:top w:val="none"/>
               <w:left w:val="none"/>
@@ -11668,7 +11668,7 @@
       <w:tr>
         <w:tc>
           <w:tcPr>
-            <w:tcW w:type="dxa" w:w="9360"/>
+            <w:tcW w:type="dxa" w:w="5184"/>
             <w:tcBorders>
               <w:top w:val="none"/>
               <w:left w:val="none"/>
@@ -11862,7 +11862,7 @@
     </w:p>
     <w:tbl>
       <w:tblPr>
-        <w:tblW w:type="dxa" w:w="9360"/>
+        <w:tblW w:type="dxa" w:w="5184"/>
         <w:tblBorders>
           <w:top w:val="single" w:color="C0848A" w:sz="4"/>
           <w:left w:val="none"/>
@@ -11873,12 +11873,12 @@
         </w:tblBorders>
       </w:tblPr>
       <w:tblGrid>
-        <w:gridCol w:w="9360"/>
+        <w:gridCol w:w="5184"/>
       </w:tblGrid>
       <w:tr>
         <w:tc>
           <w:tcPr>
-            <w:tcW w:type="dxa" w:w="9360"/>
+            <w:tcW w:type="dxa" w:w="5184"/>
             <w:tcBorders>
               <w:top w:val="none"/>
               <w:left w:val="none"/>
@@ -12088,7 +12088,7 @@
     </w:p>
     <w:tbl>
       <w:tblPr>
-        <w:tblW w:type="dxa" w:w="9360"/>
+        <w:tblW w:type="dxa" w:w="5184"/>
         <w:tblBorders>
           <w:top w:val="single" w:color="C0848A" w:sz="4"/>
           <w:left w:val="none"/>
@@ -12099,12 +12099,12 @@
         </w:tblBorders>
       </w:tblPr>
       <w:tblGrid>
-        <w:gridCol w:w="9360"/>
+        <w:gridCol w:w="5184"/>
       </w:tblGrid>
       <w:tr>
         <w:tc>
           <w:tcPr>
-            <w:tcW w:type="dxa" w:w="9360"/>
+            <w:tcW w:type="dxa" w:w="5184"/>
             <w:tcBorders>
               <w:top w:val="none"/>
               <w:left w:val="none"/>
@@ -12138,7 +12138,7 @@
       <w:tr>
         <w:tc>
           <w:tcPr>
-            <w:tcW w:type="dxa" w:w="9360"/>
+            <w:tcW w:type="dxa" w:w="5184"/>
             <w:tcBorders>
               <w:top w:val="none"/>
               <w:left w:val="none"/>
@@ -12172,7 +12172,7 @@
       <w:tr>
         <w:tc>
           <w:tcPr>
-            <w:tcW w:type="dxa" w:w="9360"/>
+            <w:tcW w:type="dxa" w:w="5184"/>
             <w:tcBorders>
               <w:top w:val="none"/>
               <w:left w:val="none"/>
@@ -12206,7 +12206,7 @@
       <w:tr>
         <w:tc>
           <w:tcPr>
-            <w:tcW w:type="dxa" w:w="9360"/>
+            <w:tcW w:type="dxa" w:w="5184"/>
             <w:tcBorders>
               <w:top w:val="none"/>
               <w:left w:val="none"/>
@@ -12704,7 +12704,7 @@
     </w:p>
     <w:tbl>
       <w:tblPr>
-        <w:tblW w:type="dxa" w:w="9360"/>
+        <w:tblW w:type="dxa" w:w="5184"/>
         <w:tblBorders>
           <w:top w:val="single" w:color="C0848A" w:sz="4"/>
           <w:left w:val="none"/>
@@ -12715,12 +12715,12 @@
         </w:tblBorders>
       </w:tblPr>
       <w:tblGrid>
-        <w:gridCol w:w="9360"/>
+        <w:gridCol w:w="5184"/>
       </w:tblGrid>
       <w:tr>
         <w:tc>
           <w:tcPr>
-            <w:tcW w:type="dxa" w:w="9360"/>
+            <w:tcW w:type="dxa" w:w="5184"/>
             <w:tcBorders>
               <w:top w:val="none"/>
               <w:left w:val="none"/>
@@ -13166,7 +13166,7 @@
     </w:p>
     <w:tbl>
       <w:tblPr>
-        <w:tblW w:type="dxa" w:w="9360"/>
+        <w:tblW w:type="dxa" w:w="5184"/>
         <w:tblBorders>
           <w:top w:val="single" w:color="C0848A" w:sz="4"/>
           <w:left w:val="none"/>
@@ -13177,12 +13177,12 @@
         </w:tblBorders>
       </w:tblPr>
       <w:tblGrid>
-        <w:gridCol w:w="9360"/>
+        <w:gridCol w:w="5184"/>
       </w:tblGrid>
       <w:tr>
         <w:tc>
           <w:tcPr>
-            <w:tcW w:type="dxa" w:w="9360"/>
+            <w:tcW w:type="dxa" w:w="5184"/>
             <w:tcBorders>
               <w:top w:val="none"/>
               <w:left w:val="none"/>
@@ -13216,7 +13216,7 @@
       <w:tr>
         <w:tc>
           <w:tcPr>
-            <w:tcW w:type="dxa" w:w="9360"/>
+            <w:tcW w:type="dxa" w:w="5184"/>
             <w:tcBorders>
               <w:top w:val="none"/>
               <w:left w:val="none"/>
@@ -13250,7 +13250,7 @@
       <w:tr>
         <w:tc>
           <w:tcPr>
-            <w:tcW w:type="dxa" w:w="9360"/>
+            <w:tcW w:type="dxa" w:w="5184"/>
             <w:tcBorders>
               <w:top w:val="none"/>
               <w:left w:val="none"/>
@@ -13284,7 +13284,7 @@
       <w:tr>
         <w:tc>
           <w:tcPr>
-            <w:tcW w:type="dxa" w:w="9360"/>
+            <w:tcW w:type="dxa" w:w="5184"/>
             <w:tcBorders>
               <w:top w:val="none"/>
               <w:left w:val="none"/>
@@ -13318,7 +13318,7 @@
       <w:tr>
         <w:tc>
           <w:tcPr>
-            <w:tcW w:type="dxa" w:w="9360"/>
+            <w:tcW w:type="dxa" w:w="5184"/>
             <w:tcBorders>
               <w:top w:val="none"/>
               <w:left w:val="none"/>
@@ -13497,7 +13497,7 @@
     </w:p>
     <w:tbl>
       <w:tblPr>
-        <w:tblW w:type="dxa" w:w="9360"/>
+        <w:tblW w:type="dxa" w:w="5184"/>
         <w:tblBorders>
           <w:top w:val="single" w:color="C0848A" w:sz="4"/>
           <w:left w:val="none"/>
@@ -13508,12 +13508,12 @@
         </w:tblBorders>
       </w:tblPr>
       <w:tblGrid>
-        <w:gridCol w:w="9360"/>
+        <w:gridCol w:w="5184"/>
       </w:tblGrid>
       <w:tr>
         <w:tc>
           <w:tcPr>
-            <w:tcW w:type="dxa" w:w="9360"/>
+            <w:tcW w:type="dxa" w:w="5184"/>
             <w:tcBorders>
               <w:top w:val="none"/>
               <w:left w:val="none"/>
@@ -13589,7 +13589,7 @@
     </w:p>
     <w:tbl>
       <w:tblPr>
-        <w:tblW w:type="dxa" w:w="9360"/>
+        <w:tblW w:type="dxa" w:w="5184"/>
         <w:tblBorders>
           <w:top w:val="single" w:color="C0848A" w:sz="4"/>
           <w:left w:val="none"/>
@@ -13600,12 +13600,12 @@
         </w:tblBorders>
       </w:tblPr>
       <w:tblGrid>
-        <w:gridCol w:w="9360"/>
+        <w:gridCol w:w="5184"/>
       </w:tblGrid>
       <w:tr>
         <w:tc>
           <w:tcPr>
-            <w:tcW w:type="dxa" w:w="9360"/>
+            <w:tcW w:type="dxa" w:w="5184"/>
             <w:tcBorders>
               <w:top w:val="none"/>
               <w:left w:val="none"/>
@@ -13916,7 +13916,7 @@
     </w:p>
     <w:tbl>
       <w:tblPr>
-        <w:tblW w:type="dxa" w:w="9360"/>
+        <w:tblW w:type="dxa" w:w="5184"/>
         <w:tblBorders>
           <w:top w:val="single" w:color="C0848A" w:sz="4"/>
           <w:left w:val="none"/>
@@ -13927,12 +13927,12 @@
         </w:tblBorders>
       </w:tblPr>
       <w:tblGrid>
-        <w:gridCol w:w="9360"/>
+        <w:gridCol w:w="5184"/>
       </w:tblGrid>
       <w:tr>
         <w:tc>
           <w:tcPr>
-            <w:tcW w:type="dxa" w:w="9360"/>
+            <w:tcW w:type="dxa" w:w="5184"/>
             <w:tcBorders>
               <w:top w:val="none"/>
               <w:left w:val="none"/>
@@ -14025,7 +14025,7 @@
     </w:p>
     <w:tbl>
       <w:tblPr>
-        <w:tblW w:type="dxa" w:w="9360"/>
+        <w:tblW w:type="dxa" w:w="5184"/>
         <w:tblBorders>
           <w:top w:val="single" w:color="C0848A" w:sz="4"/>
           <w:left w:val="none"/>
@@ -14036,12 +14036,12 @@
         </w:tblBorders>
       </w:tblPr>
       <w:tblGrid>
-        <w:gridCol w:w="9360"/>
+        <w:gridCol w:w="5184"/>
       </w:tblGrid>
       <w:tr>
         <w:tc>
           <w:tcPr>
-            <w:tcW w:type="dxa" w:w="9360"/>
+            <w:tcW w:type="dxa" w:w="5184"/>
             <w:tcBorders>
               <w:top w:val="none"/>
               <w:left w:val="none"/>
@@ -14218,7 +14218,7 @@
     </w:p>
     <w:tbl>
       <w:tblPr>
-        <w:tblW w:type="dxa" w:w="9360"/>
+        <w:tblW w:type="dxa" w:w="5184"/>
         <w:tblBorders>
           <w:top w:val="single" w:color="C0848A" w:sz="4"/>
           <w:left w:val="none"/>
@@ -14229,12 +14229,12 @@
         </w:tblBorders>
       </w:tblPr>
       <w:tblGrid>
-        <w:gridCol w:w="9360"/>
+        <w:gridCol w:w="5184"/>
       </w:tblGrid>
       <w:tr>
         <w:tc>
           <w:tcPr>
-            <w:tcW w:type="dxa" w:w="9360"/>
+            <w:tcW w:type="dxa" w:w="5184"/>
             <w:tcBorders>
               <w:top w:val="none"/>
               <w:left w:val="none"/>
@@ -14268,7 +14268,7 @@
       <w:tr>
         <w:tc>
           <w:tcPr>
-            <w:tcW w:type="dxa" w:w="9360"/>
+            <w:tcW w:type="dxa" w:w="5184"/>
             <w:tcBorders>
               <w:top w:val="none"/>
               <w:left w:val="none"/>
@@ -14302,7 +14302,7 @@
       <w:tr>
         <w:tc>
           <w:tcPr>
-            <w:tcW w:type="dxa" w:w="9360"/>
+            <w:tcW w:type="dxa" w:w="5184"/>
             <w:tcBorders>
               <w:top w:val="none"/>
               <w:left w:val="none"/>
@@ -14336,7 +14336,7 @@
       <w:tr>
         <w:tc>
           <w:tcPr>
-            <w:tcW w:type="dxa" w:w="9360"/>
+            <w:tcW w:type="dxa" w:w="5184"/>
             <w:tcBorders>
               <w:top w:val="none"/>
               <w:left w:val="none"/>
@@ -14785,7 +14785,7 @@
     </w:p>
     <w:tbl>
       <w:tblPr>
-        <w:tblW w:type="dxa" w:w="9360"/>
+        <w:tblW w:type="dxa" w:w="5184"/>
         <w:tblBorders>
           <w:top w:val="single" w:color="C0848A" w:sz="4"/>
           <w:left w:val="none"/>
@@ -14796,12 +14796,12 @@
         </w:tblBorders>
       </w:tblPr>
       <w:tblGrid>
-        <w:gridCol w:w="9360"/>
+        <w:gridCol w:w="5184"/>
       </w:tblGrid>
       <w:tr>
         <w:tc>
           <w:tcPr>
-            <w:tcW w:type="dxa" w:w="9360"/>
+            <w:tcW w:type="dxa" w:w="5184"/>
             <w:tcBorders>
               <w:top w:val="none"/>
               <w:left w:val="none"/>
@@ -14835,7 +14835,7 @@
       <w:tr>
         <w:tc>
           <w:tcPr>
-            <w:tcW w:type="dxa" w:w="9360"/>
+            <w:tcW w:type="dxa" w:w="5184"/>
             <w:tcBorders>
               <w:top w:val="none"/>
               <w:left w:val="none"/>
@@ -15653,7 +15653,7 @@
     </w:p>
     <w:tbl>
       <w:tblPr>
-        <w:tblW w:type="dxa" w:w="9360"/>
+        <w:tblW w:type="dxa" w:w="5184"/>
         <w:tblBorders>
           <w:top w:val="single" w:color="C0848A" w:sz="4"/>
           <w:left w:val="none"/>
@@ -15664,12 +15664,12 @@
         </w:tblBorders>
       </w:tblPr>
       <w:tblGrid>
-        <w:gridCol w:w="9360"/>
+        <w:gridCol w:w="5184"/>
       </w:tblGrid>
       <w:tr>
         <w:tc>
           <w:tcPr>
-            <w:tcW w:type="dxa" w:w="9360"/>
+            <w:tcW w:type="dxa" w:w="5184"/>
             <w:tcBorders>
               <w:top w:val="none"/>
               <w:left w:val="none"/>
@@ -15703,7 +15703,7 @@
       <w:tr>
         <w:tc>
           <w:tcPr>
-            <w:tcW w:type="dxa" w:w="9360"/>
+            <w:tcW w:type="dxa" w:w="5184"/>
             <w:tcBorders>
               <w:top w:val="none"/>
               <w:left w:val="none"/>
@@ -15737,7 +15737,7 @@
       <w:tr>
         <w:tc>
           <w:tcPr>
-            <w:tcW w:type="dxa" w:w="9360"/>
+            <w:tcW w:type="dxa" w:w="5184"/>
             <w:tcBorders>
               <w:top w:val="none"/>
               <w:left w:val="none"/>
@@ -15771,7 +15771,7 @@
       <w:tr>
         <w:tc>
           <w:tcPr>
-            <w:tcW w:type="dxa" w:w="9360"/>
+            <w:tcW w:type="dxa" w:w="5184"/>
             <w:tcBorders>
               <w:top w:val="none"/>
               <w:left w:val="none"/>
@@ -15805,7 +15805,7 @@
       <w:tr>
         <w:tc>
           <w:tcPr>
-            <w:tcW w:type="dxa" w:w="9360"/>
+            <w:tcW w:type="dxa" w:w="5184"/>
             <w:tcBorders>
               <w:top w:val="none"/>
               <w:left w:val="none"/>
@@ -15882,7 +15882,7 @@
     </w:p>
     <w:tbl>
       <w:tblPr>
-        <w:tblW w:type="dxa" w:w="9360"/>
+        <w:tblW w:type="dxa" w:w="5184"/>
         <w:tblBorders>
           <w:top w:val="single" w:color="C0848A" w:sz="4"/>
           <w:left w:val="none"/>
@@ -15893,12 +15893,12 @@
         </w:tblBorders>
       </w:tblPr>
       <w:tblGrid>
-        <w:gridCol w:w="9360"/>
+        <w:gridCol w:w="5184"/>
       </w:tblGrid>
       <w:tr>
         <w:tc>
           <w:tcPr>
-            <w:tcW w:type="dxa" w:w="9360"/>
+            <w:tcW w:type="dxa" w:w="5184"/>
             <w:tcBorders>
               <w:top w:val="none"/>
               <w:left w:val="none"/>
@@ -16489,7 +16489,7 @@
     </w:p>
     <w:tbl>
       <w:tblPr>
-        <w:tblW w:type="dxa" w:w="9360"/>
+        <w:tblW w:type="dxa" w:w="5184"/>
         <w:tblBorders>
           <w:top w:val="single" w:color="C0848A" w:sz="4"/>
           <w:left w:val="none"/>
@@ -16500,12 +16500,12 @@
         </w:tblBorders>
       </w:tblPr>
       <w:tblGrid>
-        <w:gridCol w:w="9360"/>
+        <w:gridCol w:w="5184"/>
       </w:tblGrid>
       <w:tr>
         <w:tc>
           <w:tcPr>
-            <w:tcW w:type="dxa" w:w="9360"/>
+            <w:tcW w:type="dxa" w:w="5184"/>
             <w:tcBorders>
               <w:top w:val="none"/>
               <w:left w:val="none"/>
@@ -16581,7 +16581,7 @@
     </w:p>
     <w:tbl>
       <w:tblPr>
-        <w:tblW w:type="dxa" w:w="9360"/>
+        <w:tblW w:type="dxa" w:w="5184"/>
         <w:tblBorders>
           <w:top w:val="single" w:color="C0848A" w:sz="4"/>
           <w:left w:val="none"/>
@@ -16592,12 +16592,12 @@
         </w:tblBorders>
       </w:tblPr>
       <w:tblGrid>
-        <w:gridCol w:w="9360"/>
+        <w:gridCol w:w="5184"/>
       </w:tblGrid>
       <w:tr>
         <w:tc>
           <w:tcPr>
-            <w:tcW w:type="dxa" w:w="9360"/>
+            <w:tcW w:type="dxa" w:w="5184"/>
             <w:tcBorders>
               <w:top w:val="none"/>
               <w:left w:val="none"/>
@@ -16824,7 +16824,7 @@
     </w:p>
     <w:tbl>
       <w:tblPr>
-        <w:tblW w:type="dxa" w:w="9360"/>
+        <w:tblW w:type="dxa" w:w="5184"/>
         <w:tblBorders>
           <w:top w:val="single" w:color="C0848A" w:sz="4"/>
           <w:left w:val="none"/>
@@ -16835,12 +16835,12 @@
         </w:tblBorders>
       </w:tblPr>
       <w:tblGrid>
-        <w:gridCol w:w="9360"/>
+        <w:gridCol w:w="5184"/>
       </w:tblGrid>
       <w:tr>
         <w:tc>
           <w:tcPr>
-            <w:tcW w:type="dxa" w:w="9360"/>
+            <w:tcW w:type="dxa" w:w="5184"/>
             <w:tcBorders>
               <w:top w:val="none"/>
               <w:left w:val="none"/>
@@ -16933,7 +16933,7 @@
     </w:p>
     <w:tbl>
       <w:tblPr>
-        <w:tblW w:type="dxa" w:w="9360"/>
+        <w:tblW w:type="dxa" w:w="5184"/>
         <w:tblBorders>
           <w:top w:val="single" w:color="C0848A" w:sz="4"/>
           <w:left w:val="none"/>
@@ -16944,12 +16944,12 @@
         </w:tblBorders>
       </w:tblPr>
       <w:tblGrid>
-        <w:gridCol w:w="9360"/>
+        <w:gridCol w:w="5184"/>
       </w:tblGrid>
       <w:tr>
         <w:tc>
           <w:tcPr>
-            <w:tcW w:type="dxa" w:w="9360"/>
+            <w:tcW w:type="dxa" w:w="5184"/>
             <w:tcBorders>
               <w:top w:val="none"/>
               <w:left w:val="none"/>
@@ -17393,7 +17393,7 @@
     </w:p>
     <w:tbl>
       <w:tblPr>
-        <w:tblW w:type="dxa" w:w="9360"/>
+        <w:tblW w:type="dxa" w:w="5184"/>
         <w:tblBorders>
           <w:top w:val="single" w:color="C0848A" w:sz="4"/>
           <w:left w:val="none"/>
@@ -17404,12 +17404,12 @@
         </w:tblBorders>
       </w:tblPr>
       <w:tblGrid>
-        <w:gridCol w:w="9360"/>
+        <w:gridCol w:w="5184"/>
       </w:tblGrid>
       <w:tr>
         <w:tc>
           <w:tcPr>
-            <w:tcW w:type="dxa" w:w="9360"/>
+            <w:tcW w:type="dxa" w:w="5184"/>
             <w:tcBorders>
               <w:top w:val="none"/>
               <w:left w:val="none"/>
@@ -17443,7 +17443,7 @@
       <w:tr>
         <w:tc>
           <w:tcPr>
-            <w:tcW w:type="dxa" w:w="9360"/>
+            <w:tcW w:type="dxa" w:w="5184"/>
             <w:tcBorders>
               <w:top w:val="none"/>
               <w:left w:val="none"/>
@@ -17477,7 +17477,7 @@
       <w:tr>
         <w:tc>
           <w:tcPr>
-            <w:tcW w:type="dxa" w:w="9360"/>
+            <w:tcW w:type="dxa" w:w="5184"/>
             <w:tcBorders>
               <w:top w:val="none"/>
               <w:left w:val="none"/>
@@ -17511,7 +17511,7 @@
       <w:tr>
         <w:tc>
           <w:tcPr>
-            <w:tcW w:type="dxa" w:w="9360"/>
+            <w:tcW w:type="dxa" w:w="5184"/>
             <w:tcBorders>
               <w:top w:val="none"/>
               <w:left w:val="none"/>
@@ -17545,7 +17545,7 @@
       <w:tr>
         <w:tc>
           <w:tcPr>
-            <w:tcW w:type="dxa" w:w="9360"/>
+            <w:tcW w:type="dxa" w:w="5184"/>
             <w:tcBorders>
               <w:top w:val="none"/>
               <w:left w:val="none"/>
@@ -17992,7 +17992,7 @@
     </w:p>
     <w:tbl>
       <w:tblPr>
-        <w:tblW w:type="dxa" w:w="9360"/>
+        <w:tblW w:type="dxa" w:w="5184"/>
         <w:tblBorders>
           <w:top w:val="single" w:color="C0848A" w:sz="4"/>
           <w:left w:val="none"/>
@@ -18003,12 +18003,12 @@
         </w:tblBorders>
       </w:tblPr>
       <w:tblGrid>
-        <w:gridCol w:w="9360"/>
+        <w:gridCol w:w="5184"/>
       </w:tblGrid>
       <w:tr>
         <w:tc>
           <w:tcPr>
-            <w:tcW w:type="dxa" w:w="9360"/>
+            <w:tcW w:type="dxa" w:w="5184"/>
             <w:tcBorders>
               <w:top w:val="none"/>
               <w:left w:val="none"/>
@@ -18084,7 +18084,7 @@
     </w:p>
     <w:tbl>
       <w:tblPr>
-        <w:tblW w:type="dxa" w:w="9360"/>
+        <w:tblW w:type="dxa" w:w="5184"/>
         <w:tblBorders>
           <w:top w:val="single" w:color="C0848A" w:sz="4"/>
           <w:left w:val="none"/>
@@ -18095,12 +18095,12 @@
         </w:tblBorders>
       </w:tblPr>
       <w:tblGrid>
-        <w:gridCol w:w="9360"/>
+        <w:gridCol w:w="5184"/>
       </w:tblGrid>
       <w:tr>
         <w:tc>
           <w:tcPr>
-            <w:tcW w:type="dxa" w:w="9360"/>
+            <w:tcW w:type="dxa" w:w="5184"/>
             <w:tcBorders>
               <w:top w:val="none"/>
               <w:left w:val="none"/>
@@ -18524,7 +18524,7 @@
     </w:p>
     <w:tbl>
       <w:tblPr>
-        <w:tblW w:type="dxa" w:w="9360"/>
+        <w:tblW w:type="dxa" w:w="5184"/>
         <w:tblBorders>
           <w:top w:val="single" w:color="C0848A" w:sz="4"/>
           <w:left w:val="none"/>
@@ -18535,12 +18535,12 @@
         </w:tblBorders>
       </w:tblPr>
       <w:tblGrid>
-        <w:gridCol w:w="9360"/>
+        <w:gridCol w:w="5184"/>
       </w:tblGrid>
       <w:tr>
         <w:tc>
           <w:tcPr>
-            <w:tcW w:type="dxa" w:w="9360"/>
+            <w:tcW w:type="dxa" w:w="5184"/>
             <w:tcBorders>
               <w:top w:val="none"/>
               <w:left w:val="none"/>
@@ -18574,7 +18574,7 @@
       <w:tr>
         <w:tc>
           <w:tcPr>
-            <w:tcW w:type="dxa" w:w="9360"/>
+            <w:tcW w:type="dxa" w:w="5184"/>
             <w:tcBorders>
               <w:top w:val="none"/>
               <w:left w:val="none"/>
@@ -18684,7 +18684,7 @@
     </w:p>
     <w:tbl>
       <w:tblPr>
-        <w:tblW w:type="dxa" w:w="9360"/>
+        <w:tblW w:type="dxa" w:w="5184"/>
         <w:tblBorders>
           <w:top w:val="single" w:color="C0848A" w:sz="4"/>
           <w:left w:val="none"/>
@@ -18695,12 +18695,12 @@
         </w:tblBorders>
       </w:tblPr>
       <w:tblGrid>
-        <w:gridCol w:w="9360"/>
+        <w:gridCol w:w="5184"/>
       </w:tblGrid>
       <w:tr>
         <w:tc>
           <w:tcPr>
-            <w:tcW w:type="dxa" w:w="9360"/>
+            <w:tcW w:type="dxa" w:w="5184"/>
             <w:tcBorders>
               <w:top w:val="none"/>
               <w:left w:val="none"/>
@@ -18775,7 +18775,7 @@
     </w:p>
     <w:tbl>
       <w:tblPr>
-        <w:tblW w:type="dxa" w:w="9360"/>
+        <w:tblW w:type="dxa" w:w="5184"/>
         <w:tblBorders>
           <w:top w:val="single" w:color="C0848A" w:sz="4"/>
           <w:left w:val="none"/>
@@ -18786,12 +18786,12 @@
         </w:tblBorders>
       </w:tblPr>
       <w:tblGrid>
-        <w:gridCol w:w="9360"/>
+        <w:gridCol w:w="5184"/>
       </w:tblGrid>
       <w:tr>
         <w:tc>
           <w:tcPr>
-            <w:tcW w:type="dxa" w:w="9360"/>
+            <w:tcW w:type="dxa" w:w="5184"/>
             <w:tcBorders>
               <w:top w:val="none"/>
               <w:left w:val="none"/>
@@ -18825,7 +18825,7 @@
       <w:tr>
         <w:tc>
           <w:tcPr>
-            <w:tcW w:type="dxa" w:w="9360"/>
+            <w:tcW w:type="dxa" w:w="5184"/>
             <w:tcBorders>
               <w:top w:val="none"/>
               <w:left w:val="none"/>
@@ -18859,7 +18859,7 @@
       <w:tr>
         <w:tc>
           <w:tcPr>
-            <w:tcW w:type="dxa" w:w="9360"/>
+            <w:tcW w:type="dxa" w:w="5184"/>
             <w:tcBorders>
               <w:top w:val="none"/>
               <w:left w:val="none"/>
@@ -18893,7 +18893,7 @@
       <w:tr>
         <w:tc>
           <w:tcPr>
-            <w:tcW w:type="dxa" w:w="9360"/>
+            <w:tcW w:type="dxa" w:w="5184"/>
             <w:tcBorders>
               <w:top w:val="none"/>
               <w:left w:val="none"/>
@@ -18927,7 +18927,7 @@
       <w:tr>
         <w:tc>
           <w:tcPr>
-            <w:tcW w:type="dxa" w:w="9360"/>
+            <w:tcW w:type="dxa" w:w="5184"/>
             <w:tcBorders>
               <w:top w:val="none"/>
               <w:left w:val="none"/>
@@ -18961,7 +18961,7 @@
       <w:tr>
         <w:tc>
           <w:tcPr>
-            <w:tcW w:type="dxa" w:w="9360"/>
+            <w:tcW w:type="dxa" w:w="5184"/>
             <w:tcBorders>
               <w:top w:val="none"/>
               <w:left w:val="none"/>
@@ -19273,7 +19273,7 @@
     </w:p>
     <w:tbl>
       <w:tblPr>
-        <w:tblW w:type="dxa" w:w="9360"/>
+        <w:tblW w:type="dxa" w:w="5184"/>
         <w:tblBorders>
           <w:top w:val="single" w:color="C0848A" w:sz="4"/>
           <w:left w:val="none"/>
@@ -19284,12 +19284,12 @@
         </w:tblBorders>
       </w:tblPr>
       <w:tblGrid>
-        <w:gridCol w:w="9360"/>
+        <w:gridCol w:w="5184"/>
       </w:tblGrid>
       <w:tr>
         <w:tc>
           <w:tcPr>
-            <w:tcW w:type="dxa" w:w="9360"/>
+            <w:tcW w:type="dxa" w:w="5184"/>
             <w:tcBorders>
               <w:top w:val="none"/>
               <w:left w:val="none"/>
@@ -19323,7 +19323,7 @@
       <w:tr>
         <w:tc>
           <w:tcPr>
-            <w:tcW w:type="dxa" w:w="9360"/>
+            <w:tcW w:type="dxa" w:w="5184"/>
             <w:tcBorders>
               <w:top w:val="none"/>
               <w:left w:val="none"/>
@@ -19357,7 +19357,7 @@
       <w:tr>
         <w:tc>
           <w:tcPr>
-            <w:tcW w:type="dxa" w:w="9360"/>
+            <w:tcW w:type="dxa" w:w="5184"/>
             <w:tcBorders>
               <w:top w:val="none"/>
               <w:left w:val="none"/>
@@ -19391,7 +19391,7 @@
       <w:tr>
         <w:tc>
           <w:tcPr>
-            <w:tcW w:type="dxa" w:w="9360"/>
+            <w:tcW w:type="dxa" w:w="5184"/>
             <w:tcBorders>
               <w:top w:val="none"/>
               <w:left w:val="none"/>
@@ -19425,7 +19425,7 @@
       <w:tr>
         <w:tc>
           <w:tcPr>
-            <w:tcW w:type="dxa" w:w="9360"/>
+            <w:tcW w:type="dxa" w:w="5184"/>
             <w:tcBorders>
               <w:top w:val="none"/>
               <w:left w:val="none"/>

</xml_diff>

<commit_message>
Checkbox-Selbsttest in Buch 3, 4 und 6 vereinheitlicht
Buch 6: bestehenden Selbsttest mit Kontrollkaestchen (leer) versehen.
Buch 3: bestehenden Selbsttest auf Kontrollkaestchen umgestellt, dabei
die fehlende rechtliche Einordnung ("kein Test im medizinischen Sinn")
ergaenzt - die fehlte komplett, echte Luecke nach rechtssicherheit.md.
Buch 4: kompletten neuen Selbsttest gebaut (12 Aussagen in drei Gruppen,
Auswertung mit Kapitelverweisen, rechtliche Einordnung), da vorher gar
keiner vorhanden war. Vor der bereits bestehenden Notfall-Seite platziert.

Buch 6 PDF/eBook neu gebaut, Seitenzahl unveraendert (111), kein
Cover-Rebuild noetig.
</commit_message>
<xml_diff>
--- a/outputs/buch-beziehungen/wenn-beziehungen-erschoepfen-Taschenbuch.docx
+++ b/outputs/buch-beziehungen/wenn-beziehungen-erschoepfen-Taschenbuch.docx
@@ -2849,194 +2849,194 @@
           <w:sz w:val="220"/>
           <w:szCs w:val="220"/>
         </w:rPr>
-        <w:t xml:space="preserve">Ich habe Schwierigkeiten, um Hilfe zu bitten.</w:t>
-      </w:r>
-    </w:p>
-    <w:p>
-      <w:pPr>
-        <w:spacing w:after="120" w:before="0"/>
-        <w:jc w:val="both"/>
-      </w:pPr>
-      <w:r>
-        <w:rPr>
-          <w:rFonts w:ascii="Georgia" w:cs="Georgia" w:eastAsia="Georgia" w:hAnsi="Georgia"/>
-          <w:b w:val="false"/>
-          <w:bCs w:val="false"/>
-          <w:color w:val="2C2C2C"/>
-          <w:sz w:val="220"/>
-          <w:szCs w:val="220"/>
-        </w:rPr>
-        <w:t xml:space="preserve">Ich entschuldige mich oft, auch für Dinge, die nicht meine Schuld sind.</w:t>
-      </w:r>
-    </w:p>
-    <w:p>
-      <w:pPr>
-        <w:spacing w:after="120" w:before="0"/>
-        <w:jc w:val="both"/>
-      </w:pPr>
-      <w:r>
-        <w:rPr>
-          <w:rFonts w:ascii="Georgia" w:cs="Georgia" w:eastAsia="Georgia" w:hAnsi="Georgia"/>
-          <w:b w:val="false"/>
-          <w:bCs w:val="false"/>
-          <w:color w:val="2C2C2C"/>
-          <w:sz w:val="220"/>
-          <w:szCs w:val="220"/>
-        </w:rPr>
-        <w:t xml:space="preserve">Wenn jemand auf mich böse ist, überlege ich sofort, was ich falsch gemacht habe.</w:t>
-      </w:r>
-    </w:p>
-    <w:p>
-      <w:pPr>
-        <w:spacing w:after="120" w:before="0"/>
-        <w:jc w:val="both"/>
-      </w:pPr>
-      <w:r>
-        <w:rPr>
-          <w:rFonts w:ascii="Georgia" w:cs="Georgia" w:eastAsia="Georgia" w:hAnsi="Georgia"/>
-          <w:b w:val="false"/>
-          <w:bCs w:val="false"/>
-          <w:color w:val="2C2C2C"/>
-          <w:sz w:val="220"/>
-          <w:szCs w:val="220"/>
-        </w:rPr>
-        <w:t xml:space="preserve">Ich sage häufig Ja, obwohl ich Nein meine.</w:t>
-      </w:r>
-    </w:p>
-    <w:p>
-      <w:pPr>
-        <w:spacing w:after="120" w:before="0"/>
-        <w:jc w:val="both"/>
-      </w:pPr>
-      <w:r>
-        <w:rPr>
-          <w:rFonts w:ascii="Georgia" w:cs="Georgia" w:eastAsia="Georgia" w:hAnsi="Georgia"/>
-          <w:b w:val="false"/>
-          <w:bCs w:val="false"/>
-          <w:color w:val="2C2C2C"/>
-          <w:sz w:val="220"/>
-          <w:szCs w:val="220"/>
-        </w:rPr>
-        <w:t xml:space="preserve">Meine Stimmung hängt stark davon ab, wie andere auf mich reagieren.</w:t>
-      </w:r>
-    </w:p>
-    <w:p>
-      <w:pPr>
-        <w:spacing w:after="120" w:before="0"/>
-        <w:jc w:val="both"/>
-      </w:pPr>
-      <w:r>
-        <w:rPr>
-          <w:rFonts w:ascii="Georgia" w:cs="Georgia" w:eastAsia="Georgia" w:hAnsi="Georgia"/>
-          <w:b w:val="false"/>
-          <w:bCs w:val="false"/>
-          <w:color w:val="2C2C2C"/>
-          <w:sz w:val="220"/>
-          <w:szCs w:val="220"/>
-        </w:rPr>
-        <w:t xml:space="preserve">Ich vermeide Konflikte, auch wenn sie notwendig wären.</w:t>
-      </w:r>
-    </w:p>
-    <w:p>
-      <w:pPr>
-        <w:spacing w:after="120" w:before="0"/>
-        <w:jc w:val="both"/>
-      </w:pPr>
-      <w:r>
-        <w:rPr>
-          <w:rFonts w:ascii="Georgia" w:cs="Georgia" w:eastAsia="Georgia" w:hAnsi="Georgia"/>
-          <w:b w:val="false"/>
-          <w:bCs w:val="false"/>
-          <w:color w:val="2C2C2C"/>
-          <w:sz w:val="220"/>
-          <w:szCs w:val="220"/>
-        </w:rPr>
-        <w:t xml:space="preserve">Ich fühle mich schuldig, wenn ich Zeit nur für mich nehme.</w:t>
-      </w:r>
-    </w:p>
-    <w:p>
-      <w:pPr>
-        <w:spacing w:after="120" w:before="0"/>
-        <w:jc w:val="both"/>
-      </w:pPr>
-      <w:r>
-        <w:rPr>
-          <w:rFonts w:ascii="Georgia" w:cs="Georgia" w:eastAsia="Georgia" w:hAnsi="Georgia"/>
-          <w:b w:val="false"/>
-          <w:bCs w:val="false"/>
-          <w:color w:val="2C2C2C"/>
-          <w:sz w:val="220"/>
-          <w:szCs w:val="220"/>
-        </w:rPr>
-        <w:t xml:space="preserve">Mir fällt es schwer zu glauben, dass ich gemocht werde, einfach so, ohne etwas dafür zu tun.</w:t>
-      </w:r>
-    </w:p>
-    <w:p>
-      <w:pPr>
-        <w:spacing w:after="120" w:before="0"/>
-        <w:jc w:val="both"/>
-      </w:pPr>
-      <w:r>
-        <w:rPr>
-          <w:rFonts w:ascii="Georgia" w:cs="Georgia" w:eastAsia="Georgia" w:hAnsi="Georgia"/>
-          <w:b w:val="false"/>
-          <w:bCs w:val="false"/>
-          <w:color w:val="2C2C2C"/>
-          <w:sz w:val="220"/>
-          <w:szCs w:val="220"/>
-        </w:rPr>
-        <w:t xml:space="preserve">Ich weiss oft nicht, was ich selbst eigentlich will.</w:t>
-      </w:r>
-    </w:p>
-    <w:p>
-      <w:pPr>
-        <w:spacing w:after="120" w:before="0"/>
-        <w:jc w:val="both"/>
-      </w:pPr>
-      <w:r>
-        <w:rPr>
-          <w:rFonts w:ascii="Georgia" w:cs="Georgia" w:eastAsia="Georgia" w:hAnsi="Georgia"/>
-          <w:b w:val="false"/>
-          <w:bCs w:val="false"/>
-          <w:color w:val="2C2C2C"/>
-          <w:sz w:val="220"/>
-          <w:szCs w:val="220"/>
-        </w:rPr>
-        <w:t xml:space="preserve">Ich erschöpfe mich lieber als jemanden zu enttäuschen.</w:t>
-      </w:r>
-    </w:p>
-    <w:p>
-      <w:pPr>
-        <w:spacing w:after="120" w:before="0"/>
-        <w:jc w:val="both"/>
-      </w:pPr>
-      <w:r>
-        <w:rPr>
-          <w:rFonts w:ascii="Georgia" w:cs="Georgia" w:eastAsia="Georgia" w:hAnsi="Georgia"/>
-          <w:b w:val="false"/>
-          <w:bCs w:val="false"/>
-          <w:color w:val="2C2C2C"/>
-          <w:sz w:val="220"/>
-          <w:szCs w:val="220"/>
-        </w:rPr>
-        <w:t xml:space="preserve">Wenn jemand traurig ist, fühle ich mich verantwortlich, das zu ändern.</w:t>
-      </w:r>
-    </w:p>
-    <w:p>
-      <w:pPr>
-        <w:spacing w:after="120" w:before="0"/>
-        <w:jc w:val="both"/>
-      </w:pPr>
-      <w:r>
-        <w:rPr>
-          <w:rFonts w:ascii="Georgia" w:cs="Georgia" w:eastAsia="Georgia" w:hAnsi="Georgia"/>
-          <w:b w:val="false"/>
-          <w:bCs w:val="false"/>
-          <w:color w:val="2C2C2C"/>
-          <w:sz w:val="220"/>
-          <w:szCs w:val="220"/>
-        </w:rPr>
-        <w:t xml:space="preserve">Ich mache mir mehr Sorgen um die Bedürfnisse anderer als um meine eigenen.</w:t>
+        <w:t>☐  Ich habe Schwierigkeiten, um Hilfe zu bitten.</w:t>
+      </w:r>
+    </w:p>
+    <w:p>
+      <w:pPr>
+        <w:spacing w:after="120" w:before="0"/>
+        <w:jc w:val="both"/>
+      </w:pPr>
+      <w:r>
+        <w:rPr>
+          <w:rFonts w:ascii="Georgia" w:cs="Georgia" w:eastAsia="Georgia" w:hAnsi="Georgia"/>
+          <w:b w:val="false"/>
+          <w:bCs w:val="false"/>
+          <w:color w:val="2C2C2C"/>
+          <w:sz w:val="220"/>
+          <w:szCs w:val="220"/>
+        </w:rPr>
+        <w:t>☐  Ich entschuldige mich oft, auch für Dinge, die nicht meine Schuld sind.</w:t>
+      </w:r>
+    </w:p>
+    <w:p>
+      <w:pPr>
+        <w:spacing w:after="120" w:before="0"/>
+        <w:jc w:val="both"/>
+      </w:pPr>
+      <w:r>
+        <w:rPr>
+          <w:rFonts w:ascii="Georgia" w:cs="Georgia" w:eastAsia="Georgia" w:hAnsi="Georgia"/>
+          <w:b w:val="false"/>
+          <w:bCs w:val="false"/>
+          <w:color w:val="2C2C2C"/>
+          <w:sz w:val="220"/>
+          <w:szCs w:val="220"/>
+        </w:rPr>
+        <w:t>☐  Wenn jemand auf mich böse ist, überlege ich sofort, was ich falsch gemacht habe.</w:t>
+      </w:r>
+    </w:p>
+    <w:p>
+      <w:pPr>
+        <w:spacing w:after="120" w:before="0"/>
+        <w:jc w:val="both"/>
+      </w:pPr>
+      <w:r>
+        <w:rPr>
+          <w:rFonts w:ascii="Georgia" w:cs="Georgia" w:eastAsia="Georgia" w:hAnsi="Georgia"/>
+          <w:b w:val="false"/>
+          <w:bCs w:val="false"/>
+          <w:color w:val="2C2C2C"/>
+          <w:sz w:val="220"/>
+          <w:szCs w:val="220"/>
+        </w:rPr>
+        <w:t>☐  Ich sage häufig Ja, obwohl ich Nein meine.</w:t>
+      </w:r>
+    </w:p>
+    <w:p>
+      <w:pPr>
+        <w:spacing w:after="120" w:before="0"/>
+        <w:jc w:val="both"/>
+      </w:pPr>
+      <w:r>
+        <w:rPr>
+          <w:rFonts w:ascii="Georgia" w:cs="Georgia" w:eastAsia="Georgia" w:hAnsi="Georgia"/>
+          <w:b w:val="false"/>
+          <w:bCs w:val="false"/>
+          <w:color w:val="2C2C2C"/>
+          <w:sz w:val="220"/>
+          <w:szCs w:val="220"/>
+        </w:rPr>
+        <w:t>☐  Meine Stimmung hängt stark davon ab, wie andere auf mich reagieren.</w:t>
+      </w:r>
+    </w:p>
+    <w:p>
+      <w:pPr>
+        <w:spacing w:after="120" w:before="0"/>
+        <w:jc w:val="both"/>
+      </w:pPr>
+      <w:r>
+        <w:rPr>
+          <w:rFonts w:ascii="Georgia" w:cs="Georgia" w:eastAsia="Georgia" w:hAnsi="Georgia"/>
+          <w:b w:val="false"/>
+          <w:bCs w:val="false"/>
+          <w:color w:val="2C2C2C"/>
+          <w:sz w:val="220"/>
+          <w:szCs w:val="220"/>
+        </w:rPr>
+        <w:t>☐  Ich vermeide Konflikte, auch wenn sie notwendig wären.</w:t>
+      </w:r>
+    </w:p>
+    <w:p>
+      <w:pPr>
+        <w:spacing w:after="120" w:before="0"/>
+        <w:jc w:val="both"/>
+      </w:pPr>
+      <w:r>
+        <w:rPr>
+          <w:rFonts w:ascii="Georgia" w:cs="Georgia" w:eastAsia="Georgia" w:hAnsi="Georgia"/>
+          <w:b w:val="false"/>
+          <w:bCs w:val="false"/>
+          <w:color w:val="2C2C2C"/>
+          <w:sz w:val="220"/>
+          <w:szCs w:val="220"/>
+        </w:rPr>
+        <w:t>☐  Ich fühle mich schuldig, wenn ich Zeit nur für mich nehme.</w:t>
+      </w:r>
+    </w:p>
+    <w:p>
+      <w:pPr>
+        <w:spacing w:after="120" w:before="0"/>
+        <w:jc w:val="both"/>
+      </w:pPr>
+      <w:r>
+        <w:rPr>
+          <w:rFonts w:ascii="Georgia" w:cs="Georgia" w:eastAsia="Georgia" w:hAnsi="Georgia"/>
+          <w:b w:val="false"/>
+          <w:bCs w:val="false"/>
+          <w:color w:val="2C2C2C"/>
+          <w:sz w:val="220"/>
+          <w:szCs w:val="220"/>
+        </w:rPr>
+        <w:t>☐  Mir fällt es schwer zu glauben, dass ich gemocht werde, einfach so, ohne etwas dafür zu tun.</w:t>
+      </w:r>
+    </w:p>
+    <w:p>
+      <w:pPr>
+        <w:spacing w:after="120" w:before="0"/>
+        <w:jc w:val="both"/>
+      </w:pPr>
+      <w:r>
+        <w:rPr>
+          <w:rFonts w:ascii="Georgia" w:cs="Georgia" w:eastAsia="Georgia" w:hAnsi="Georgia"/>
+          <w:b w:val="false"/>
+          <w:bCs w:val="false"/>
+          <w:color w:val="2C2C2C"/>
+          <w:sz w:val="220"/>
+          <w:szCs w:val="220"/>
+        </w:rPr>
+        <w:t>☐  Ich weiss oft nicht, was ich selbst eigentlich will.</w:t>
+      </w:r>
+    </w:p>
+    <w:p>
+      <w:pPr>
+        <w:spacing w:after="120" w:before="0"/>
+        <w:jc w:val="both"/>
+      </w:pPr>
+      <w:r>
+        <w:rPr>
+          <w:rFonts w:ascii="Georgia" w:cs="Georgia" w:eastAsia="Georgia" w:hAnsi="Georgia"/>
+          <w:b w:val="false"/>
+          <w:bCs w:val="false"/>
+          <w:color w:val="2C2C2C"/>
+          <w:sz w:val="220"/>
+          <w:szCs w:val="220"/>
+        </w:rPr>
+        <w:t>☐  Ich erschöpfe mich lieber als jemanden zu enttäuschen.</w:t>
+      </w:r>
+    </w:p>
+    <w:p>
+      <w:pPr>
+        <w:spacing w:after="120" w:before="0"/>
+        <w:jc w:val="both"/>
+      </w:pPr>
+      <w:r>
+        <w:rPr>
+          <w:rFonts w:ascii="Georgia" w:cs="Georgia" w:eastAsia="Georgia" w:hAnsi="Georgia"/>
+          <w:b w:val="false"/>
+          <w:bCs w:val="false"/>
+          <w:color w:val="2C2C2C"/>
+          <w:sz w:val="220"/>
+          <w:szCs w:val="220"/>
+        </w:rPr>
+        <w:t>☐  Wenn jemand traurig ist, fühle ich mich verantwortlich, das zu ändern.</w:t>
+      </w:r>
+    </w:p>
+    <w:p>
+      <w:pPr>
+        <w:spacing w:after="120" w:before="0"/>
+        <w:jc w:val="both"/>
+      </w:pPr>
+      <w:r>
+        <w:rPr>
+          <w:rFonts w:ascii="Georgia" w:cs="Georgia" w:eastAsia="Georgia" w:hAnsi="Georgia"/>
+          <w:b w:val="false"/>
+          <w:bCs w:val="false"/>
+          <w:color w:val="2C2C2C"/>
+          <w:sz w:val="220"/>
+          <w:szCs w:val="220"/>
+        </w:rPr>
+        <w:t>☐  Ich mache mir mehr Sorgen um die Bedürfnisse anderer als um meine eigenen.</w:t>
       </w:r>
     </w:p>
     <w:p>
@@ -3056,6 +3056,26 @@
         <w:t xml:space="preserve">Wenn du bei sechs oder mehr Sätzen genickt hast: Du bist genau richtig hier. Und du bist nicht allein damit.</w:t>
       </w:r>
     </w:p>
+    <w:p/>
+    <w:p>
+      <w:r>
+        <w:rPr>
+          <w:rFonts w:ascii="Georgia" w:hAnsi="Georgia"/>
+          <w:sz w:val="220"/>
+        </w:rPr>
+        <w:t>Ein Hinweis dazu: Das hier ist kein Test im medizinischen Sinn und keine Diagnose, sondern eine Standortbestimmung.</w:t>
+      </w:r>
+    </w:p>
+    <w:p>
+      <w:r>
+        <w:rPr>
+          <w:rFonts w:ascii="Georgia" w:hAnsi="Georgia"/>
+          <w:sz w:val="220"/>
+        </w:rPr>
+        <w:t>Diese Muster können auch andere Ursachen haben. Wenn sie dich seit Wochen stark einschränken oder du dich dauerhaft niedergeschlagen fühlst, lass das bitte ärztlich oder psychotherapeutisch abklären.</w:t>
+      </w:r>
+    </w:p>
+    <w:p/>
     <w:p>
       <w:pPr>
         <w:spacing w:after="120" w:before="0"/>

</xml_diff>

<commit_message>
Buch 3: Selbstbezeichnung Therapeutin entfernt, Krisennummern und vollständigen Pflichtteil ergänzt
</commit_message>
<xml_diff>
--- a/outputs/buch-beziehungen/wenn-beziehungen-erschoepfen-Taschenbuch.docx
+++ b/outputs/buch-beziehungen/wenn-beziehungen-erschoepfen-Taschenbuch.docx
@@ -842,7 +842,7 @@
           <w:sz w:val="220"/>
           <w:szCs w:val="220"/>
         </w:rPr>
-        <w:t xml:space="preserve">Ich bin seit vielen Jahren als Therapeutin tätig. Ich arbeite mit Frauen, die an einem Punkt angelangt sind, wo das Funktionieren nicht mehr funktioniert. Wo der Körper Nein sagt, auch wenn der Kopf weitermachen will. Wo Beziehungen, die man liebt, sich anfühlen wie Schulden, die man nie abbezahlen kann.</w:t>
+        <w:t>Ich bin seit vielen Jahren als Coachin tätig. Ich arbeite mit Frauen, die an einem Punkt angelangt sind, wo das Funktionieren nicht mehr funktioniert. Wo der Körper Nein sagt, auch wenn der Kopf weitermachen will. Wo Beziehungen, die man liebt, sich anfühlen wie Schulden, die man nie abbezahlen kann.</w:t>
       </w:r>
     </w:p>
     <w:p>
@@ -893,7 +893,7 @@
           <w:sz w:val="220"/>
           <w:szCs w:val="220"/>
         </w:rPr>
-        <w:t xml:space="preserve">Lange Zeit habe ich gedacht, dass meine Rolle als Therapeutin darin besteht, Werkzeuge zu geben. Techniken. Strategien. Die richtige Methode, die das Problem löst. Und das stimmt, teilweise. Werkzeuge helfen.</w:t>
+        <w:t>Lange Zeit habe ich gedacht, dass meine Rolle als Coachin darin besteht, Werkzeuge zu geben. Techniken. Strategien. Die richtige Methode, die das Problem löst. Und das stimmt, teilweise. Werkzeuge helfen.</w:t>
       </w:r>
     </w:p>
     <w:p>
@@ -961,7 +961,7 @@
           <w:sz w:val="220"/>
           <w:szCs w:val="220"/>
         </w:rPr>
-        <w:t xml:space="preserve">Nicht als Therapeutin, die Ratschläge erteilt. Sondern als Frau, die täglich mit anderen Frauen arbeitet und versteht, wie tief dieses Muster sitzt. Wie viel es kostet. Und was möglich wird, wenn man anfängt, es zu verändern.</w:t>
+        <w:t>Nicht als Coachin, die Ratschläge erteilt. Sondern als Frau, die täglich mit anderen Frauen arbeitet und versteht, wie tief dieses Muster sitzt. Wie viel es kostet. Und was möglich wird, wenn man anfängt, es zu verändern.</w:t>
       </w:r>
     </w:p>
     <w:p>
@@ -3270,6 +3270,69 @@
         </w:tc>
       </w:tr>
     </w:tbl>
+    <w:p>
+      <w:r>
+        <w:rPr>
+          <w:rFonts w:ascii="Georgia" w:hAnsi="Georgia"/>
+          <w:b w:val="0"/>
+          <w:i w:val="0"/>
+          <w:sz w:val="34"/>
+        </w:rPr>
+        <w:t>Und wenn es mehr ist als ein schlechter Tag</w:t>
+      </w:r>
+    </w:p>
+    <w:p>
+      <w:r>
+        <w:rPr>
+          <w:rFonts w:ascii="Georgia" w:hAnsi="Georgia"/>
+          <w:b w:val="0"/>
+          <w:i w:val="0"/>
+          <w:sz w:val="22"/>
+        </w:rPr>
+        <w:t>Wenn du seit Wochen nicht mehr herauskommst. Wenn du nachts wach liegst und denkst, dass es ohne dich leichter wäre.</w:t>
+      </w:r>
+    </w:p>
+    <w:p>
+      <w:r>
+        <w:rPr>
+          <w:rFonts w:ascii="Georgia" w:hAnsi="Georgia"/>
+          <w:b w:val="0"/>
+          <w:i w:val="0"/>
+          <w:sz w:val="22"/>
+        </w:rPr>
+        <w:t>Dann ist dieses Buch nicht genug. Das ist keine Schwäche, das ist einfach so.</w:t>
+      </w:r>
+    </w:p>
+    <w:p>
+      <w:r>
+        <w:rPr>
+          <w:rFonts w:ascii="Georgia" w:hAnsi="Georgia"/>
+          <w:b w:val="0"/>
+          <w:i w:val="0"/>
+          <w:sz w:val="22"/>
+        </w:rPr>
+        <w:t>Ruf an. Kostenlos, anonym, Tag und Nacht besetzt.</w:t>
+      </w:r>
+    </w:p>
+    <w:p>
+      <w:r>
+        <w:rPr>
+          <w:rFonts w:ascii="Georgia" w:hAnsi="Georgia"/>
+          <w:b w:val="0"/>
+          <w:i w:val="0"/>
+          <w:sz w:val="22"/>
+        </w:rPr>
+        <w:t>Schweiz 143 · Deutschland 0800 111 0 111 · Österreich 142</w:t>
+      </w:r>
+    </w:p>
+    <w:p>
+      <w:pPr>
+        <w:spacing w:after="0" w:before="200"/>
+      </w:pPr>
+      <w:r>
+        <w:t xml:space="preserve"/>
+      </w:r>
+    </w:p>
     <w:p>
       <w:pPr>
         <w:pageBreakBefore/>
@@ -19817,18 +19880,17 @@
           <w:sz w:val="220"/>
           <w:szCs w:val="220"/>
         </w:rPr>
-        <w:t xml:space="preserve">Petra Tanner</w:t>
-      </w:r>
-      <w:r>
-        <w:rPr>
-          <w:rFonts w:ascii="Georgia" w:cs="Georgia" w:eastAsia="Georgia" w:hAnsi="Georgia"/>
-          <w:b w:val="false"/>
-          <w:bCs w:val="false"/>
-          <w:color w:val="2C2C2C"/>
-          <w:sz w:val="220"/>
-          <w:szCs w:val="220"/>
-        </w:rPr>
-        <w:t xml:space="preserve"> ist Therapeutin und Coachin mit dem Schwerpunkt auf Beziehungserschöpfung, People-Pleasing und Grenzsetzung bei Frauen.</w:t>
+        <w:t>Petra Tanner ist Coachin mit dem Schwerpunkt auf Beziehungserschöpfung, People-Pleasing und Grenzsetzung.</w:t>
+      </w:r>
+      <w:r>
+        <w:rPr>
+          <w:rFonts w:ascii="Georgia" w:cs="Georgia" w:eastAsia="Georgia" w:hAnsi="Georgia"/>
+          <w:b w:val="false"/>
+          <w:bCs w:val="false"/>
+          <w:color w:val="2C2C2C"/>
+          <w:sz w:val="220"/>
+          <w:szCs w:val="220"/>
+        </w:rPr>
       </w:r>
     </w:p>
     <w:p>
@@ -19862,7 +19924,7 @@
           <w:sz w:val="220"/>
           <w:szCs w:val="220"/>
         </w:rPr>
-        <w:t xml:space="preserve">Neben ihrer therapeutischen Praxis bietet sie unter dem Namen </w:t>
+        <w:t>Neben ihrer Coaching-Praxis bietet sie unter dem Namen Safe to Thrive Einzel-Coachings und Gruppenangebote für Frauen an, die tiefer arbeiten möchten.</w:t>
       </w:r>
       <w:r>
         <w:rPr>
@@ -19873,18 +19935,16 @@
           <w:sz w:val="220"/>
           <w:szCs w:val="220"/>
         </w:rPr>
-        <w:t xml:space="preserve">Safe to Thrive</w:t>
-      </w:r>
-      <w:r>
-        <w:rPr>
-          <w:rFonts w:ascii="Georgia" w:cs="Georgia" w:eastAsia="Georgia" w:hAnsi="Georgia"/>
-          <w:b w:val="false"/>
-          <w:bCs w:val="false"/>
-          <w:color w:val="2C2C2C"/>
-          <w:sz w:val="220"/>
-          <w:szCs w:val="220"/>
-        </w:rPr>
-        <w:t xml:space="preserve"> Einzel-Coachings und Gruppenangebote für Frauen an, die bereit sind, ihr Leben in die eigenen Hände zu nehmen.</w:t>
+      </w:r>
+      <w:r>
+        <w:rPr>
+          <w:rFonts w:ascii="Georgia" w:cs="Georgia" w:eastAsia="Georgia" w:hAnsi="Georgia"/>
+          <w:b w:val="false"/>
+          <w:bCs w:val="false"/>
+          <w:color w:val="2C2C2C"/>
+          <w:sz w:val="220"/>
+          <w:szCs w:val="220"/>
+        </w:rPr>
       </w:r>
     </w:p>
     <w:p>
@@ -20403,207 +20463,343 @@
       </w:r>
     </w:p>
     <w:p>
-      <w:pPr>
-        <w:pageBreakBefore/>
-        <w:spacing w:after="280" w:before="720"/>
-        <w:jc w:val="left"/>
-      </w:pPr>
-      <w:r>
-        <w:rPr>
-          <w:rFonts w:ascii="Georgia" w:cs="Georgia" w:eastAsia="Georgia" w:hAnsi="Georgia"/>
-          <w:b w:val="false"/>
-          <w:bCs w:val="false"/>
-          <w:color w:val="C0848A"/>
-          <w:sz w:val="340"/>
-          <w:szCs w:val="340"/>
-        </w:rPr>
-        <w:t xml:space="preserve">Impressum</w:t>
-      </w:r>
-    </w:p>
-    <w:p>
-      <w:pPr>
-        <w:spacing w:after="120" w:before="0"/>
-        <w:jc w:val="both"/>
-      </w:pPr>
-      <w:r>
-        <w:rPr>
-          <w:rFonts w:ascii="Georgia" w:cs="Georgia" w:eastAsia="Georgia" w:hAnsi="Georgia"/>
-          <w:b w:val="false"/>
-          <w:bCs w:val="false"/>
-          <w:color w:val="2C2C2C"/>
-          <w:sz w:val="220"/>
-          <w:szCs w:val="220"/>
-        </w:rPr>
-        <w:t xml:space="preserve">*Wenn Beziehungen erschöpfen*</w:t>
-      </w:r>
-    </w:p>
-    <w:p>
-      <w:pPr>
-        <w:spacing w:after="120" w:before="0"/>
-        <w:jc w:val="both"/>
-      </w:pPr>
-      <w:r>
-        <w:rPr>
-          <w:rFonts w:ascii="Georgia" w:cs="Georgia" w:eastAsia="Georgia" w:hAnsi="Georgia"/>
-          <w:b w:val="false"/>
-          <w:bCs w:val="false"/>
-          <w:color w:val="2C2C2C"/>
-          <w:sz w:val="220"/>
-          <w:szCs w:val="220"/>
-        </w:rPr>
-        <w:t xml:space="preserve">Warum du gibst, bis nichts mehr von dir übrig ist — und wie du dich zurückholst</w:t>
-      </w:r>
-    </w:p>
-    <w:p>
-      <w:pPr>
-        <w:spacing w:after="120" w:before="0"/>
-        <w:jc w:val="both"/>
-      </w:pPr>
-      <w:r>
-        <w:rPr>
-          <w:rFonts w:ascii="Georgia" w:cs="Georgia" w:eastAsia="Georgia" w:hAnsi="Georgia"/>
-          <w:b w:val="false"/>
-          <w:bCs w:val="false"/>
-          <w:color w:val="2C2C2C"/>
-          <w:sz w:val="220"/>
-          <w:szCs w:val="220"/>
-        </w:rPr>
-        <w:t xml:space="preserve">Autorin: Petra Tanner</w:t>
-      </w:r>
-    </w:p>
-    <w:p>
-      <w:pPr>
-        <w:spacing w:after="120" w:before="0"/>
-        <w:jc w:val="both"/>
-      </w:pPr>
-      <w:r>
-        <w:rPr>
-          <w:rFonts w:ascii="Georgia" w:cs="Georgia" w:eastAsia="Georgia" w:hAnsi="Georgia"/>
-          <w:b w:val="false"/>
-          <w:bCs w:val="false"/>
-          <w:color w:val="2C2C2C"/>
-          <w:sz w:val="220"/>
-          <w:szCs w:val="220"/>
-        </w:rPr>
-        <w:t xml:space="preserve">© 2026 Petra Tanner / Safe to Thrive</w:t>
-      </w:r>
-    </w:p>
-    <w:p>
-      <w:pPr>
-        <w:spacing w:after="120" w:before="0"/>
-        <w:jc w:val="both"/>
-      </w:pPr>
-      <w:r>
-        <w:rPr>
-          <w:rFonts w:ascii="Georgia" w:cs="Georgia" w:eastAsia="Georgia" w:hAnsi="Georgia"/>
-          <w:b w:val="false"/>
-          <w:bCs w:val="false"/>
-          <w:color w:val="2C2C2C"/>
-          <w:sz w:val="220"/>
-          <w:szCs w:val="220"/>
-        </w:rPr>
-        <w:t xml:space="preserve">Schweiz</w:t>
-      </w:r>
-    </w:p>
-    <w:p>
-      <w:pPr>
-        <w:spacing w:after="120" w:before="0"/>
-        <w:jc w:val="both"/>
-      </w:pPr>
-      <w:r>
-        <w:rPr>
-          <w:rFonts w:ascii="Georgia" w:cs="Georgia" w:eastAsia="Georgia" w:hAnsi="Georgia"/>
-          <w:b w:val="false"/>
-          <w:bCs w:val="false"/>
-          <w:color w:val="2C2C2C"/>
-          <w:sz w:val="220"/>
-          <w:szCs w:val="220"/>
-        </w:rPr>
-        <w:t xml:space="preserve">Alle Rechte vorbehalten. Das Werk einschliesslich aller seiner Teile ist urheberrechtlich geschützt. Jede Verwertung ausserhalb der engen Grenzen des Urheberrechtsgesetzes — insbesondere Vervielfältigung, Übersetzung, Mikroverfilmung sowie Einspeicherung und Verarbeitung in elektronischen Systemen — ist ohne ausdrückliche schriftliche Zustimmung der Autorin unzulässig.</w:t>
-      </w:r>
-    </w:p>
-    <w:p>
-      <w:pPr>
-        <w:spacing w:after="120" w:before="0"/>
-        <w:jc w:val="both"/>
-      </w:pPr>
-      <w:r>
-        <w:rPr>
-          <w:rFonts w:ascii="Georgia" w:cs="Georgia" w:eastAsia="Georgia" w:hAnsi="Georgia"/>
-          <w:b/>
-          <w:bCs/>
-          <w:color w:val="2C2C2C"/>
-          <w:sz w:val="220"/>
-          <w:szCs w:val="220"/>
-        </w:rPr>
-        <w:t xml:space="preserve">Haftungsausschluss:</w:t>
-      </w:r>
-      <w:r>
-        <w:rPr>
-          <w:rFonts w:ascii="Georgia" w:cs="Georgia" w:eastAsia="Georgia" w:hAnsi="Georgia"/>
-          <w:b w:val="false"/>
-          <w:bCs w:val="false"/>
-          <w:color w:val="2C2C2C"/>
-          <w:sz w:val="220"/>
-          <w:szCs w:val="220"/>
-        </w:rPr>
-        <w:t xml:space="preserve"> Die in diesem Buch enthaltenen Inhalte dienen ausschliesslich zu Informations- und Bildungszwecken. Sie ersetzen in keinem Fall professionelle therapeutische, psychologische oder medizinische Beratung, Diagnose oder Behandlung. Die Autorin übernimmt keine Haftung für Schäden, die direkt oder indirekt aus der Anwendung der in diesem Buch beschriebenen Inhalte entstehen. Bei ernsthaften psychischen Belastungen, Krisen oder Verdacht auf psychische Erkrankungen wird ausdrücklich empfohlen, qualifizierte professionelle Unterstützung zu suchen.</w:t>
-      </w:r>
-    </w:p>
-    <w:p>
-      <w:pPr>
-        <w:spacing w:after="120" w:before="0"/>
-        <w:jc w:val="both"/>
-      </w:pPr>
-      <w:r>
-        <w:rPr>
-          <w:rFonts w:ascii="Georgia" w:cs="Georgia" w:eastAsia="Georgia" w:hAnsi="Georgia"/>
-          <w:b/>
-          <w:bCs/>
-          <w:color w:val="2C2C2C"/>
-          <w:sz w:val="220"/>
-          <w:szCs w:val="220"/>
-        </w:rPr>
-        <w:t xml:space="preserve">Fallbeispiele:</w:t>
-      </w:r>
-      <w:r>
-        <w:rPr>
-          <w:rFonts w:ascii="Georgia" w:cs="Georgia" w:eastAsia="Georgia" w:hAnsi="Georgia"/>
-          <w:b w:val="false"/>
-          <w:bCs w:val="false"/>
-          <w:color w:val="2C2C2C"/>
-          <w:sz w:val="220"/>
-          <w:szCs w:val="220"/>
-        </w:rPr>
-        <w:t xml:space="preserve"> Alle im Buch erwähnten Personen und Fallbeispiele sind anonymisiert oder als zusammengesetzte Composite-Fälle aus mehreren Situationen dargestellt. Sie dienen der Veranschaulichung und entsprechen keiner einzelnen realen Person. Ähnlichkeiten mit lebenden oder verstorbenen Personen sind rein zufällig und unbeabsichtigt.</w:t>
-      </w:r>
-    </w:p>
-    <w:p>
-      <w:pPr>
-        <w:spacing w:after="120" w:before="0"/>
-        <w:jc w:val="both"/>
-      </w:pPr>
-      <w:r>
-        <w:rPr>
-          <w:rFonts w:ascii="Georgia" w:cs="Georgia" w:eastAsia="Georgia" w:hAnsi="Georgia"/>
-          <w:b/>
-          <w:bCs/>
-          <w:color w:val="2C2C2C"/>
-          <w:sz w:val="220"/>
-          <w:szCs w:val="220"/>
-        </w:rPr>
-        <w:t xml:space="preserve">Kontakt:</w:t>
-      </w:r>
-      <w:r>
-        <w:rPr>
-          <w:rFonts w:ascii="Georgia" w:cs="Georgia" w:eastAsia="Georgia" w:hAnsi="Georgia"/>
-          <w:b w:val="false"/>
-          <w:bCs w:val="false"/>
-          <w:color w:val="2C2C2C"/>
-          <w:sz w:val="220"/>
-          <w:szCs w:val="220"/>
-        </w:rPr>
-        <w:t xml:space="preserve"> info.safetothrive@gmail.com</w:t>
+      <w:r>
+        <w:rPr>
+          <w:rFonts w:ascii="Georgia" w:hAnsi="Georgia"/>
+          <w:b w:val="0"/>
+          <w:i w:val="0"/>
+          <w:sz w:val="34"/>
+        </w:rPr>
+        <w:t>Haftungsausschluss</w:t>
+      </w:r>
+    </w:p>
+    <w:p>
+      <w:r>
+        <w:rPr>
+          <w:rFonts w:ascii="Georgia" w:hAnsi="Georgia"/>
+          <w:b w:val="0"/>
+          <w:i w:val="0"/>
+          <w:sz w:val="22"/>
+        </w:rPr>
+        <w:t>Dieses Buch dient der persönlichen Orientierung und Reflexion. Es ersetzt keine medizinische, psychologische, psychotherapeutische oder heilkundliche Beratung, Diagnose oder Behandlung. Es besteht keine Haftung für die Anwendung der Inhalte. Jede Leserin handelt auf eigene Verantwortung.</w:t>
+      </w:r>
+    </w:p>
+    <w:p/>
+    <w:p>
+      <w:r>
+        <w:rPr>
+          <w:rFonts w:ascii="Georgia" w:hAnsi="Georgia"/>
+          <w:b w:val="0"/>
+          <w:i w:val="0"/>
+          <w:sz w:val="34"/>
+        </w:rPr>
+        <w:t>Zur Autorin</w:t>
+      </w:r>
+    </w:p>
+    <w:p>
+      <w:r>
+        <w:rPr>
+          <w:rFonts w:ascii="Georgia" w:hAnsi="Georgia"/>
+          <w:b w:val="0"/>
+          <w:i w:val="0"/>
+          <w:sz w:val="22"/>
+        </w:rPr>
+        <w:t>Petra Tanner ist keine Ärztin, Psychologin oder Psychotherapeutin. Sie arbeitet als Coachin und übt keine Heilkunde im medizinischen Sinn aus. Die Inhalte dieses Buches ersetzen keine Behandlung.</w:t>
+      </w:r>
+    </w:p>
+    <w:p/>
+    <w:p>
+      <w:r>
+        <w:rPr>
+          <w:rFonts w:ascii="Georgia" w:hAnsi="Georgia"/>
+          <w:b w:val="0"/>
+          <w:i w:val="0"/>
+          <w:sz w:val="34"/>
+        </w:rPr>
+        <w:t>Notfall und professionelle Hilfe</w:t>
+      </w:r>
+    </w:p>
+    <w:p>
+      <w:r>
+        <w:rPr>
+          <w:rFonts w:ascii="Georgia" w:hAnsi="Georgia"/>
+          <w:b w:val="0"/>
+          <w:i w:val="0"/>
+          <w:sz w:val="22"/>
+        </w:rPr>
+        <w:t>Wenn es mehr ist als ein schlechter Tag, wenn du seit Wochen nicht mehr herauskommst oder wenn du daran denkst, dir etwas anzutun: Hol dir Hilfe. Das ist keine Schwäche.</w:t>
+      </w:r>
+    </w:p>
+    <w:p>
+      <w:r>
+        <w:rPr>
+          <w:rFonts w:ascii="Georgia" w:hAnsi="Georgia"/>
+          <w:b w:val="0"/>
+          <w:i w:val="0"/>
+          <w:sz w:val="22"/>
+        </w:rPr>
+        <w:t>Schweiz: Die Dargebotene Hand, 143, kostenlos, anonym, Tag und Nacht besetzt</w:t>
+      </w:r>
+    </w:p>
+    <w:p>
+      <w:r>
+        <w:rPr>
+          <w:rFonts w:ascii="Georgia" w:hAnsi="Georgia"/>
+          <w:b w:val="0"/>
+          <w:i w:val="0"/>
+          <w:sz w:val="22"/>
+        </w:rPr>
+        <w:t>Deutschland: Telefonseelsorge, 0800 111 0 111</w:t>
+      </w:r>
+    </w:p>
+    <w:p>
+      <w:r>
+        <w:rPr>
+          <w:rFonts w:ascii="Georgia" w:hAnsi="Georgia"/>
+          <w:b w:val="0"/>
+          <w:i w:val="0"/>
+          <w:sz w:val="22"/>
+        </w:rPr>
+        <w:t>Österreich: Telefonseelsorge, 142</w:t>
+      </w:r>
+    </w:p>
+    <w:p/>
+    <w:p>
+      <w:r>
+        <w:rPr>
+          <w:rFonts w:ascii="Georgia" w:hAnsi="Georgia"/>
+          <w:b w:val="0"/>
+          <w:i w:val="0"/>
+          <w:sz w:val="34"/>
+        </w:rPr>
+        <w:t>Fallbeispiele und Anonymisierung</w:t>
+      </w:r>
+    </w:p>
+    <w:p>
+      <w:r>
+        <w:rPr>
+          <w:rFonts w:ascii="Georgia" w:hAnsi="Georgia"/>
+          <w:b w:val="0"/>
+          <w:i w:val="0"/>
+          <w:sz w:val="22"/>
+        </w:rPr>
+        <w:t>Alle in diesem Buch erwähnten Fallbeispiele, Geschichten und Personenbeschreibungen sind vollständig anonymisiert, verändert und teilweise kompositorisch zusammengesetzt. Sie dienen ausschliesslich der Veranschaulichung. Rückschlüsse auf reale Personen sind nicht möglich und nicht beabsichtigt. Ähnlichkeiten mit lebenden oder verstorbenen Personen sind rein zufällig.</w:t>
+      </w:r>
+    </w:p>
+    <w:p/>
+    <w:p>
+      <w:r>
+        <w:rPr>
+          <w:rFonts w:ascii="Georgia" w:hAnsi="Georgia"/>
+          <w:b w:val="0"/>
+          <w:i w:val="0"/>
+          <w:sz w:val="34"/>
+        </w:rPr>
+        <w:t>Urheberrecht</w:t>
+      </w:r>
+    </w:p>
+    <w:p>
+      <w:r>
+        <w:rPr>
+          <w:rFonts w:ascii="Georgia" w:hAnsi="Georgia"/>
+          <w:b w:val="0"/>
+          <w:i w:val="0"/>
+          <w:sz w:val="22"/>
+        </w:rPr>
+        <w:t>© 2026 Petra Tanner. Alle Rechte vorbehalten. Dieses Werk ist urheberrechtlich geschützt. Jede Verwertung ausserhalb der engen Grenzen des Urheberrechts ist ohne Zustimmung der Autorin unzulässig.</w:t>
+      </w:r>
+    </w:p>
+    <w:p/>
+    <w:p>
+      <w:r>
+        <w:rPr>
+          <w:rFonts w:ascii="Georgia" w:hAnsi="Georgia"/>
+          <w:b w:val="0"/>
+          <w:i w:val="0"/>
+          <w:sz w:val="34"/>
+        </w:rPr>
+        <w:t>Markenrecht</w:t>
+      </w:r>
+    </w:p>
+    <w:p>
+      <w:r>
+        <w:rPr>
+          <w:rFonts w:ascii="Georgia" w:hAnsi="Georgia"/>
+          <w:b w:val="0"/>
+          <w:i w:val="0"/>
+          <w:sz w:val="22"/>
+        </w:rPr>
+        <w:t>Safe to Thrive ist die Marke, unter der Petra Tanner veröffentlicht. Die im Buch verwendeten Konzeptbegriffe sind eigene Wortschöpfungen der Autorin.</w:t>
+      </w:r>
+    </w:p>
+    <w:p/>
+    <w:p>
+      <w:r>
+        <w:rPr>
+          <w:rFonts w:ascii="Georgia" w:hAnsi="Georgia"/>
+          <w:b w:val="0"/>
+          <w:i w:val="0"/>
+          <w:sz w:val="34"/>
+        </w:rPr>
+        <w:t>Kontakt</w:t>
+      </w:r>
+    </w:p>
+    <w:p>
+      <w:r>
+        <w:rPr>
+          <w:rFonts w:ascii="Georgia" w:hAnsi="Georgia"/>
+          <w:b w:val="0"/>
+          <w:i w:val="0"/>
+          <w:sz w:val="22"/>
+        </w:rPr>
+        <w:t>info.safetothrive@gmail.com</w:t>
+      </w:r>
+    </w:p>
+    <w:p/>
+    <w:p>
+      <w:r>
+        <w:rPr>
+          <w:rFonts w:ascii="Georgia" w:hAnsi="Georgia"/>
+          <w:b w:val="0"/>
+          <w:i w:val="0"/>
+          <w:sz w:val="34"/>
+        </w:rPr>
+        <w:t>Und wenn es mehr ist als ein schlechter Tag</w:t>
+      </w:r>
+    </w:p>
+    <w:p>
+      <w:r>
+        <w:rPr>
+          <w:rFonts w:ascii="Georgia" w:hAnsi="Georgia"/>
+          <w:b w:val="0"/>
+          <w:i w:val="0"/>
+          <w:sz w:val="22"/>
+        </w:rPr>
+        <w:t>Wenn du seit Wochen nicht mehr herauskommst. Wenn du nachts wach liegst und denkst, dass es ohne dich leichter wäre.</w:t>
+      </w:r>
+    </w:p>
+    <w:p>
+      <w:r>
+        <w:rPr>
+          <w:rFonts w:ascii="Georgia" w:hAnsi="Georgia"/>
+          <w:b w:val="0"/>
+          <w:i w:val="0"/>
+          <w:sz w:val="22"/>
+        </w:rPr>
+        <w:t>Dann ist dieses Buch nicht genug. Das ist keine Schwäche, das ist einfach so.</w:t>
+      </w:r>
+    </w:p>
+    <w:p>
+      <w:r>
+        <w:rPr>
+          <w:rFonts w:ascii="Georgia" w:hAnsi="Georgia"/>
+          <w:b w:val="0"/>
+          <w:i w:val="0"/>
+          <w:sz w:val="22"/>
+        </w:rPr>
+        <w:t>Ruf an. Kostenlos, anonym, Tag und Nacht besetzt.</w:t>
+      </w:r>
+    </w:p>
+    <w:p>
+      <w:r>
+        <w:rPr>
+          <w:rFonts w:ascii="Georgia" w:hAnsi="Georgia"/>
+          <w:b w:val="0"/>
+          <w:i w:val="0"/>
+          <w:sz w:val="22"/>
+        </w:rPr>
+        <w:t>Schweiz 143 · Deutschland 0800 111 0 111 · Österreich 142</w:t>
+      </w:r>
+    </w:p>
+    <w:p/>
+    <w:p>
+      <w:r>
+        <w:rPr>
+          <w:rFonts w:ascii="Georgia" w:hAnsi="Georgia"/>
+          <w:b w:val="0"/>
+          <w:i w:val="0"/>
+          <w:sz w:val="34"/>
+        </w:rPr>
+        <w:t>Impressum</w:t>
+      </w:r>
+    </w:p>
+    <w:p>
+      <w:r>
+        <w:rPr>
+          <w:rFonts w:ascii="Georgia" w:hAnsi="Georgia"/>
+          <w:b w:val="0"/>
+          <w:i w:val="0"/>
+          <w:sz w:val="22"/>
+        </w:rPr>
+        <w:t>© 2026 Petra Tanner</w:t>
+      </w:r>
+    </w:p>
+    <w:p>
+      <w:r>
+        <w:rPr>
+          <w:rFonts w:ascii="Georgia" w:hAnsi="Georgia"/>
+          <w:b w:val="0"/>
+          <w:i w:val="0"/>
+          <w:sz w:val="22"/>
+        </w:rPr>
+        <w:t>Petra Tanner</w:t>
+      </w:r>
+    </w:p>
+    <w:p>
+      <w:r>
+        <w:rPr>
+          <w:rFonts w:ascii="Georgia" w:hAnsi="Georgia"/>
+          <w:b w:val="0"/>
+          <w:i w:val="0"/>
+          <w:sz w:val="22"/>
+        </w:rPr>
+        <w:t>Wiesentalstrasse 68</w:t>
+      </w:r>
+    </w:p>
+    <w:p>
+      <w:r>
+        <w:rPr>
+          <w:rFonts w:ascii="Georgia" w:hAnsi="Georgia"/>
+          <w:b w:val="0"/>
+          <w:i w:val="0"/>
+          <w:sz w:val="22"/>
+        </w:rPr>
+        <w:t>9240 Uzwil, Schweiz</w:t>
+      </w:r>
+    </w:p>
+    <w:p/>
+    <w:p>
+      <w:r>
+        <w:rPr>
+          <w:rFonts w:ascii="Georgia" w:hAnsi="Georgia"/>
+          <w:b w:val="0"/>
+          <w:i w:val="0"/>
+          <w:sz w:val="22"/>
+        </w:rPr>
+        <w:t>Selbstverlag</w:t>
+      </w:r>
+    </w:p>
+    <w:p>
+      <w:r>
+        <w:rPr>
+          <w:rFonts w:ascii="Georgia" w:hAnsi="Georgia"/>
+          <w:b w:val="0"/>
+          <w:i w:val="0"/>
+          <w:sz w:val="22"/>
+        </w:rPr>
+        <w:t>Unabhängig veröffentlicht über Amazon Kindle Direct Publishing</w:t>
+      </w:r>
+    </w:p>
+    <w:p/>
+    <w:p>
+      <w:r>
+        <w:rPr>
+          <w:rFonts w:ascii="Georgia" w:hAnsi="Georgia"/>
+          <w:b w:val="0"/>
+          <w:i w:val="0"/>
+          <w:sz w:val="22"/>
+        </w:rPr>
+        <w:t>Kontakt: info.safetothrive@gmail.com</w:t>
       </w:r>
     </w:p>
     <w:sectPr>

</xml_diff>

<commit_message>
Gedankenstriche im Fliesstext durch Kommas ersetzt
</commit_message>
<xml_diff>
--- a/outputs/buch-beziehungen/wenn-beziehungen-erschoepfen-Taschenbuch.docx
+++ b/outputs/buch-beziehungen/wenn-beziehungen-erschoepfen-Taschenbuch.docx
@@ -37,7 +37,7 @@
           <w:sz w:val="260"/>
           <w:szCs w:val="260"/>
         </w:rPr>
-        <w:t xml:space="preserve">Warum du gibst, bis nichts mehr von dir übrig ist — und wie du dich zurückholst</w:t>
+        <w:t>Warum du gibst, bis nichts mehr von dir übrig ist, und wie du dich zurückholst</w:t>
       </w:r>
     </w:p>
     <w:p>
@@ -286,7 +286,7 @@
           <w:sz w:val="210"/>
           <w:szCs w:val="210"/>
         </w:rPr>
-        <w:t xml:space="preserve">: Grenzen — das missverstandene Wort</w:t>
+        <w:t>: Grenzen, das missverstandene Wort</w:t>
       </w:r>
     </w:p>
     <w:p>
@@ -436,7 +436,7 @@
           <w:sz w:val="210"/>
           <w:szCs w:val="210"/>
         </w:rPr>
-        <w:t xml:space="preserve">: Das innere Kind — die Wurzel verstehen</w:t>
+        <w:t>: Das innere Kind, die Wurzel verstehen</w:t>
       </w:r>
     </w:p>
     <w:p>
@@ -927,7 +927,7 @@
           <w:sz w:val="220"/>
           <w:szCs w:val="220"/>
         </w:rPr>
-        <w:t xml:space="preserve">Viele der Frauen, die zu mir kommen, wurden in ihrem Leben noch nie wirklich gefragt: Wie geht es dir — und zwar dir, nicht der Funktion, die du erfüllst?</w:t>
+        <w:t>Viele der Frauen, die zu mir kommen, wurden in ihrem Leben noch nie wirklich gefragt: Wie geht es dir, und zwar dir, nicht der Funktion, die du erfüllst?</w:t>
       </w:r>
     </w:p>
     <w:p>
@@ -1285,7 +1285,7 @@
           <w:sz w:val="220"/>
           <w:szCs w:val="220"/>
         </w:rPr>
-        <w:t xml:space="preserve">Das, was du gerade fühlst? Diese Erschöpfung, die sich nicht erklären lässt, die nach dem Wochenende noch da ist, die schon morgens beim Aufwachen auf dir liegt — die ist real. Sie ist kein Zeichen von Schwäche. Und sie ist kein Zeichen von Undankbarkeit.</w:t>
+        <w:t>Das, was du gerade fühlst? Diese Erschöpfung, die sich nicht erklären lässt, die nach dem Wochenende noch da ist, die schon morgens beim Aufwachen auf dir liegt, die ist real. Sie ist kein Zeichen von Schwäche. Und sie ist kein Zeichen von Undankbarkeit.</w:t>
       </w:r>
     </w:p>
     <w:p>
@@ -1673,7 +1673,7 @@
           <w:sz w:val="220"/>
           <w:szCs w:val="220"/>
         </w:rPr>
-        <w:t xml:space="preserve">Das schlechte Gewissen, wenn du ausnahmsweise mal an dich denkst. Du gönnst dir eine Stunde für dich — ein Bad, ein Buch, ein Spaziergang — und kannst sie nicht geniessen, weil der Gedanke kommt: Eigentlich müsste ich jetzt...</w:t>
+        <w:t>Das schlechte Gewissen, wenn du ausnahmsweise mal an dich denkst. Du gönnst dir eine Stunde für dich, ein Bad, ein Buch, ein Spaziergang, und kannst sie nicht geniessen, weil der Gedanke kommt: Eigentlich müsste ich jetzt...</w:t>
       </w:r>
     </w:p>
     <w:p>
@@ -1877,7 +1877,7 @@
           <w:sz w:val="220"/>
           <w:szCs w:val="220"/>
         </w:rPr>
-        <w:t xml:space="preserve">Ja, Beziehungen kosten manchmal Kraft. Schwierige Gespräche, emotionale Tiefs, Konflikte, das gehört dazu. Aber wenn du dich nach fast jeder Begegnung mit den Menschen, die du liebst, ausgelaugt fühlst, wenn Geben sich anfühlt wie etwas, das du schuldest, und nicht wie etwas, das du wählst — dann stimmt etwas nicht. Nicht mit dir. Aber mit dem Muster, in dem du dich befindest.</w:t>
+        <w:t>Ja, Beziehungen kosten manchmal Kraft. Schwierige Gespräche, emotionale Tiefs, Konflikte, das gehört dazu. Aber wenn du dich nach fast jeder Begegnung mit den Menschen, die du liebst, ausgelaugt fühlst, wenn Geben sich anfühlt wie etwas, das du schuldest, und nicht wie etwas, das du wählst, dann stimmt etwas nicht. Nicht mit dir. Aber mit dem Muster, in dem du dich befindest.</w:t>
       </w:r>
     </w:p>
     <w:p>
@@ -4071,7 +4071,7 @@
           <w:sz w:val="220"/>
           <w:szCs w:val="220"/>
         </w:rPr>
-        <w:t xml:space="preserve">Franziska — die Frau, die ich am Anfang beschrieben habe — hat drei Jahre lang an diesen Mustern gearbeitet. Nicht weil ihr Kindheit so dramatisch war. Sondern weil sie verstanden hat, was das konstante Scannen anderer mit ihr gemacht hat. Und weil sie gelernt hat, dass ihr Nervensystem sich ausruhen darf. Dass sie nicht immer wissen muss, wie die Lage ist. Dass sie in einem Raum sein darf, ohne sofort zu analysieren, wer gute oder schlechte Laune hat.</w:t>
+        <w:t>Franziska, die Frau, die ich am Anfang beschrieben habe, hat drei Jahre lang an diesen Mustern gearbeitet. Nicht weil ihr Kindheit so dramatisch war. Sondern weil sie verstanden hat, was das konstante Scannen anderer mit ihr gemacht hat. Und weil sie gelernt hat, dass ihr Nervensystem sich ausruhen darf. Dass sie nicht immer wissen muss, wie die Lage ist. Dass sie in einem Raum sein darf, ohne sofort zu analysieren, wer gute oder schlechte Laune hat.</w:t>
       </w:r>
     </w:p>
     <w:p>
@@ -4528,7 +4528,7 @@
           <w:sz w:val="220"/>
           <w:szCs w:val="220"/>
         </w:rPr>
-        <w:t xml:space="preserve">Die chronische Müdigkeit, die schon da ist, bevor du den ersten Kaffee getrunken hast. Kopfschmerzen, Verspannungen, Rückenschmerzen, die kommen und gehen — und für die kein Arzt eine eindeutige körperliche Ursache findet. Der Darm, der Probleme macht. Das Immunsystem, das häufiger versagt als bei anderen.</w:t>
+        <w:t>Die chronische Müdigkeit, die schon da ist, bevor du den ersten Kaffee getrunken hast. Kopfschmerzen, Verspannungen, Rückenschmerzen, die kommen und gehen, und für die kein Arzt eine eindeutige körperliche Ursache findet. Der Darm, der Probleme macht. Das Immunsystem, das häufiger versagt als bei anderen.</w:t>
       </w:r>
     </w:p>
     <w:p>
@@ -4562,7 +4562,7 @@
           <w:sz w:val="220"/>
           <w:szCs w:val="220"/>
         </w:rPr>
-        <w:t xml:space="preserve">Die Wissenschaft ist hier sehr klar: Das Stresssystem des Körpers — mit den Hormonen Cortisol und Adrenalin — ist für kurzfristige Belastungen ausgelegt. Es soll aktiviert werden, dann wieder zur Ruhe kommen. Bei Menschen mit chronischer Überverantwortung bleibt es dauerhaft aktiviert. Das Nervensystem lernt nicht mehr, in den Ruhemodus zu wechseln.</w:t>
+        <w:t>Die Wissenschaft ist hier sehr klar: Das Stresssystem des Körpers, mit den Hormonen Cortisol und Adrenalin, ist für kurzfristige Belastungen ausgelegt. Es soll aktiviert werden, dann wieder zur Ruhe kommen. Bei Menschen mit chronischer Überverantwortung bleibt es dauerhaft aktiviert. Das Nervensystem lernt nicht mehr, in den Ruhemodus zu wechseln.</w:t>
       </w:r>
     </w:p>
     <w:p>
@@ -4766,7 +4766,7 @@
           <w:sz w:val="220"/>
           <w:szCs w:val="220"/>
         </w:rPr>
-        <w:t xml:space="preserve">Wenn du dich jahrelang an andere angepasst hast, wenn du deine Bedürfnisse immer hintenangestellt hast, wenn du dich permanent gefragt hast, was der andere will, ohne je zu fragen, was du willst — dann verlierst du irgendwann das Gespür für dich selbst. Du weisst nicht mehr, was du magst. Was du wirklich willst. Was dich glücklich macht, abseits davon, anderen zu gefallen.</w:t>
+        <w:t>Wenn du dich jahrelang an andere angepasst hast, wenn du deine Bedürfnisse immer hintenangestellt hast, wenn du dich permanent gefragt hast, was der andere will, ohne je zu fragen, was du willst, dann verlierst du irgendwann das Gespür für dich selbst. Du weisst nicht mehr, was du magst. Was du wirklich willst. Was dich glücklich macht, abseits davon, anderen zu gefallen.</w:t>
       </w:r>
     </w:p>
     <w:p>
@@ -5137,7 +5137,7 @@
           <w:sz w:val="220"/>
           <w:szCs w:val="220"/>
         </w:rPr>
-        <w:t xml:space="preserve">Wenn du das Muster, in dem du jetzt bist, nie veränderst — wie sieht dieses Leben dann aus? Welche Momente hast du verpasst, weil du zu beschäftigt warst, für andere da zu sein? Welche Träume hast du nie verfolgt? Welche Gespräche hast du nie geführt? Wie hast du dich in deinen Beziehungen gefühlt — geliebt oder benutzt? Was ist ungesagt geblieben?</w:t>
+        <w:t>Wenn du das Muster, in dem du jetzt bist, nie veränderst, wie sieht dieses Leben dann aus? Welche Momente hast du verpasst, weil du zu beschäftigt warst, für andere da zu sein? Welche Träume hast du nie verfolgt? Welche Gespräche hast du nie geführt? Wie hast du dich in deinen Beziehungen gefühlt, geliebt oder benutzt? Was ist ungesagt geblieben?</w:t>
       </w:r>
     </w:p>
     <w:p>
@@ -6855,7 +6855,7 @@
           <w:sz w:val="220"/>
           <w:szCs w:val="220"/>
         </w:rPr>
-        <w:t xml:space="preserve">Das ist kein Angriff auf den anderen. Es ist die Beschreibung einer Dynamik, zu der beide beitragen. Systeme haben eine Eigenträgheit. Sie bleiben in einem Gleichgewicht — auch wenn dieses Gleichgewicht ungesund ist — solange niemand etwas verändert.</w:t>
+        <w:t>Das ist kein Angriff auf den anderen. Es ist die Beschreibung einer Dynamik, zu der beide beitragen. Systeme haben eine Eigenträgheit. Sie bleiben in einem Gleichgewicht, auch wenn dieses Gleichgewicht ungesund ist, solange niemand etwas verändert.</w:t>
       </w:r>
     </w:p>
     <w:p>
@@ -6956,7 +6956,7 @@
           <w:sz w:val="220"/>
           <w:szCs w:val="220"/>
         </w:rPr>
-        <w:t xml:space="preserve">Nicht um den anderen zu bestrafen. Nicht aus Rache. Sondern weil das Muster nur dann sichtbar wird — für beide — wenn es aufhört. Solange du auffängst und glättest und rettest, gibt es keine Reibung. Keine Reibung bedeutet: kein Anlass, etwas zu hinterfragen.</w:t>
+        <w:t>Nicht um den anderen zu bestrafen. Nicht aus Rache. Sondern weil das Muster nur dann sichtbar wird, für beide, wenn es aufhört. Solange du auffängst und glättest und rettest, gibt es keine Reibung. Keine Reibung bedeutet: kein Anlass, etwas zu hinterfragen.</w:t>
       </w:r>
     </w:p>
     <w:p>
@@ -7648,7 +7648,7 @@
           <w:sz w:val="340"/>
           <w:szCs w:val="340"/>
         </w:rPr>
-        <w:t xml:space="preserve">Kapitel 7: Grenzen — das missverstandene Wort</w:t>
+        <w:t>Kapitel 7: Grenzen, das missverstandene Wort</w:t>
       </w:r>
     </w:p>
     <w:p>
@@ -7909,7 +7909,7 @@
           <w:sz w:val="220"/>
           <w:szCs w:val="220"/>
         </w:rPr>
-        <w:t xml:space="preserve">Irgendwann explodierte es. Nach einem harmlosen Satz ihres Mannes — er bat sie, auch noch seine Eltern für Weihnachten zu organisieren — brach etwas auf. Mia weinte. Dann schrie sie. Dann verliess sie den Raum.</w:t>
+        <w:t>Irgendwann explodierte es. Nach einem harmlosen Satz ihres Mannes, er bat sie, auch noch seine Eltern für Weihnachten zu organisieren, brach etwas auf. Mia weinte. Dann schrie sie. Dann verliess sie den Raum.</w:t>
       </w:r>
     </w:p>
     <w:p>
@@ -8588,7 +8588,7 @@
           <w:sz w:val="220"/>
           <w:szCs w:val="220"/>
         </w:rPr>
-        <w:t xml:space="preserve">Grenzen zu setzen ist keine einmalige Handlung. Es ist eine Praxis. Du wirst es lernen, vergessen, wieder lernen. Du wirst Rückschritte haben — Momente, wo du wieder Ja sagst, obwohl du Nein meinst, und dann eine Stunde später weisst, dass du es bereust.</w:t>
+        <w:t>Grenzen zu setzen ist keine einmalige Handlung. Es ist eine Praxis. Du wirst es lernen, vergessen, wieder lernen. Du wirst Rückschritte haben, Momente, wo du wieder Ja sagst, obwohl du Nein meinst, und dann eine Stunde später weisst, dass du es bereust.</w:t>
       </w:r>
     </w:p>
     <w:p>
@@ -9099,7 +9099,7 @@
           <w:sz w:val="220"/>
           <w:szCs w:val="220"/>
         </w:rPr>
-        <w:t xml:space="preserve">Das erste ist Liebe. Das zweite ist Martyrium. Und Martyrium trägt — wenn man es lange genug praktiziert — einen bitteren Kern: die stille Erwartung, dass jemand das sieht und sich erkenntlich zeigt. Wenn das nicht passiert, entsteht Schmerz, den man nicht benennen kann.</w:t>
+        <w:t>Das erste ist Liebe. Das zweite ist Martyrium. Und Martyrium trägt, wenn man es lange genug praktiziert, einen bitteren Kern: die stille Erwartung, dass jemand das sieht und sich erkenntlich zeigt. Wenn das nicht passiert, entsteht Schmerz, den man nicht benennen kann.</w:t>
       </w:r>
     </w:p>
     <w:p>
@@ -9431,7 +9431,7 @@
           <w:sz w:val="220"/>
           <w:szCs w:val="220"/>
         </w:rPr>
-        <w:t xml:space="preserve">Aber der Unterschied ist entscheidend: *weil du willst* — nicht *weil du fürchtest, was passiert, wenn du es nicht tust*.</w:t>
+        <w:t>Aber der Unterschied ist entscheidend: *weil du willst*, nicht *weil du fürchtest, was passiert, wenn du es nicht tust*.</w:t>
       </w:r>
     </w:p>
     <w:p>
@@ -9504,7 +9504,7 @@
           <w:sz w:val="220"/>
           <w:szCs w:val="220"/>
         </w:rPr>
-        <w:t xml:space="preserve"> Wenn du einer Person sagst, was du brauchst, und diese Person reagiert mit Respekt — auch wenn sie vielleicht kurz enttäuscht ist — dann ist das Liebe. Wenn jemand auf deine Bedürfnisse mit Wut reagiert und dich dazu bringt, dich sofort zurückzuziehen und zu entschuldigen, dann ist das kein gesunder Umgang mit dir.</w:t>
+        <w:t xml:space="preserve"> Wenn du einer Person sagst, was du brauchst, und diese Person reagiert mit Respekt, auch wenn sie vielleicht kurz enttäuscht ist, dann ist das Liebe. Wenn jemand auf deine Bedürfnisse mit Wut reagiert und dich dazu bringt, dich sofort zurückzuziehen und zu entschuldigen, dann ist das kein gesunder Umgang mit dir.</w:t>
       </w:r>
     </w:p>
     <w:p>
@@ -9582,24 +9582,24 @@
           <w:sz w:val="220"/>
           <w:szCs w:val="220"/>
         </w:rPr>
-        <w:t xml:space="preserve">Nach Zeit mit jemandem, den du liebst — wie fühlst du dich? Voller oder leerer?</w:t>
-      </w:r>
-    </w:p>
-    <w:p>
-      <w:pPr>
-        <w:spacing w:after="120" w:before="0"/>
-        <w:jc w:val="both"/>
-      </w:pPr>
-      <w:r>
-        <w:rPr>
-          <w:rFonts w:ascii="Georgia" w:cs="Georgia" w:eastAsia="Georgia" w:hAnsi="Georgia"/>
-          <w:b w:val="false"/>
-          <w:bCs w:val="false"/>
-          <w:color w:val="2C2C2C"/>
-          <w:sz w:val="220"/>
-          <w:szCs w:val="220"/>
-        </w:rPr>
-        <w:t xml:space="preserve">Ich sage nicht: immer voller. Tiefe Gespräche, Konflikte, emotionale Arbeit — das kostet Kraft, auch in liebevollen Beziehungen. Aber über die Zeit: Bekommst du etwas zurück?</w:t>
+        <w:t>Nach Zeit mit jemandem, den du liebst, wie fühlst du dich? Voller oder leerer?</w:t>
+      </w:r>
+    </w:p>
+    <w:p>
+      <w:pPr>
+        <w:spacing w:after="120" w:before="0"/>
+        <w:jc w:val="both"/>
+      </w:pPr>
+      <w:r>
+        <w:rPr>
+          <w:rFonts w:ascii="Georgia" w:cs="Georgia" w:eastAsia="Georgia" w:hAnsi="Georgia"/>
+          <w:b w:val="false"/>
+          <w:bCs w:val="false"/>
+          <w:color w:val="2C2C2C"/>
+          <w:sz w:val="220"/>
+          <w:szCs w:val="220"/>
+        </w:rPr>
+        <w:t>Ich sage nicht: immer voller. Tiefe Gespräche, Konflikte, emotionale Arbeit, das kostet Kraft, auch in liebevollen Beziehungen. Aber über die Zeit: Bekommst du etwas zurück?</w:t>
       </w:r>
     </w:p>
     <w:p>
@@ -9809,7 +9809,7 @@
           <w:sz w:val="220"/>
           <w:szCs w:val="220"/>
         </w:rPr>
-        <w:t xml:space="preserve">Du verdienst eine Liebe, bei der du dich nicht kleiner machen musst. Bei der du Raum einnehmen darfst. Bei der du Nein sagen darfst. Bei der du auch gehalten wirst — nicht nur hältst.</w:t>
+        <w:t>Du verdienst eine Liebe, bei der du dich nicht kleiner machen musst. Bei der du Raum einnehmen darfst. Bei der du Nein sagen darfst. Bei der du auch gehalten wirst, nicht nur hältst.</w:t>
       </w:r>
     </w:p>
     <w:p>
@@ -10433,7 +10433,7 @@
           <w:sz w:val="220"/>
           <w:szCs w:val="220"/>
         </w:rPr>
-        <w:t xml:space="preserve">Stell dir täglich — auch wenn es nur zwei Minuten sind — diese Frage: Wie fühlt sich mein Körper gerade an? Nicht gut oder schlecht. Konkret. Wo ist Spannung? Wo ist Leichtigkeit? Was braucht mein Körper gerade?</w:t>
+        <w:t>Stell dir täglich, auch wenn es nur zwei Minuten sind, diese Frage: Wie fühlt sich mein Körper gerade an? Nicht gut oder schlecht. Konkret. Wo ist Spannung? Wo ist Leichtigkeit? Was braucht mein Körper gerade?</w:t>
       </w:r>
     </w:p>
     <w:p>
@@ -10878,7 +10878,7 @@
           <w:sz w:val="230"/>
           <w:szCs w:val="230"/>
         </w:rPr>
-        <w:t xml:space="preserve">Drei Übungen für diese Woche — konkret und klein</w:t>
+        <w:t>Drei Übungen für diese Woche, konkret und klein</w:t>
       </w:r>
     </w:p>
     <w:p>
@@ -12107,7 +12107,7 @@
           <w:sz w:val="220"/>
           <w:szCs w:val="220"/>
         </w:rPr>
-        <w:t xml:space="preserve"> Für kleine, risikoarme Situationen. Eine Bitte im Alltag, eine Anfrage, die du ablehnen kannst. „Nein, das passt mir nicht." Und dann — und das ist die eigentliche Übung — stillhalten.</w:t>
+        <w:t xml:space="preserve"> Für kleine, risikoarme Situationen. Eine Bitte im Alltag, eine Anfrage, die du ablehnen kannst. „Nein, das passt mir nicht." Und dann, und das ist die eigentliche Übung, stillhalten.</w:t>
       </w:r>
     </w:p>
     <w:p>
@@ -12774,7 +12774,7 @@
           <w:sz w:val="220"/>
           <w:szCs w:val="220"/>
         </w:rPr>
-        <w:t xml:space="preserve">Ich denke an Markus und Sonja. Sie kam zu mir, er nie, aber ich lernte ihn durch ihre Beschreibungen kennen. Nach dreizehn Jahren Ehe hatte Sonja begonnen, sich zu verändern. Sie hatte Grenzen gesetzt. Sie hatte gesagt, was sie brauchte. Und Markus hatte — langsam, holprig, manchmal widerwillig — angefangen zuzuhören.</w:t>
+        <w:t>Ich denke an Markus und Sonja. Sie kam zu mir, er nie, aber ich lernte ihn durch ihre Beschreibungen kennen. Nach dreizehn Jahren Ehe hatte Sonja begonnen, sich zu verändern. Sie hatte Grenzen gesetzt. Sie hatte gesagt, was sie brauchte. Und Markus hatte, langsam, holprig, manchmal widerwillig, angefangen zuzuhören.</w:t>
       </w:r>
     </w:p>
     <w:p>
@@ -14500,7 +14500,7 @@
           <w:sz w:val="340"/>
           <w:szCs w:val="340"/>
         </w:rPr>
-        <w:t xml:space="preserve">Kapitel 13: Das innere Kind — die Wurzel verstehen</w:t>
+        <w:t>Kapitel 13: Das innere Kind, die Wurzel verstehen</w:t>
       </w:r>
     </w:p>
     <w:p>
@@ -15284,7 +15284,7 @@
           <w:sz w:val="220"/>
           <w:szCs w:val="220"/>
         </w:rPr>
-        <w:t xml:space="preserve">Bettina beschrieb mir später, wie sie begann, das zu unterscheiden. „Wenn ich dieses ganz bestimmte Angstgefühl spüre — das Zucken in der Brust — dann frage ich mich jetzt zuerst: Bin ich gerade bei mir, oder bin ich bei der Siebenjährigen?" Sie lachte etwas verlegen. „Klingt seltsam. Aber es funktioniert."</w:t>
+        <w:t>Bettina beschrieb mir später, wie sie begann, das zu unterscheiden. „Wenn ich dieses ganz bestimmte Angstgefühl spüre, das Zucken in der Brust, dann frage ich mich jetzt zuerst: Bin ich gerade bei mir, oder bin ich bei der Siebenjährigen?" Sie lachte etwas verlegen. „Klingt seltsam. Aber es funktioniert."</w:t>
       </w:r>
     </w:p>
     <w:p>
@@ -15935,7 +15935,7 @@
           <w:sz w:val="340"/>
           <w:szCs w:val="340"/>
         </w:rPr>
-        <w:t xml:space="preserve">Kapitel 14: Wenn der andere sich nie ändert — schwierige Persönlichkeiten erkennen</w:t>
+        <w:t>Kapitel 14: Wenn der andere sich nie ändert, schwierige Persönlichkeiten erkennen</w:t>
       </w:r>
     </w:p>
     <w:p>
@@ -16969,7 +16969,7 @@
           <w:sz w:val="220"/>
           <w:szCs w:val="220"/>
         </w:rPr>
-        <w:t xml:space="preserve">Für mich — dieses Wort.</w:t>
+        <w:t>Für mich, dieses Wort.</w:t>
       </w:r>
     </w:p>
     <w:p>
@@ -17310,7 +17310,7 @@
           <w:sz w:val="230"/>
           <w:szCs w:val="230"/>
         </w:rPr>
-        <w:t xml:space="preserve">Was Veränderung in diesen Beziehungen braucht — und was sie nicht braucht</w:t>
+        <w:t>Was Veränderung in diesen Beziehungen braucht, und was sie nicht braucht</w:t>
       </w:r>
     </w:p>
     <w:p>
@@ -17361,7 +17361,7 @@
           <w:sz w:val="220"/>
           <w:szCs w:val="220"/>
         </w:rPr>
-        <w:t xml:space="preserve">Eine Veränderung, die nur kommt, weil du drohst zu gehen — und wieder aufhört, wenn du geblieben bist — ist keine Veränderung. Das ist Anpassung ans nächste Druckniveau.</w:t>
+        <w:t>Eine Veränderung, die nur kommt, weil du drohst zu gehen, und wieder aufhört, wenn du geblieben bist, ist keine Veränderung. Das ist Anpassung ans nächste Druckniveau.</w:t>
       </w:r>
     </w:p>
     <w:p>
@@ -17675,7 +17675,7 @@
           <w:sz w:val="340"/>
           <w:szCs w:val="340"/>
         </w:rPr>
-        <w:t xml:space="preserve">Kapitel 15: Endlich sagen, was du meinst — Kommunikation, die wirklich ankommt</w:t>
+        <w:t>Kapitel 15: Endlich sagen, was du meinst, Kommunikation, die wirklich ankommt</w:t>
       </w:r>
     </w:p>
     <w:p>

</xml_diff>

<commit_message>
Kurze Pointe-Saetze bleiben beim vorherigen Absatz; Markdown-Sternchen durch echte Kursivschrift ersetzt
</commit_message>
<xml_diff>
--- a/outputs/buch-beziehungen/wenn-beziehungen-erschoepfen-Taschenbuch.docx
+++ b/outputs/buch-beziehungen/wenn-beziehungen-erschoepfen-Taschenbuch.docx
@@ -7084,48 +7084,39 @@
       </w:pPr>
       <w:r>
         <w:rPr>
-          <w:rFonts w:ascii="Georgia" w:cs="Georgia" w:eastAsia="Georgia" w:hAnsi="Georgia"/>
-          <w:b w:val="false"/>
-          <w:bCs w:val="false"/>
-          <w:color w:val="2C2C2C"/>
-          <w:sz w:val="220"/>
-          <w:szCs w:val="220"/>
-        </w:rPr>
-        <w:t xml:space="preserve">*Wenn ich genug gebe, muss er nicht gehen.*</w:t>
-      </w:r>
-    </w:p>
-    <w:p>
-      <w:pPr>
-        <w:spacing w:after="120" w:before="0"/>
-        <w:jc w:val="both"/>
-      </w:pPr>
-      <w:r>
-        <w:rPr>
-          <w:rFonts w:ascii="Georgia" w:cs="Georgia" w:eastAsia="Georgia" w:hAnsi="Georgia"/>
-          <w:b w:val="false"/>
-          <w:bCs w:val="false"/>
-          <w:color w:val="2C2C2C"/>
-          <w:sz w:val="220"/>
-          <w:szCs w:val="220"/>
-        </w:rPr>
-        <w:t xml:space="preserve">*Wenn ich keine Ansprüche stelle, bin ich sicher.*</w:t>
-      </w:r>
-    </w:p>
-    <w:p>
-      <w:pPr>
-        <w:spacing w:after="120" w:before="0"/>
-        <w:jc w:val="both"/>
-      </w:pPr>
-      <w:r>
-        <w:rPr>
-          <w:rFonts w:ascii="Georgia" w:cs="Georgia" w:eastAsia="Georgia" w:hAnsi="Georgia"/>
-          <w:b w:val="false"/>
-          <w:bCs w:val="false"/>
-          <w:color w:val="2C2C2C"/>
-          <w:sz w:val="220"/>
-          <w:szCs w:val="220"/>
-        </w:rPr>
-        <w:t xml:space="preserve">*Wenn ich perfekt bin, werde ich geliebt.*</w:t>
+          <w:b w:val="0"/>
+          <w:i/>
+          <w:sz w:val="220"/>
+        </w:rPr>
+        <w:t>Wenn ich genug gebe, muss er nicht gehen.</w:t>
+      </w:r>
+    </w:p>
+    <w:p>
+      <w:pPr>
+        <w:spacing w:after="120" w:before="0"/>
+        <w:jc w:val="both"/>
+      </w:pPr>
+      <w:r>
+        <w:rPr>
+          <w:b w:val="0"/>
+          <w:i/>
+          <w:sz w:val="220"/>
+        </w:rPr>
+        <w:t>Wenn ich keine Ansprüche stelle, bin ich sicher.</w:t>
+      </w:r>
+    </w:p>
+    <w:p>
+      <w:pPr>
+        <w:spacing w:after="120" w:before="0"/>
+        <w:jc w:val="both"/>
+      </w:pPr>
+      <w:r>
+        <w:rPr>
+          <w:b w:val="0"/>
+          <w:i/>
+          <w:sz w:val="220"/>
+        </w:rPr>
+        <w:t>Wenn ich perfekt bin, werde ich geliebt.</w:t>
       </w:r>
     </w:p>
     <w:p>
@@ -9424,14 +9415,40 @@
       </w:pPr>
       <w:r>
         <w:rPr>
-          <w:rFonts w:ascii="Georgia" w:cs="Georgia" w:eastAsia="Georgia" w:hAnsi="Georgia"/>
-          <w:b w:val="false"/>
-          <w:bCs w:val="false"/>
-          <w:color w:val="2C2C2C"/>
-          <w:sz w:val="220"/>
-          <w:szCs w:val="220"/>
-        </w:rPr>
-        <w:t>Aber der Unterschied ist entscheidend: *weil du willst*, nicht *weil du fürchtest, was passiert, wenn du es nicht tust*.</w:t>
+          <w:b w:val="0"/>
+          <w:sz w:val="220"/>
+        </w:rPr>
+        <w:t xml:space="preserve">Aber der Unterschied ist entscheidend: </w:t>
+      </w:r>
+      <w:r>
+        <w:rPr>
+          <w:b w:val="0"/>
+          <w:i/>
+          <w:sz w:val="220"/>
+        </w:rPr>
+        <w:t>weil du willst</w:t>
+      </w:r>
+      <w:r>
+        <w:rPr>
+          <w:b w:val="0"/>
+          <w:sz w:val="220"/>
+        </w:rPr>
+        <w:t xml:space="preserve">, nicht </w:t>
+      </w:r>
+      <w:r>
+        <w:rPr>
+          <w:b w:val="0"/>
+          <w:i/>
+          <w:sz w:val="220"/>
+        </w:rPr>
+        <w:t>weil du fürchtest, was passiert, wenn du es nicht tust</w:t>
+      </w:r>
+      <w:r>
+        <w:rPr>
+          <w:b w:val="0"/>
+          <w:sz w:val="220"/>
+        </w:rPr>
+        <w:t>.</w:t>
       </w:r>
     </w:p>
     <w:p>
@@ -20185,48 +20202,81 @@
       </w:pPr>
       <w:r>
         <w:rPr>
-          <w:rFonts w:ascii="Georgia" w:cs="Georgia" w:eastAsia="Georgia" w:hAnsi="Georgia"/>
-          <w:b w:val="false"/>
-          <w:bCs w:val="false"/>
-          <w:color w:val="2C2C2C"/>
-          <w:sz w:val="220"/>
-          <w:szCs w:val="220"/>
-        </w:rPr>
-        <w:t xml:space="preserve">Bowlby, J. (1969). *Attachment and Loss: Vol. 1. Attachment.* Basic Books.</w:t>
-      </w:r>
-    </w:p>
-    <w:p>
-      <w:pPr>
-        <w:spacing w:after="120" w:before="0"/>
-        <w:jc w:val="both"/>
-      </w:pPr>
-      <w:r>
-        <w:rPr>
-          <w:rFonts w:ascii="Georgia" w:cs="Georgia" w:eastAsia="Georgia" w:hAnsi="Georgia"/>
-          <w:b w:val="false"/>
-          <w:bCs w:val="false"/>
-          <w:color w:val="2C2C2C"/>
-          <w:sz w:val="220"/>
-          <w:szCs w:val="220"/>
-        </w:rPr>
-        <w:t xml:space="preserve">Ainsworth, M. D. S. et al. (1978). *Patterns of Attachment.* Erlbaum.</w:t>
-      </w:r>
-    </w:p>
-    <w:p>
-      <w:pPr>
-        <w:spacing w:after="120" w:before="0"/>
-        <w:jc w:val="both"/>
-      </w:pPr>
-      <w:r>
-        <w:rPr>
-          <w:rFonts w:ascii="Georgia" w:cs="Georgia" w:eastAsia="Georgia" w:hAnsi="Georgia"/>
-          <w:b w:val="false"/>
-          <w:bCs w:val="false"/>
-          <w:color w:val="2C2C2C"/>
-          <w:sz w:val="220"/>
-          <w:szCs w:val="220"/>
-        </w:rPr>
-        <w:t xml:space="preserve">Heller, D. P. (2019). *Die Kraft der sicheren Bindung.* Klett-Cotta.</w:t>
+          <w:b w:val="0"/>
+          <w:sz w:val="220"/>
+        </w:rPr>
+        <w:t xml:space="preserve">Bowlby, J. (1969). </w:t>
+      </w:r>
+      <w:r>
+        <w:rPr>
+          <w:b w:val="0"/>
+          <w:i/>
+          <w:sz w:val="220"/>
+        </w:rPr>
+        <w:t>Attachment and Loss: Vol. 1. Attachment.</w:t>
+      </w:r>
+      <w:r>
+        <w:rPr>
+          <w:b w:val="0"/>
+          <w:sz w:val="220"/>
+        </w:rPr>
+        <w:t xml:space="preserve"> Basic Books.</w:t>
+      </w:r>
+    </w:p>
+    <w:p>
+      <w:pPr>
+        <w:spacing w:after="120" w:before="0"/>
+        <w:jc w:val="both"/>
+      </w:pPr>
+      <w:r>
+        <w:rPr>
+          <w:b w:val="0"/>
+          <w:sz w:val="220"/>
+        </w:rPr>
+        <w:t xml:space="preserve">Ainsworth, M. D. S. et al. (1978). </w:t>
+      </w:r>
+      <w:r>
+        <w:rPr>
+          <w:b w:val="0"/>
+          <w:i/>
+          <w:sz w:val="220"/>
+        </w:rPr>
+        <w:t>Patterns of Attachment.</w:t>
+      </w:r>
+      <w:r>
+        <w:rPr>
+          <w:b w:val="0"/>
+          <w:sz w:val="220"/>
+        </w:rPr>
+        <w:t xml:space="preserve"> Erlbaum.</w:t>
+      </w:r>
+    </w:p>
+    <w:p>
+      <w:pPr>
+        <w:spacing w:after="120" w:before="0"/>
+        <w:jc w:val="both"/>
+      </w:pPr>
+      <w:r>
+        <w:rPr>
+          <w:b w:val="0"/>
+          <w:sz w:val="220"/>
+        </w:rPr>
+        <w:t xml:space="preserve">Heller, D. P. (2019). </w:t>
+      </w:r>
+      <w:r>
+        <w:rPr>
+          <w:b w:val="0"/>
+          <w:i/>
+          <w:sz w:val="220"/>
+        </w:rPr>
+        <w:t>Die Kraft der sicheren Bindung.</w:t>
+      </w:r>
+      <w:r>
+        <w:rPr>
+          <w:b w:val="0"/>
+          <w:sz w:val="220"/>
+        </w:rPr>
+        <w:t xml:space="preserve"> Klett-Cotta.</w:t>
       </w:r>
     </w:p>
     <w:p>
@@ -20252,31 +20302,53 @@
       </w:pPr>
       <w:r>
         <w:rPr>
-          <w:rFonts w:ascii="Georgia" w:cs="Georgia" w:eastAsia="Georgia" w:hAnsi="Georgia"/>
-          <w:b w:val="false"/>
-          <w:bCs w:val="false"/>
-          <w:color w:val="2C2C2C"/>
-          <w:sz w:val="220"/>
-          <w:szCs w:val="220"/>
-        </w:rPr>
-        <w:t xml:space="preserve">Beattie, M. (1987). *Codependent No More.* Hazelden Publishing.</w:t>
-      </w:r>
-    </w:p>
-    <w:p>
-      <w:pPr>
-        <w:spacing w:after="120" w:before="0"/>
-        <w:jc w:val="both"/>
-      </w:pPr>
-      <w:r>
-        <w:rPr>
-          <w:rFonts w:ascii="Georgia" w:cs="Georgia" w:eastAsia="Georgia" w:hAnsi="Georgia"/>
-          <w:b w:val="false"/>
-          <w:bCs w:val="false"/>
-          <w:color w:val="2C2C2C"/>
-          <w:sz w:val="220"/>
-          <w:szCs w:val="220"/>
-        </w:rPr>
-        <w:t xml:space="preserve">Brown, B. (2010). *Die Gaben der Unvollkommenheit.* Kailash.</w:t>
+          <w:b w:val="0"/>
+          <w:sz w:val="220"/>
+        </w:rPr>
+        <w:t xml:space="preserve">Beattie, M. (1987). </w:t>
+      </w:r>
+      <w:r>
+        <w:rPr>
+          <w:b w:val="0"/>
+          <w:i/>
+          <w:sz w:val="220"/>
+        </w:rPr>
+        <w:t>Codependent No More.</w:t>
+      </w:r>
+      <w:r>
+        <w:rPr>
+          <w:b w:val="0"/>
+          <w:sz w:val="220"/>
+        </w:rPr>
+        <w:t xml:space="preserve"> Hazelden Publishing.</w:t>
+      </w:r>
+    </w:p>
+    <w:p>
+      <w:pPr>
+        <w:spacing w:after="120" w:before="0"/>
+        <w:jc w:val="both"/>
+      </w:pPr>
+      <w:r>
+        <w:rPr>
+          <w:b w:val="0"/>
+          <w:sz w:val="220"/>
+        </w:rPr>
+        <w:t xml:space="preserve">Brown, B. (2010). </w:t>
+      </w:r>
+      <w:r>
+        <w:rPr>
+          <w:b w:val="0"/>
+          <w:i/>
+          <w:sz w:val="220"/>
+        </w:rPr>
+        <w:t>Die Gaben der Unvollkommenheit.</w:t>
+      </w:r>
+      <w:r>
+        <w:rPr>
+          <w:b w:val="0"/>
+          <w:sz w:val="220"/>
+        </w:rPr>
+        <w:t xml:space="preserve"> Kailash.</w:t>
       </w:r>
     </w:p>
     <w:p>
@@ -20302,31 +20374,53 @@
       </w:pPr>
       <w:r>
         <w:rPr>
-          <w:rFonts w:ascii="Georgia" w:cs="Georgia" w:eastAsia="Georgia" w:hAnsi="Georgia"/>
-          <w:b w:val="false"/>
-          <w:bCs w:val="false"/>
-          <w:color w:val="2C2C2C"/>
-          <w:sz w:val="220"/>
-          <w:szCs w:val="220"/>
-        </w:rPr>
-        <w:t xml:space="preserve">Bradshaw, J. (1990). *Homecoming: Reclaiming and Championing Your Inner Child.* Bantam Books.</w:t>
-      </w:r>
-    </w:p>
-    <w:p>
-      <w:pPr>
-        <w:spacing w:after="120" w:before="0"/>
-        <w:jc w:val="both"/>
-      </w:pPr>
-      <w:r>
-        <w:rPr>
-          <w:rFonts w:ascii="Georgia" w:cs="Georgia" w:eastAsia="Georgia" w:hAnsi="Georgia"/>
-          <w:b w:val="false"/>
-          <w:bCs w:val="false"/>
-          <w:color w:val="2C2C2C"/>
-          <w:sz w:val="220"/>
-          <w:szCs w:val="220"/>
-        </w:rPr>
-        <w:t xml:space="preserve">Young, J. E. (2005). *Schematherapie in der Praxis.* Beltz.</w:t>
+          <w:b w:val="0"/>
+          <w:sz w:val="220"/>
+        </w:rPr>
+        <w:t xml:space="preserve">Bradshaw, J. (1990). </w:t>
+      </w:r>
+      <w:r>
+        <w:rPr>
+          <w:b w:val="0"/>
+          <w:i/>
+          <w:sz w:val="220"/>
+        </w:rPr>
+        <w:t>Homecoming: Reclaiming and Championing Your Inner Child.</w:t>
+      </w:r>
+      <w:r>
+        <w:rPr>
+          <w:b w:val="0"/>
+          <w:sz w:val="220"/>
+        </w:rPr>
+        <w:t xml:space="preserve"> Bantam Books.</w:t>
+      </w:r>
+    </w:p>
+    <w:p>
+      <w:pPr>
+        <w:spacing w:after="120" w:before="0"/>
+        <w:jc w:val="both"/>
+      </w:pPr>
+      <w:r>
+        <w:rPr>
+          <w:b w:val="0"/>
+          <w:sz w:val="220"/>
+        </w:rPr>
+        <w:t xml:space="preserve">Young, J. E. (2005). </w:t>
+      </w:r>
+      <w:r>
+        <w:rPr>
+          <w:b w:val="0"/>
+          <w:i/>
+          <w:sz w:val="220"/>
+        </w:rPr>
+        <w:t>Schematherapie in der Praxis.</w:t>
+      </w:r>
+      <w:r>
+        <w:rPr>
+          <w:b w:val="0"/>
+          <w:sz w:val="220"/>
+        </w:rPr>
+        <w:t xml:space="preserve"> Beltz.</w:t>
       </w:r>
     </w:p>
     <w:p>
@@ -20352,14 +20446,25 @@
       </w:pPr>
       <w:r>
         <w:rPr>
-          <w:rFonts w:ascii="Georgia" w:cs="Georgia" w:eastAsia="Georgia" w:hAnsi="Georgia"/>
-          <w:b w:val="false"/>
-          <w:bCs w:val="false"/>
-          <w:color w:val="2C2C2C"/>
-          <w:sz w:val="220"/>
-          <w:szCs w:val="220"/>
-        </w:rPr>
-        <w:t xml:space="preserve">Rosenberg, M. B. (2016). *Gewaltfreie Kommunikation.* Junfermann.</w:t>
+          <w:b w:val="0"/>
+          <w:sz w:val="220"/>
+        </w:rPr>
+        <w:t xml:space="preserve">Rosenberg, M. B. (2016). </w:t>
+      </w:r>
+      <w:r>
+        <w:rPr>
+          <w:b w:val="0"/>
+          <w:i/>
+          <w:sz w:val="220"/>
+        </w:rPr>
+        <w:t>Gewaltfreie Kommunikation.</w:t>
+      </w:r>
+      <w:r>
+        <w:rPr>
+          <w:b w:val="0"/>
+          <w:sz w:val="220"/>
+        </w:rPr>
+        <w:t xml:space="preserve"> Junfermann.</w:t>
       </w:r>
     </w:p>
     <w:p>
@@ -20385,31 +20490,53 @@
       </w:pPr>
       <w:r>
         <w:rPr>
-          <w:rFonts w:ascii="Georgia" w:cs="Georgia" w:eastAsia="Georgia" w:hAnsi="Georgia"/>
-          <w:b w:val="false"/>
-          <w:bCs w:val="false"/>
-          <w:color w:val="2C2C2C"/>
-          <w:sz w:val="220"/>
-          <w:szCs w:val="220"/>
-        </w:rPr>
-        <w:t xml:space="preserve">Bancroft, L. (2002). *Why Does He Do That?* Berkley Books.</w:t>
-      </w:r>
-    </w:p>
-    <w:p>
-      <w:pPr>
-        <w:spacing w:after="120" w:before="0"/>
-        <w:jc w:val="both"/>
-      </w:pPr>
-      <w:r>
-        <w:rPr>
-          <w:rFonts w:ascii="Georgia" w:cs="Georgia" w:eastAsia="Georgia" w:hAnsi="Georgia"/>
-          <w:b w:val="false"/>
-          <w:bCs w:val="false"/>
-          <w:color w:val="2C2C2C"/>
-          <w:sz w:val="220"/>
-          <w:szCs w:val="220"/>
-        </w:rPr>
-        <w:t xml:space="preserve">Schneider, A. (2019). *Toxische Beziehungen erkennen und verlassen.* Goldmann.</w:t>
+          <w:b w:val="0"/>
+          <w:sz w:val="220"/>
+        </w:rPr>
+        <w:t xml:space="preserve">Bancroft, L. (2002). </w:t>
+      </w:r>
+      <w:r>
+        <w:rPr>
+          <w:b w:val="0"/>
+          <w:i/>
+          <w:sz w:val="220"/>
+        </w:rPr>
+        <w:t>Why Does He Do That?</w:t>
+      </w:r>
+      <w:r>
+        <w:rPr>
+          <w:b w:val="0"/>
+          <w:sz w:val="220"/>
+        </w:rPr>
+        <w:t xml:space="preserve"> Berkley Books.</w:t>
+      </w:r>
+    </w:p>
+    <w:p>
+      <w:pPr>
+        <w:spacing w:after="120" w:before="0"/>
+        <w:jc w:val="both"/>
+      </w:pPr>
+      <w:r>
+        <w:rPr>
+          <w:b w:val="0"/>
+          <w:sz w:val="220"/>
+        </w:rPr>
+        <w:t xml:space="preserve">Schneider, A. (2019). </w:t>
+      </w:r>
+      <w:r>
+        <w:rPr>
+          <w:b w:val="0"/>
+          <w:i/>
+          <w:sz w:val="220"/>
+        </w:rPr>
+        <w:t>Toxische Beziehungen erkennen und verlassen.</w:t>
+      </w:r>
+      <w:r>
+        <w:rPr>
+          <w:b w:val="0"/>
+          <w:sz w:val="220"/>
+        </w:rPr>
+        <w:t xml:space="preserve"> Goldmann.</w:t>
       </w:r>
     </w:p>
     <w:p>
@@ -20435,31 +20562,53 @@
       </w:pPr>
       <w:r>
         <w:rPr>
-          <w:rFonts w:ascii="Georgia" w:cs="Georgia" w:eastAsia="Georgia" w:hAnsi="Georgia"/>
-          <w:b w:val="false"/>
-          <w:bCs w:val="false"/>
-          <w:color w:val="2C2C2C"/>
-          <w:sz w:val="220"/>
-          <w:szCs w:val="220"/>
-        </w:rPr>
-        <w:t xml:space="preserve">Stahl, S. (2015). *Das Kind in dir muss Heimat finden.* Kailash.</w:t>
-      </w:r>
-    </w:p>
-    <w:p>
-      <w:pPr>
-        <w:spacing w:after="120" w:before="0"/>
-        <w:jc w:val="both"/>
-      </w:pPr>
-      <w:r>
-        <w:rPr>
-          <w:rFonts w:ascii="Georgia" w:cs="Georgia" w:eastAsia="Georgia" w:hAnsi="Georgia"/>
-          <w:b w:val="false"/>
-          <w:bCs w:val="false"/>
-          <w:color w:val="2C2C2C"/>
-          <w:sz w:val="220"/>
-          <w:szCs w:val="220"/>
-        </w:rPr>
-        <w:t xml:space="preserve">van der Kolk, B. (2014). *Verkörperter Schrecken.* Probst Verlag.</w:t>
+          <w:b w:val="0"/>
+          <w:sz w:val="220"/>
+        </w:rPr>
+        <w:t xml:space="preserve">Stahl, S. (2015). </w:t>
+      </w:r>
+      <w:r>
+        <w:rPr>
+          <w:b w:val="0"/>
+          <w:i/>
+          <w:sz w:val="220"/>
+        </w:rPr>
+        <w:t>Das Kind in dir muss Heimat finden.</w:t>
+      </w:r>
+      <w:r>
+        <w:rPr>
+          <w:b w:val="0"/>
+          <w:sz w:val="220"/>
+        </w:rPr>
+        <w:t xml:space="preserve"> Kailash.</w:t>
+      </w:r>
+    </w:p>
+    <w:p>
+      <w:pPr>
+        <w:spacing w:after="120" w:before="0"/>
+        <w:jc w:val="both"/>
+      </w:pPr>
+      <w:r>
+        <w:rPr>
+          <w:b w:val="0"/>
+          <w:sz w:val="220"/>
+        </w:rPr>
+        <w:t xml:space="preserve">van der Kolk, B. (2014). </w:t>
+      </w:r>
+      <w:r>
+        <w:rPr>
+          <w:b w:val="0"/>
+          <w:i/>
+          <w:sz w:val="220"/>
+        </w:rPr>
+        <w:t>Verkörperter Schrecken.</w:t>
+      </w:r>
+      <w:r>
+        <w:rPr>
+          <w:b w:val="0"/>
+          <w:sz w:val="220"/>
+        </w:rPr>
+        <w:t xml:space="preserve"> Probst Verlag.</w:t>
       </w:r>
     </w:p>
     <w:p>

</xml_diff>

<commit_message>
Buch 3: Abschnitt 'Meine anderen Buecher' im Backmatter ergaenzt (Cross-Promotion)
</commit_message>
<xml_diff>
--- a/outputs/buch-beziehungen/wenn-beziehungen-erschoepfen-Taschenbuch.docx
+++ b/outputs/buch-beziehungen/wenn-beziehungen-erschoepfen-Taschenbuch.docx
@@ -20159,6 +20159,157 @@
           <w:sz w:val="340"/>
           <w:szCs w:val="340"/>
         </w:rPr>
+        <w:t xml:space="preserve">Meine anderen Bücher</w:t>
+      </w:r>
+    </w:p>
+    <w:p>
+      <w:pPr>
+        <w:spacing w:after="120" w:before="0"/>
+        <w:jc w:val="both"/>
+      </w:pPr>
+      <w:r>
+        <w:rPr>
+          <w:rFonts w:ascii="Georgia" w:cs="Georgia" w:eastAsia="Georgia" w:hAnsi="Georgia"/>
+          <w:b w:val="false"/>
+          <w:bCs w:val="false"/>
+          <w:color w:val="2C2C2C"/>
+          <w:sz w:val="220"/>
+          <w:szCs w:val="220"/>
+        </w:rPr>
+        <w:t xml:space="preserve">Wenn dich dieses Buch berührt hat, findest du hier weitere Bücher aus der Safe-to-Thrive-Reihe:</w:t>
+      </w:r>
+    </w:p>
+    <w:p>
+      <w:pPr>
+        <w:spacing w:after="120" w:before="400"/>
+      </w:pPr>
+      <w:r>
+        <w:rPr>
+          <w:rFonts w:ascii="Georgia" w:cs="Georgia" w:eastAsia="Georgia" w:hAnsi="Georgia"/>
+          <w:b/>
+          <w:bCs/>
+          <w:color w:val="2C2C2C"/>
+          <w:sz w:val="230"/>
+          <w:szCs w:val="230"/>
+        </w:rPr>
+        <w:t xml:space="preserve">Das schlechte Gewissen</w:t>
+      </w:r>
+    </w:p>
+    <w:p>
+      <w:pPr>
+        <w:spacing w:after="120" w:before="0"/>
+        <w:jc w:val="both"/>
+      </w:pPr>
+      <w:r>
+        <w:rPr>
+          <w:rFonts w:ascii="Georgia" w:cs="Georgia" w:eastAsia="Georgia" w:hAnsi="Georgia"/>
+          <w:b w:val="false"/>
+          <w:bCs w:val="false"/>
+          <w:color w:val="2C2C2C"/>
+          <w:sz w:val="220"/>
+          <w:szCs w:val="220"/>
+        </w:rPr>
+        <w:t xml:space="preserve">Warum du dich immer schuldig fühlst, und wie du damit aufhörst.</w:t>
+      </w:r>
+    </w:p>
+    <w:p>
+      <w:pPr>
+        <w:spacing w:after="120" w:before="400"/>
+      </w:pPr>
+      <w:r>
+        <w:rPr>
+          <w:rFonts w:ascii="Georgia" w:cs="Georgia" w:eastAsia="Georgia" w:hAnsi="Georgia"/>
+          <w:b/>
+          <w:bCs/>
+          <w:color w:val="2C2C2C"/>
+          <w:sz w:val="230"/>
+          <w:szCs w:val="230"/>
+        </w:rPr>
+        <w:t xml:space="preserve">Niemand hat dich gefragt, wie es dir geht</w:t>
+      </w:r>
+    </w:p>
+    <w:p>
+      <w:pPr>
+        <w:spacing w:after="120" w:before="0"/>
+        <w:jc w:val="both"/>
+      </w:pPr>
+      <w:r>
+        <w:rPr>
+          <w:rFonts w:ascii="Georgia" w:cs="Georgia" w:eastAsia="Georgia" w:hAnsi="Georgia"/>
+          <w:b w:val="false"/>
+          <w:bCs w:val="false"/>
+          <w:color w:val="2C2C2C"/>
+          <w:sz w:val="220"/>
+          <w:szCs w:val="220"/>
+        </w:rPr>
+        <w:t xml:space="preserve">Für alle, die nie gefragt wurden, was sie eigentlich wollen.</w:t>
+      </w:r>
+    </w:p>
+    <w:p>
+      <w:pPr>
+        <w:spacing w:after="120" w:before="400"/>
+      </w:pPr>
+      <w:r>
+        <w:rPr>
+          <w:rFonts w:ascii="Georgia" w:cs="Georgia" w:eastAsia="Georgia" w:hAnsi="Georgia"/>
+          <w:b/>
+          <w:bCs/>
+          <w:color w:val="2C2C2C"/>
+          <w:sz w:val="230"/>
+          <w:szCs w:val="230"/>
+        </w:rPr>
+        <w:t xml:space="preserve">Ich bin so müde. Und niemand fragt mich warum</w:t>
+      </w:r>
+    </w:p>
+    <w:p>
+      <w:pPr>
+        <w:spacing w:after="120" w:before="0"/>
+        <w:jc w:val="both"/>
+      </w:pPr>
+      <w:r>
+        <w:rPr>
+          <w:rFonts w:ascii="Georgia" w:cs="Georgia" w:eastAsia="Georgia" w:hAnsi="Georgia"/>
+          <w:b w:val="false"/>
+          <w:bCs w:val="false"/>
+          <w:color w:val="2C2C2C"/>
+          <w:sz w:val="220"/>
+          <w:szCs w:val="220"/>
+        </w:rPr>
+        <w:t xml:space="preserve">Über das Funktions-Ich: wenn du für alle stark bist und dich dabei verlierst.</w:t>
+      </w:r>
+    </w:p>
+    <w:p>
+      <w:pPr>
+        <w:spacing w:after="120" w:before="0"/>
+        <w:jc w:val="both"/>
+      </w:pPr>
+      <w:r>
+        <w:rPr>
+          <w:rFonts w:ascii="Georgia" w:cs="Georgia" w:eastAsia="Georgia" w:hAnsi="Georgia"/>
+          <w:b w:val="false"/>
+          <w:bCs w:val="false"/>
+          <w:color w:val="2C2C2C"/>
+          <w:sz w:val="220"/>
+          <w:szCs w:val="220"/>
+        </w:rPr>
+        <w:t xml:space="preserve">Alle Bücher erhältlich als Taschenbuch und eBook. Mehr dazu: info.safetothrive@gmail.com</w:t>
+      </w:r>
+    </w:p>
+    <w:p>
+      <w:pPr>
+        <w:pageBreakBefore/>
+        <w:spacing w:after="280" w:before="720"/>
+        <w:jc w:val="left"/>
+      </w:pPr>
+      <w:r>
+        <w:rPr>
+          <w:rFonts w:ascii="Georgia" w:cs="Georgia" w:eastAsia="Georgia" w:hAnsi="Georgia"/>
+          <w:b w:val="false"/>
+          <w:bCs w:val="false"/>
+          <w:color w:val="C0848A"/>
+          <w:sz w:val="340"/>
+          <w:szCs w:val="340"/>
+        </w:rPr>
         <w:t xml:space="preserve">Literatur und Weiterführendes</w:t>
       </w:r>
     </w:p>

</xml_diff>

<commit_message>
Buch 3: Abschnitt Literatur und Weiterfuehrendes entfernt (nicht rechtlich vorgeschrieben)
</commit_message>
<xml_diff>
--- a/outputs/buch-beziehungen/wenn-beziehungen-erschoepfen-Taschenbuch.docx
+++ b/outputs/buch-beziehungen/wenn-beziehungen-erschoepfen-Taschenbuch.docx
@@ -547,28 +547,6 @@
           <w:szCs w:val="210"/>
         </w:rPr>
         <w:t xml:space="preserve">Wenn du mehr möchtest</w:t>
-      </w:r>
-      <w:r>
-        <w:rPr>
-          <w:rFonts w:ascii="Georgia" w:cs="Georgia" w:eastAsia="Georgia" w:hAnsi="Georgia"/>
-        </w:rPr>
-        <w:t xml:space="preserve"/>
-      </w:r>
-    </w:p>
-    <w:p>
-      <w:pPr>
-        <w:spacing w:after="80" w:before="80"/>
-      </w:pPr>
-      <w:r>
-        <w:rPr>
-          <w:rFonts w:ascii="Georgia" w:cs="Georgia" w:eastAsia="Georgia" w:hAnsi="Georgia"/>
-          <w:b w:val="false"/>
-          <w:bCs w:val="false"/>
-          <w:color w:val="2C2C2C"/>
-          <w:sz w:val="210"/>
-          <w:szCs w:val="210"/>
-        </w:rPr>
-        <w:t xml:space="preserve">Literatur und Weiterführendes</w:t>
       </w:r>
       <w:r>
         <w:rPr>
@@ -20296,473 +20274,6 @@
       </w:r>
     </w:p>
     <w:p>
-      <w:pPr>
-        <w:pageBreakBefore/>
-        <w:spacing w:after="280" w:before="720"/>
-        <w:jc w:val="left"/>
-      </w:pPr>
-      <w:r>
-        <w:rPr>
-          <w:rFonts w:ascii="Georgia" w:cs="Georgia" w:eastAsia="Georgia" w:hAnsi="Georgia"/>
-          <w:b w:val="false"/>
-          <w:bCs w:val="false"/>
-          <w:color w:val="C0848A"/>
-          <w:sz w:val="340"/>
-          <w:szCs w:val="340"/>
-        </w:rPr>
-        <w:t xml:space="preserve">Literatur und Weiterführendes</w:t>
-      </w:r>
-    </w:p>
-    <w:p>
-      <w:pPr>
-        <w:spacing w:after="120" w:before="0"/>
-        <w:jc w:val="both"/>
-      </w:pPr>
-      <w:r>
-        <w:rPr>
-          <w:rFonts w:ascii="Georgia" w:cs="Georgia" w:eastAsia="Georgia" w:hAnsi="Georgia"/>
-          <w:b w:val="false"/>
-          <w:bCs w:val="false"/>
-          <w:color w:val="2C2C2C"/>
-          <w:sz w:val="220"/>
-          <w:szCs w:val="220"/>
-        </w:rPr>
-        <w:t xml:space="preserve">Die psychologischen Konzepte in diesem Buch basieren auf etablierten Forschungen und Theorien. Hier findest du eine Auswahl an Quellen und Buchtipps für alle, die tiefer einsteigen möchten.</w:t>
-      </w:r>
-    </w:p>
-    <w:p>
-      <w:pPr>
-        <w:spacing w:after="120" w:before="400"/>
-      </w:pPr>
-      <w:r>
-        <w:rPr>
-          <w:rFonts w:ascii="Georgia" w:cs="Georgia" w:eastAsia="Georgia" w:hAnsi="Georgia"/>
-          <w:b/>
-          <w:bCs/>
-          <w:color w:val="2C2C2C"/>
-          <w:sz w:val="230"/>
-          <w:szCs w:val="230"/>
-        </w:rPr>
-        <w:t xml:space="preserve">Bindungstheorie:</w:t>
-      </w:r>
-    </w:p>
-    <w:p>
-      <w:pPr>
-        <w:spacing w:after="120" w:before="0"/>
-        <w:jc w:val="both"/>
-      </w:pPr>
-      <w:r>
-        <w:rPr>
-          <w:b w:val="0"/>
-          <w:sz w:val="220"/>
-        </w:rPr>
-        <w:t xml:space="preserve">Bowlby, J. (1969). </w:t>
-      </w:r>
-      <w:r>
-        <w:rPr>
-          <w:b w:val="0"/>
-          <w:i/>
-          <w:sz w:val="220"/>
-        </w:rPr>
-        <w:t>Attachment and Loss: Vol. 1. Attachment.</w:t>
-      </w:r>
-      <w:r>
-        <w:rPr>
-          <w:b w:val="0"/>
-          <w:sz w:val="220"/>
-        </w:rPr>
-        <w:t xml:space="preserve"> Basic Books.</w:t>
-      </w:r>
-    </w:p>
-    <w:p>
-      <w:pPr>
-        <w:spacing w:after="120" w:before="0"/>
-        <w:jc w:val="both"/>
-      </w:pPr>
-      <w:r>
-        <w:rPr>
-          <w:b w:val="0"/>
-          <w:sz w:val="220"/>
-        </w:rPr>
-        <w:t xml:space="preserve">Ainsworth, M. D. S. et al. (1978). </w:t>
-      </w:r>
-      <w:r>
-        <w:rPr>
-          <w:b w:val="0"/>
-          <w:i/>
-          <w:sz w:val="220"/>
-        </w:rPr>
-        <w:t>Patterns of Attachment.</w:t>
-      </w:r>
-      <w:r>
-        <w:rPr>
-          <w:b w:val="0"/>
-          <w:sz w:val="220"/>
-        </w:rPr>
-        <w:t xml:space="preserve"> Erlbaum.</w:t>
-      </w:r>
-    </w:p>
-    <w:p>
-      <w:pPr>
-        <w:spacing w:after="120" w:before="0"/>
-        <w:jc w:val="both"/>
-      </w:pPr>
-      <w:r>
-        <w:rPr>
-          <w:b w:val="0"/>
-          <w:sz w:val="220"/>
-        </w:rPr>
-        <w:t xml:space="preserve">Heller, D. P. (2019). </w:t>
-      </w:r>
-      <w:r>
-        <w:rPr>
-          <w:b w:val="0"/>
-          <w:i/>
-          <w:sz w:val="220"/>
-        </w:rPr>
-        <w:t>Die Kraft der sicheren Bindung.</w:t>
-      </w:r>
-      <w:r>
-        <w:rPr>
-          <w:b w:val="0"/>
-          <w:sz w:val="220"/>
-        </w:rPr>
-        <w:t xml:space="preserve"> Klett-Cotta.</w:t>
-      </w:r>
-    </w:p>
-    <w:p>
-      <w:pPr>
-        <w:spacing w:after="120" w:before="400"/>
-      </w:pPr>
-      <w:r>
-        <w:rPr>
-          <w:rFonts w:ascii="Georgia" w:cs="Georgia" w:eastAsia="Georgia" w:hAnsi="Georgia"/>
-          <w:b/>
-          <w:bCs/>
-          <w:color w:val="2C2C2C"/>
-          <w:sz w:val="230"/>
-          <w:szCs w:val="230"/>
-        </w:rPr>
-        <w:t xml:space="preserve">People-Pleasing und Co-Abhängigkeit:</w:t>
-      </w:r>
-    </w:p>
-    <w:p>
-      <w:pPr>
-        <w:spacing w:after="120" w:before="0"/>
-        <w:jc w:val="both"/>
-      </w:pPr>
-      <w:r>
-        <w:rPr>
-          <w:b w:val="0"/>
-          <w:sz w:val="220"/>
-        </w:rPr>
-        <w:t xml:space="preserve">Beattie, M. (1987). </w:t>
-      </w:r>
-      <w:r>
-        <w:rPr>
-          <w:b w:val="0"/>
-          <w:i/>
-          <w:sz w:val="220"/>
-        </w:rPr>
-        <w:t>Codependent No More.</w:t>
-      </w:r>
-      <w:r>
-        <w:rPr>
-          <w:b w:val="0"/>
-          <w:sz w:val="220"/>
-        </w:rPr>
-        <w:t xml:space="preserve"> Hazelden Publishing.</w:t>
-      </w:r>
-    </w:p>
-    <w:p>
-      <w:pPr>
-        <w:spacing w:after="120" w:before="0"/>
-        <w:jc w:val="both"/>
-      </w:pPr>
-      <w:r>
-        <w:rPr>
-          <w:b w:val="0"/>
-          <w:sz w:val="220"/>
-        </w:rPr>
-        <w:t xml:space="preserve">Brown, B. (2010). </w:t>
-      </w:r>
-      <w:r>
-        <w:rPr>
-          <w:b w:val="0"/>
-          <w:i/>
-          <w:sz w:val="220"/>
-        </w:rPr>
-        <w:t>Die Gaben der Unvollkommenheit.</w:t>
-      </w:r>
-      <w:r>
-        <w:rPr>
-          <w:b w:val="0"/>
-          <w:sz w:val="220"/>
-        </w:rPr>
-        <w:t xml:space="preserve"> Kailash.</w:t>
-      </w:r>
-    </w:p>
-    <w:p>
-      <w:pPr>
-        <w:spacing w:after="120" w:before="400"/>
-      </w:pPr>
-      <w:r>
-        <w:rPr>
-          <w:rFonts w:ascii="Georgia" w:cs="Georgia" w:eastAsia="Georgia" w:hAnsi="Georgia"/>
-          <w:b/>
-          <w:bCs/>
-          <w:color w:val="2C2C2C"/>
-          <w:sz w:val="230"/>
-          <w:szCs w:val="230"/>
-        </w:rPr>
-        <w:t xml:space="preserve">Inneres Kind:</w:t>
-      </w:r>
-    </w:p>
-    <w:p>
-      <w:pPr>
-        <w:spacing w:after="120" w:before="0"/>
-        <w:jc w:val="both"/>
-      </w:pPr>
-      <w:r>
-        <w:rPr>
-          <w:b w:val="0"/>
-          <w:sz w:val="220"/>
-        </w:rPr>
-        <w:t xml:space="preserve">Bradshaw, J. (1990). </w:t>
-      </w:r>
-      <w:r>
-        <w:rPr>
-          <w:b w:val="0"/>
-          <w:i/>
-          <w:sz w:val="220"/>
-        </w:rPr>
-        <w:t>Homecoming: Reclaiming and Championing Your Inner Child.</w:t>
-      </w:r>
-      <w:r>
-        <w:rPr>
-          <w:b w:val="0"/>
-          <w:sz w:val="220"/>
-        </w:rPr>
-        <w:t xml:space="preserve"> Bantam Books.</w:t>
-      </w:r>
-    </w:p>
-    <w:p>
-      <w:pPr>
-        <w:spacing w:after="120" w:before="0"/>
-        <w:jc w:val="both"/>
-      </w:pPr>
-      <w:r>
-        <w:rPr>
-          <w:b w:val="0"/>
-          <w:sz w:val="220"/>
-        </w:rPr>
-        <w:t xml:space="preserve">Young, J. E. (2005). </w:t>
-      </w:r>
-      <w:r>
-        <w:rPr>
-          <w:b w:val="0"/>
-          <w:i/>
-          <w:sz w:val="220"/>
-        </w:rPr>
-        <w:t>Schematherapie in der Praxis.</w:t>
-      </w:r>
-      <w:r>
-        <w:rPr>
-          <w:b w:val="0"/>
-          <w:sz w:val="220"/>
-        </w:rPr>
-        <w:t xml:space="preserve"> Beltz.</w:t>
-      </w:r>
-    </w:p>
-    <w:p>
-      <w:pPr>
-        <w:spacing w:after="120" w:before="400"/>
-      </w:pPr>
-      <w:r>
-        <w:rPr>
-          <w:rFonts w:ascii="Georgia" w:cs="Georgia" w:eastAsia="Georgia" w:hAnsi="Georgia"/>
-          <w:b/>
-          <w:bCs/>
-          <w:color w:val="2C2C2C"/>
-          <w:sz w:val="230"/>
-          <w:szCs w:val="230"/>
-        </w:rPr>
-        <w:t xml:space="preserve">Gewaltfreie Kommunikation:</w:t>
-      </w:r>
-    </w:p>
-    <w:p>
-      <w:pPr>
-        <w:spacing w:after="120" w:before="0"/>
-        <w:jc w:val="both"/>
-      </w:pPr>
-      <w:r>
-        <w:rPr>
-          <w:b w:val="0"/>
-          <w:sz w:val="220"/>
-        </w:rPr>
-        <w:t xml:space="preserve">Rosenberg, M. B. (2016). </w:t>
-      </w:r>
-      <w:r>
-        <w:rPr>
-          <w:b w:val="0"/>
-          <w:i/>
-          <w:sz w:val="220"/>
-        </w:rPr>
-        <w:t>Gewaltfreie Kommunikation.</w:t>
-      </w:r>
-      <w:r>
-        <w:rPr>
-          <w:b w:val="0"/>
-          <w:sz w:val="220"/>
-        </w:rPr>
-        <w:t xml:space="preserve"> Junfermann.</w:t>
-      </w:r>
-    </w:p>
-    <w:p>
-      <w:pPr>
-        <w:spacing w:after="120" w:before="400"/>
-      </w:pPr>
-      <w:r>
-        <w:rPr>
-          <w:rFonts w:ascii="Georgia" w:cs="Georgia" w:eastAsia="Georgia" w:hAnsi="Georgia"/>
-          <w:b/>
-          <w:bCs/>
-          <w:color w:val="2C2C2C"/>
-          <w:sz w:val="230"/>
-          <w:szCs w:val="230"/>
-        </w:rPr>
-        <w:t xml:space="preserve">Narzissmus und schwierige Beziehungen:</w:t>
-      </w:r>
-    </w:p>
-    <w:p>
-      <w:pPr>
-        <w:spacing w:after="120" w:before="0"/>
-        <w:jc w:val="both"/>
-      </w:pPr>
-      <w:r>
-        <w:rPr>
-          <w:b w:val="0"/>
-          <w:sz w:val="220"/>
-        </w:rPr>
-        <w:t xml:space="preserve">Bancroft, L. (2002). </w:t>
-      </w:r>
-      <w:r>
-        <w:rPr>
-          <w:b w:val="0"/>
-          <w:i/>
-          <w:sz w:val="220"/>
-        </w:rPr>
-        <w:t>Why Does He Do That?</w:t>
-      </w:r>
-      <w:r>
-        <w:rPr>
-          <w:b w:val="0"/>
-          <w:sz w:val="220"/>
-        </w:rPr>
-        <w:t xml:space="preserve"> Berkley Books.</w:t>
-      </w:r>
-    </w:p>
-    <w:p>
-      <w:pPr>
-        <w:spacing w:after="120" w:before="0"/>
-        <w:jc w:val="both"/>
-      </w:pPr>
-      <w:r>
-        <w:rPr>
-          <w:b w:val="0"/>
-          <w:sz w:val="220"/>
-        </w:rPr>
-        <w:t xml:space="preserve">Schneider, A. (2019). </w:t>
-      </w:r>
-      <w:r>
-        <w:rPr>
-          <w:b w:val="0"/>
-          <w:i/>
-          <w:sz w:val="220"/>
-        </w:rPr>
-        <w:t>Toxische Beziehungen erkennen und verlassen.</w:t>
-      </w:r>
-      <w:r>
-        <w:rPr>
-          <w:b w:val="0"/>
-          <w:sz w:val="220"/>
-        </w:rPr>
-        <w:t xml:space="preserve"> Goldmann.</w:t>
-      </w:r>
-    </w:p>
-    <w:p>
-      <w:pPr>
-        <w:spacing w:after="120" w:before="400"/>
-      </w:pPr>
-      <w:r>
-        <w:rPr>
-          <w:rFonts w:ascii="Georgia" w:cs="Georgia" w:eastAsia="Georgia" w:hAnsi="Georgia"/>
-          <w:b/>
-          <w:bCs/>
-          <w:color w:val="2C2C2C"/>
-          <w:sz w:val="230"/>
-          <w:szCs w:val="230"/>
-        </w:rPr>
-        <w:t xml:space="preserve">Allgemeine Empfehlungen:</w:t>
-      </w:r>
-    </w:p>
-    <w:p>
-      <w:pPr>
-        <w:spacing w:after="120" w:before="0"/>
-        <w:jc w:val="both"/>
-      </w:pPr>
-      <w:r>
-        <w:rPr>
-          <w:b w:val="0"/>
-          <w:sz w:val="220"/>
-        </w:rPr>
-        <w:t xml:space="preserve">Stahl, S. (2015). </w:t>
-      </w:r>
-      <w:r>
-        <w:rPr>
-          <w:b w:val="0"/>
-          <w:i/>
-          <w:sz w:val="220"/>
-        </w:rPr>
-        <w:t>Das Kind in dir muss Heimat finden.</w:t>
-      </w:r>
-      <w:r>
-        <w:rPr>
-          <w:b w:val="0"/>
-          <w:sz w:val="220"/>
-        </w:rPr>
-        <w:t xml:space="preserve"> Kailash.</w:t>
-      </w:r>
-    </w:p>
-    <w:p>
-      <w:pPr>
-        <w:spacing w:after="120" w:before="0"/>
-        <w:jc w:val="both"/>
-      </w:pPr>
-      <w:r>
-        <w:rPr>
-          <w:b w:val="0"/>
-          <w:sz w:val="220"/>
-        </w:rPr>
-        <w:t xml:space="preserve">van der Kolk, B. (2014). </w:t>
-      </w:r>
-      <w:r>
-        <w:rPr>
-          <w:b w:val="0"/>
-          <w:i/>
-          <w:sz w:val="220"/>
-        </w:rPr>
-        <w:t>Verkörperter Schrecken.</w:t>
-      </w:r>
-      <w:r>
-        <w:rPr>
-          <w:b w:val="0"/>
-          <w:sz w:val="220"/>
-        </w:rPr>
-        <w:t xml:space="preserve"> Probst Verlag.</w:t>
-      </w:r>
-    </w:p>
-    <w:p>
       <w:r>
         <w:rPr>
           <w:rFonts w:ascii="Georgia" w:hAnsi="Georgia"/>

</xml_diff>

<commit_message>
Journal zu 'Wenn Beziehungen erschöpfen' erstellen (Word, PDF, Cover, Klappentext); Journal-Hinweis und Social-Media-Kontakte im Hauptbuch ergänzen
</commit_message>
<xml_diff>
--- a/outputs/buch-beziehungen/wenn-beziehungen-erschoepfen-Taschenbuch.docx
+++ b/outputs/buch-beziehungen/wenn-beziehungen-erschoepfen-Taschenbuch.docx
@@ -20124,6 +20124,33 @@
     </w:p>
     <w:p>
       <w:pPr>
+        <w:spacing w:after="120" w:before="0"/>
+        <w:jc w:val="both"/>
+      </w:pPr>
+      <w:r>
+        <w:rPr>
+          <w:rFonts w:ascii="Georgia" w:cs="Georgia" w:eastAsia="Georgia" w:hAnsi="Georgia"/>
+          <w:b w:val="false"/>
+          <w:bCs w:val="false"/>
+          <w:color w:val="2C2C2C"/>
+          <w:sz w:val="220"/>
+          <w:szCs w:val="220"/>
+        </w:rPr>
+        <w:t>Zu diesem Buch gibt es auch ein Journal: „Wenn Beziehungen erschöpfen – Das Journal“, mit Reflexionsfragen und Schreibraum zu jedem Kapitel. Erhältlich ebenfalls bei Amazon.</w:t>
+      </w:r>
+      <w:r>
+        <w:rPr>
+          <w:rFonts w:ascii="Georgia" w:cs="Georgia" w:eastAsia="Georgia" w:hAnsi="Georgia"/>
+          <w:b/>
+          <w:bCs/>
+          <w:color w:val="2C2C2C"/>
+          <w:sz w:val="220"/>
+          <w:szCs w:val="220"/>
+        </w:rPr>
+      </w:r>
+    </w:p>
+    <w:p>
+      <w:pPr>
         <w:pageBreakBefore/>
         <w:spacing w:after="280" w:before="720"/>
         <w:jc w:val="left"/>
@@ -20464,6 +20491,28 @@
           <w:sz w:val="22"/>
         </w:rPr>
         <w:t>info.safetothrive@gmail.com</w:t>
+      </w:r>
+    </w:p>
+    <w:p>
+      <w:r>
+        <w:rPr>
+          <w:rFonts w:ascii="Georgia" w:hAnsi="Georgia"/>
+          <w:b w:val="0"/>
+          <w:i w:val="0"/>
+          <w:sz w:val="22"/>
+        </w:rPr>
+        <w:t>Facebook-Gruppe: Safe to Thrive — Dein Leben. Deine Regeln, https://www.facebook.com/share/g/17ca96zXDd/</w:t>
+      </w:r>
+    </w:p>
+    <w:p>
+      <w:r>
+        <w:rPr>
+          <w:rFonts w:ascii="Georgia" w:hAnsi="Georgia"/>
+          <w:b w:val="0"/>
+          <w:i w:val="0"/>
+          <w:sz w:val="22"/>
+        </w:rPr>
+        <w:t>Instagram: @petratanner.autorin</w:t>
       </w:r>
     </w:p>
     <w:p/>

</xml_diff>

<commit_message>
Alle vier Buecher: absolute Aussagen abgeschwaecht, wortwoertliche Wiederholung entfernt, eBooks vervollstaendigt (KI-Erkennungswert-Regel)
</commit_message>
<xml_diff>
--- a/outputs/buch-beziehungen/wenn-beziehungen-erschoepfen-Taschenbuch.docx
+++ b/outputs/buch-beziehungen/wenn-beziehungen-erschoepfen-Taschenbuch.docx
@@ -4523,58 +4523,58 @@
           <w:sz w:val="220"/>
           <w:szCs w:val="220"/>
         </w:rPr>
-        <w:t xml:space="preserve">Das ist nicht Einbildung. Das ist Biologie.</w:t>
-      </w:r>
-    </w:p>
-    <w:p>
-      <w:pPr>
-        <w:spacing w:after="120" w:before="0"/>
-        <w:jc w:val="both"/>
-      </w:pPr>
-      <w:r>
-        <w:rPr>
-          <w:rFonts w:ascii="Georgia" w:cs="Georgia" w:eastAsia="Georgia" w:hAnsi="Georgia"/>
-          <w:b w:val="false"/>
-          <w:bCs w:val="false"/>
-          <w:color w:val="2C2C2C"/>
-          <w:sz w:val="220"/>
-          <w:szCs w:val="220"/>
-        </w:rPr>
-        <w:t>Die Wissenschaft ist hier sehr klar: Das Stresssystem des Körpers, mit den Hormonen Cortisol und Adrenalin, ist für kurzfristige Belastungen ausgelegt. Es soll aktiviert werden, dann wieder zur Ruhe kommen. Bei Menschen mit chronischer Überverantwortung bleibt es dauerhaft aktiviert. Das Nervensystem lernt nicht mehr, in den Ruhemodus zu wechseln.</w:t>
-      </w:r>
-    </w:p>
-    <w:p>
-      <w:pPr>
-        <w:spacing w:after="120" w:before="0"/>
-        <w:jc w:val="both"/>
-      </w:pPr>
-      <w:r>
-        <w:rPr>
-          <w:rFonts w:ascii="Georgia" w:cs="Georgia" w:eastAsia="Georgia" w:hAnsi="Georgia"/>
-          <w:b w:val="false"/>
-          <w:bCs w:val="false"/>
-          <w:color w:val="2C2C2C"/>
-          <w:sz w:val="220"/>
-          <w:szCs w:val="220"/>
-        </w:rPr>
-        <w:t xml:space="preserve">Die Folgen sind real und körperlich: Schlafstörungen, Herzrasen, Muskelspannung, Verdauungsprobleme, ein geschwächtes Immunsystem. Nicht weil etwas körperlich kaputt ist. Sondern weil der Körper auf ein emotionales Muster reagiert, das sich nie auflöst.</w:t>
-      </w:r>
-    </w:p>
-    <w:p>
-      <w:pPr>
-        <w:spacing w:after="120" w:before="0"/>
-        <w:jc w:val="both"/>
-      </w:pPr>
-      <w:r>
-        <w:rPr>
-          <w:rFonts w:ascii="Georgia" w:cs="Georgia" w:eastAsia="Georgia" w:hAnsi="Georgia"/>
-          <w:b w:val="false"/>
-          <w:bCs w:val="false"/>
-          <w:color w:val="2C2C2C"/>
-          <w:sz w:val="220"/>
-          <w:szCs w:val="220"/>
-        </w:rPr>
-        <w:t xml:space="preserve">Ein Körper, der chronisch unter emotionalem Stress steht, reagiert. Er hat keine andere Wahl.</w:t>
+        <w:t>Das ist nicht nur Einbildung. Da steckt auch Körperliches dahinter.</w:t>
+      </w:r>
+    </w:p>
+    <w:p>
+      <w:pPr>
+        <w:spacing w:after="120" w:before="0"/>
+        <w:jc w:val="both"/>
+      </w:pPr>
+      <w:r>
+        <w:rPr>
+          <w:rFonts w:ascii="Georgia" w:cs="Georgia" w:eastAsia="Georgia" w:hAnsi="Georgia"/>
+          <w:b w:val="false"/>
+          <w:bCs w:val="false"/>
+          <w:color w:val="2C2C2C"/>
+          <w:sz w:val="220"/>
+          <w:szCs w:val="220"/>
+        </w:rPr>
+        <w:t>Vieles deutet darauf hin: Das Stresssystem des Körpers, mit Hormonen wie Cortisol und Adrenalin, ist eigentlich für kurzfristige Belastungen ausgelegt. Es soll aktiviert werden, dann wieder zur Ruhe kommen. Bei chronischer Überverantwortung kann es sein, dass es kaum noch zur Ruhe kommt.</w:t>
+      </w:r>
+    </w:p>
+    <w:p>
+      <w:pPr>
+        <w:spacing w:after="120" w:before="0"/>
+        <w:jc w:val="both"/>
+      </w:pPr>
+      <w:r>
+        <w:rPr>
+          <w:rFonts w:ascii="Georgia" w:cs="Georgia" w:eastAsia="Georgia" w:hAnsi="Georgia"/>
+          <w:b w:val="false"/>
+          <w:bCs w:val="false"/>
+          <w:color w:val="2C2C2C"/>
+          <w:sz w:val="220"/>
+          <w:szCs w:val="220"/>
+        </w:rPr>
+        <w:t>Mögliche Folgen: Schlafstörungen, Herzrasen, Muskelspannung, Verdauungsprobleme, ein Immunsystem, das anfälliger wird. Nicht weil zwingend etwas körperlich kaputt ist. Sondern weil der Körper auf ein emotionales Muster reagiert, das sich nie auflöst.</w:t>
+      </w:r>
+    </w:p>
+    <w:p>
+      <w:pPr>
+        <w:spacing w:after="120" w:before="0"/>
+        <w:jc w:val="both"/>
+      </w:pPr>
+      <w:r>
+        <w:rPr>
+          <w:rFonts w:ascii="Georgia" w:cs="Georgia" w:eastAsia="Georgia" w:hAnsi="Georgia"/>
+          <w:b w:val="false"/>
+          <w:bCs w:val="false"/>
+          <w:color w:val="2C2C2C"/>
+          <w:sz w:val="220"/>
+          <w:szCs w:val="220"/>
+        </w:rPr>
+        <w:t>Ein Körper, der lange unter emotionalem Stress steht, reagiert oft irgendwann.</w:t>
       </w:r>
     </w:p>
     <w:p>

</xml_diff>

<commit_message>
Bonusseite Buch 3: QR-Code verkleinert, Abstände enger für Signaturzeile
Kosmetischer Feinschliff, Inhalt unverändert.

Co-Authored-By: Claude Sonnet 5 <noreply@anthropic.com>
Claude-Session: https://claude.ai/code/session_011oFtWvyjvkDdc6K2GcSXHx
</commit_message>
<xml_diff>
--- a/outputs/buch-beziehungen/wenn-beziehungen-erschoepfen-Taschenbuch.docx
+++ b/outputs/buch-beziehungen/wenn-beziehungen-erschoepfen-Taschenbuch.docx
@@ -19846,7 +19846,7 @@
     <w:p>
       <w:pPr>
         <w:pageBreakBefore/>
-        <w:spacing w:after="280" w:before="360"/>
+        <w:spacing w:after="280" w:before="180"/>
         <w:jc w:val="left"/>
       </w:pPr>
       <w:r>
@@ -19936,7 +19936,7 @@
       <w:r>
         <w:drawing>
           <wp:inline xmlns:a="http://schemas.openxmlformats.org/drawingml/2006/main" xmlns:pic="http://schemas.openxmlformats.org/drawingml/2006/picture">
-            <wp:extent cx="1152000" cy="1152000"/>
+            <wp:extent cx="936000" cy="936000"/>
             <wp:docPr id="1" name="Picture 1"/>
             <wp:cNvGraphicFramePr>
               <a:graphicFrameLocks noChangeAspect="1"/>

</xml_diff>

<commit_message>
Bonusseite Buch 3: Signaturzeile passt jetzt auf die vorherige Seite, keine Extraseite mehr
QR-Code im Taschenbuch-PDF von 4,2 auf 3,2 cm verkleinert (weiterhin gut
scannbar) und Signatur "Petra Tanner" / "Autorin und Mentorin" zu einer
Zeile zusammengefasst. Dadurch passt die komplette Bonusseite in Buch 3
wieder auf eine Seite, die bisherige Seite mit nur der Signatur entfällt
(154 -> 153 Seiten). Betrifft auch Buch 4 und Buch 6 (kleinerer QR-Code,
keine Layoutprobleme dort, Seitenzahl unverändert).

Co-Authored-By: Claude Sonnet 5 <noreply@anthropic.com>
Claude-Session: https://claude.ai/code/session_011oFtWvyjvkDdc6K2GcSXHx
</commit_message>
<xml_diff>
--- a/outputs/buch-beziehungen/wenn-beziehungen-erschoepfen-Taschenbuch.docx
+++ b/outputs/buch-beziehungen/wenn-beziehungen-erschoepfen-Taschenbuch.docx
@@ -20016,24 +20016,7 @@
           <w:sz w:val="220"/>
           <w:szCs w:val="220"/>
         </w:rPr>
-        <w:t>Petra Tanner</w:t>
-      </w:r>
-    </w:p>
-    <w:p>
-      <w:pPr>
-        <w:spacing w:after="120" w:before="0"/>
-        <w:jc w:val="both"/>
-      </w:pPr>
-      <w:r>
-        <w:rPr>
-          <w:rFonts w:ascii="Georgia" w:cs="Georgia" w:eastAsia="Georgia" w:hAnsi="Georgia"/>
-          <w:b w:val="0"/>
-          <w:bCs w:val="false"/>
-          <w:color w:val="2C2C2C"/>
-          <w:sz w:val="220"/>
-          <w:szCs w:val="220"/>
-        </w:rPr>
-        <w:t>Autorin und Mentorin</w:t>
+        <w:t>Petra Tanner, Autorin und Mentorin</w:t>
       </w:r>
     </w:p>
     <w:p>

</xml_diff>